<commit_message>
Remaniement initial du deck FX1_slides
</commit_message>
<xml_diff>
--- a/documents/Guide_IntelliJ.docx
+++ b/documents/Guide_IntelliJ.docx
@@ -75,14 +75,9 @@
       </w:r>
     </w:p>
     <w:p>
-      <w:pPr>
-        <w:sectPr>
-          <w:pgSz w:w="11906" w:h="16838" w:orient="portrait"/>
-          <w:pgMar w:top="1440" w:right="1440" w:bottom="1440" w:left="1440" w:header="708" w:footer="708" w:gutter="0"/>
-          <w:pgNumType/>
-          <w:docGrid w:linePitch="360"/>
-        </w:sectPr>
-      </w:pPr>
+      <w:r>
+        <w:br w:type="page"/>
+      </w:r>
     </w:p>
     <w:p>
       <w:pPr>
@@ -181,7 +176,7 @@
           <w:sz w:val="22"/>
           <w:szCs w:val="22"/>
         </w:rPr>
-        <w:t xml:space="preserve">Les noms de menus sont donnés en anglais, tels qu'ils apparaissent à l'écran dans l'installation par défaut : </w:t>
+        <w:t xml:space="preserve">Les noms de menus sont donnés en anglais, tels qu'ils apparaissent à l'écran dans l'installation par défaut : </w:t>
       </w:r>
       <w:r>
         <w:rPr>
@@ -209,7 +204,7 @@
           <w:sz w:val="22"/>
           <w:szCs w:val="22"/>
         </w:rPr>
-        <w:t xml:space="preserve">Les raccourcis sont donnés dans les deux systèmes, séparés par une barre oblique : </w:t>
+        <w:t xml:space="preserve">Les raccourcis sont donnés dans les deux systèmes, séparés par une barre oblique : </w:t>
       </w:r>
       <w:r>
         <w:rPr>
@@ -3119,7 +3114,7 @@
           <w:sz w:val="22"/>
           <w:szCs w:val="22"/>
         </w:rPr>
-        <w:t xml:space="preserve"> est gratuite et suffit intégralement pour ce cours : elle gère Java, Maven, JUnit et le débogueur. L'édition </w:t>
+        <w:t xml:space="preserve"> est gratuite et suffit intégralement pour ce cours : elle gère Java, Maven, JUnit et le débogueur. L'édition </w:t>
       </w:r>
       <w:r>
         <w:rPr>
@@ -3226,7 +3221,7 @@
           <w:sz w:val="22"/>
           <w:szCs w:val="22"/>
         </w:rPr>
-        <w:t xml:space="preserve"> : la seconde fonctionne, mais plus lentement.</w:t>
+        <w:t xml:space="preserve"> : la seconde fonctionne, mais plus lentement.</w:t>
       </w:r>
     </w:p>
     <w:p>
@@ -3297,7 +3292,7 @@
           <w:sz w:val="22"/>
           <w:szCs w:val="22"/>
         </w:rPr>
-        <w:t xml:space="preserve">. Il ne compile pas votre code lui-même : il confie ce travail à un JDK, qui est un logiciel distinct. Installer IntelliJ n'installe donc pas Java, et sans JDK rien ne compilera.</w:t>
+        <w:t xml:space="preserve">. Il ne compile pas votre code lui-même : il confie ce travail à un JDK, qui est un logiciel distinct. Installer IntelliJ n'installe donc pas Java, et sans JDK rien ne compilera.</w:t>
       </w:r>
     </w:p>
     <w:p>
@@ -3337,7 +3332,7 @@
           <w:sz w:val="22"/>
           <w:szCs w:val="22"/>
         </w:rPr>
-        <w:t xml:space="preserve">Deux façons d'installer un JDK. Soit vous le téléchargez chez son éditeur et vous l'installez comme n'importe quel logiciel. Soit vous le laissez faire à IntelliJ, ce qui est plus simple et se fait à l'étape suivante, une fois le projet ouvert. Nous prendrons cette seconde voie : voir </w:t>
+        <w:t xml:space="preserve">Deux façons d'installer un JDK. Soit vous le téléchargez chez son éditeur et vous l'installez comme n'importe quel logiciel. Soit vous le laissez faire à IntelliJ, ce qui est plus simple et se fait à l'étape suivante, une fois le projet ouvert. Nous prendrons cette seconde voie : voir </w:t>
       </w:r>
       <w:hyperlink w:history="1" w:anchor="IDE_5">
         <w:r>
@@ -3427,7 +3422,7 @@
                 <w:sz w:val="22"/>
                 <w:szCs w:val="22"/>
               </w:rPr>
-              <w:t xml:space="preserve">, qui est une version à support long terme. N'installez pas une version plus récente : votre code pourrait compiler chez vous et pas à l'examen.</w:t>
+              <w:t xml:space="preserve">, qui est une version à support long terme. N'installez pas une version plus récente : votre code pourrait compiler chez vous et pas à l'examen.</w:t>
             </w:r>
           </w:p>
           <w:p>
@@ -3439,7 +3434,7 @@
                 <w:sz w:val="22"/>
                 <w:szCs w:val="22"/>
               </w:rPr>
-              <w:t xml:space="preserve">La distribution — Amazon Corretto, Eclipse Temurin, Oracle — importe peu : ce sont des empaquetages du même Java. Corretto et Temurin sont gratuits sans condition.</w:t>
+              <w:t xml:space="preserve">La distribution — Amazon Corretto, Eclipse Temurin, Oracle — importe peu : ce sont des empaquetages du même Java. Corretto et Temurin sont gratuits sans condition.</w:t>
             </w:r>
           </w:p>
         </w:tc>
@@ -3596,7 +3591,7 @@
           <w:sz w:val="22"/>
           <w:szCs w:val="22"/>
         </w:rPr>
-        <w:t xml:space="preserve"> lui-même — pas le dossier qui le contient. IntelliJ propose alors « Open as Project » : acceptez.</w:t>
+        <w:t xml:space="preserve"> lui-même — pas le dossier qui le contient. IntelliJ propose alors « Open as Project » : acceptez.</w:t>
       </w:r>
     </w:p>
     <w:p>
@@ -3687,7 +3682,7 @@
           <w:sz w:val="22"/>
           <w:szCs w:val="22"/>
         </w:rPr>
-        <w:t xml:space="preserve"> est le fichier qui décrit le projet à Maven : ses modules, ses bibliothèques, sa version de Java. Le mémento technique le détaille en </w:t>
+        <w:t xml:space="preserve"> est le fichier qui décrit le projet à Maven : ses modules, ses bibliothèques, sa version de Java. Le mémento technique le détaille en </w:t>
       </w:r>
       <w:r>
         <w:rPr>
@@ -3858,7 +3853,7 @@
           <w:sz w:val="22"/>
           <w:szCs w:val="22"/>
         </w:rPr>
-        <w:t xml:space="preserve"> : elle contient les JDK qu'IntelliJ a trouvés sur votre machine, et une entrée </w:t>
+        <w:t xml:space="preserve"> : elle contient les JDK qu'IntelliJ a trouvés sur votre machine, et une entrée </w:t>
       </w:r>
       <w:r>
         <w:rPr>
@@ -4075,7 +4070,7 @@
           <w:sz w:val="22"/>
           <w:szCs w:val="22"/>
         </w:rPr>
-        <w:t xml:space="preserve"> : le JDK qui compilera votre code. Il doit nommer un JDK 21.</w:t>
+        <w:t xml:space="preserve"> : le JDK qui compilera votre code. Il doit nommer un JDK 21.</w:t>
       </w:r>
     </w:p>
     <w:p>
@@ -4101,7 +4096,7 @@
           <w:sz w:val="22"/>
           <w:szCs w:val="22"/>
         </w:rPr>
-        <w:t xml:space="preserve"> : la version du langage que vous êtes autorisé à écrire. Mettez-la sur 21 également.</w:t>
+        <w:t xml:space="preserve"> : la version du langage que vous êtes autorisé à écrire. Mettez-la sur 21 également.</w:t>
       </w:r>
     </w:p>
     <w:p>
@@ -4176,7 +4171,7 @@
           <w:sz w:val="22"/>
           <w:szCs w:val="22"/>
         </w:rPr>
-        <w:t xml:space="preserve">Les modules n'ont pas de JDK propre : ils héritent de celui du projet. Vous n'avez donc rien à régler module par module — et si un module affiche un JDK explicite au lieu de « Project SDK », c'est une anomalie à corriger. Voir </w:t>
+        <w:t xml:space="preserve">Les modules n'ont pas de JDK propre : ils héritent de celui du projet. Vous n'avez donc rien à régler module par module — et si un module affiche un JDK explicite au lieu de « Project SDK », c'est une anomalie à corriger. Voir </w:t>
       </w:r>
       <w:hyperlink w:history="1" w:anchor="ERR_1">
         <w:r>
@@ -4336,7 +4331,7 @@
           <w:sz w:val="22"/>
           <w:szCs w:val="22"/>
         </w:rPr>
-        <w:t xml:space="preserve">, les fenêtres d'outils : Project le plus souvent, mais aussi Maven, Structure, Debug. Elles s'ouvrent et se ferment à volonté.</w:t>
+        <w:t xml:space="preserve">, les fenêtres d'outils : Project le plus souvent, mais aussi Maven, Structure, Debug. Elles s'ouvrent et se ferment à volonté.</w:t>
       </w:r>
     </w:p>
     <w:p>
@@ -4388,7 +4383,7 @@
           <w:sz w:val="22"/>
           <w:szCs w:val="22"/>
         </w:rPr>
-        <w:t xml:space="preserve">, les fenêtres de résultat : Run pour l'exécution, Debug pour le débogage, Terminal. Elles apparaissent quand vous lancez quelque chose.</w:t>
+        <w:t xml:space="preserve">, les fenêtres de résultat : Run pour l'exécution, Debug pour le débogage, Terminal. Elles apparaissent quand vous lancez quelque chose.</w:t>
       </w:r>
     </w:p>
     <w:p>
@@ -4414,7 +4409,7 @@
           <w:sz w:val="22"/>
           <w:szCs w:val="22"/>
         </w:rPr>
-        <w:t xml:space="preserve">, la barre de lancement : la configuration courante, la flèche verte, l'insecte du débogueur.</w:t>
+        <w:t xml:space="preserve">, la barre de lancement : la configuration courante, la flèche verte, l'insecte du débogueur.</w:t>
       </w:r>
     </w:p>
     <w:p>
@@ -4830,7 +4825,7 @@
           <w:sz w:val="22"/>
           <w:szCs w:val="22"/>
         </w:rPr>
-        <w:t xml:space="preserve"> se recrée intégralement à chaque compilation. C'est pourquoi il est ignoré par Git et absent des archives : il ne contient rien qu'on ne puisse refabriquer. Le mémento technique décrit ce qu'il contient en </w:t>
+        <w:t xml:space="preserve"> se recrée intégralement à chaque compilation. C'est pourquoi il est ignoré par Git et absent des archives : il ne contient rien qu'on ne puisse refabriquer. Le mémento technique décrit ce qu'il contient en </w:t>
       </w:r>
       <w:r>
         <w:rPr>
@@ -4922,7 +4917,7 @@
           <w:sz w:val="22"/>
           <w:szCs w:val="22"/>
         </w:rPr>
-        <w:t xml:space="preserve"> noms de packages. Ce n'est pas une erreur : une classe de test vit dans le même package que la classe qu'elle teste, ce qui lui donne accès à ses membres non publics.</w:t>
+        <w:t xml:space="preserve"> noms de packages. Ce n'est pas une erreur : une classe de test vit dans le même package que la classe qu'elle teste, ce qui lui donne accès à ses membres non publics.</w:t>
       </w:r>
     </w:p>
     <w:p>
@@ -5016,7 +5011,7 @@
           <w:sz w:val="22"/>
           <w:szCs w:val="22"/>
         </w:rPr>
-        <w:t xml:space="preserve">Cette fenêtre montre le projet tel que Maven le voit : un projet parent, et sous lui un dossier par module — </w:t>
+        <w:t xml:space="preserve">Cette fenêtre montre le projet tel que Maven le voit : un projet parent, et sous lui un dossier par module — </w:t>
       </w:r>
       <w:r>
         <w:rPr>
@@ -5402,7 +5397,7 @@
           <w:sz w:val="22"/>
           <w:szCs w:val="22"/>
         </w:rPr>
-        <w:t xml:space="preserve">Dépliez Lifecycle : </w:t>
+        <w:t xml:space="preserve">Dépliez Lifecycle : </w:t>
       </w:r>
       <w:r>
         <w:rPr>
@@ -5455,7 +5450,7 @@
           <w:sz w:val="22"/>
           <w:szCs w:val="22"/>
         </w:rPr>
-        <w:t xml:space="preserve">Dépliez Dependencies : </w:t>
+        <w:t xml:space="preserve">Dépliez Dependencies : </w:t>
       </w:r>
       <w:r>
         <w:rPr>
@@ -5490,7 +5485,7 @@
           <w:sz w:val="22"/>
           <w:szCs w:val="22"/>
         </w:rPr>
-        <w:t xml:space="preserve">Elles ne sont téléchargées qu'une fois : Maven les conserve ensuite sur votre machine, ce qui explique pourquoi le premier chargement d'un projet est long et les suivants immédiats. Voir </w:t>
+        <w:t xml:space="preserve">Elles ne sont téléchargées qu'une fois : Maven les conserve ensuite sur votre machine, ce qui explique pourquoi le premier chargement d'un projet est long et les suivants immédiats. Voir </w:t>
       </w:r>
       <w:r>
         <w:rPr>
@@ -6203,7 +6198,7 @@
           <w:sz w:val="22"/>
           <w:szCs w:val="22"/>
         </w:rPr>
-        <w:t xml:space="preserve"> : la première proposition sera de l'importer.</w:t>
+        <w:t xml:space="preserve"> : la première proposition sera de l'importer.</w:t>
       </w:r>
     </w:p>
     <w:p>
@@ -6256,7 +6251,7 @@
           <w:sz w:val="22"/>
           <w:szCs w:val="22"/>
         </w:rPr>
-        <w:t xml:space="preserve"> en deux — une pour JavaFX, une pour AWT. Lisez le nom complet affiché à droite de la proposition avant de valider : importer la mauvaise donne un code qui ne compile pas, avec un message qui n'aide pas.</w:t>
+        <w:t xml:space="preserve"> en deux — une pour JavaFX, une pour AWT. Lisez le nom complet affiché à droite de la proposition avant de valider : importer la mauvaise donne un code qui ne compile pas, avec un message qui n'aide pas.</w:t>
       </w:r>
     </w:p>
     <w:p>
@@ -6408,7 +6403,7 @@
           <w:sz w:val="22"/>
           <w:szCs w:val="22"/>
         </w:rPr>
-        <w:t xml:space="preserve"> : les accesseurs des champs que vous choisissez.</w:t>
+        <w:t xml:space="preserve"> : les accesseurs des champs que vous choisissez.</w:t>
       </w:r>
     </w:p>
     <w:p>
@@ -6434,7 +6429,7 @@
           <w:sz w:val="22"/>
           <w:szCs w:val="22"/>
         </w:rPr>
-        <w:t xml:space="preserve"> : un constructeur initialisant les champs sélectionnés.</w:t>
+        <w:t xml:space="preserve"> : un constructeur initialisant les champs sélectionnés.</w:t>
       </w:r>
     </w:p>
     <w:p>
@@ -6460,7 +6455,7 @@
           <w:sz w:val="22"/>
           <w:szCs w:val="22"/>
         </w:rPr>
-        <w:t xml:space="preserve"> : les méthodes héritées que vous voulez redéfinir.</w:t>
+        <w:t xml:space="preserve"> : les méthodes héritées que vous voulez redéfinir.</w:t>
       </w:r>
     </w:p>
     <w:tbl>
@@ -6528,7 +6523,7 @@
                 <w:sz w:val="22"/>
                 <w:szCs w:val="22"/>
               </w:rPr>
-              <w:t xml:space="preserve">Générer ne dispense pas de réfléchir : un getter et un setter pour chaque champ annule l'encapsulation qu'on vient de mettre en place. Voir la règle CC-OBJ.2 du mémento Clean Code.</w:t>
+              <w:t xml:space="preserve">Générer ne dispense pas de réfléchir : un getter et un setter pour chaque champ annule l'encapsulation qu'on vient de mettre en place. Voir la règle CC-OBJ.2 du mémento Clean Code.</w:t>
             </w:r>
           </w:p>
         </w:tc>
@@ -6549,7 +6544,7 @@
           <w:sz w:val="25"/>
           <w:szCs w:val="25"/>
         </w:rPr>
-        <w:t xml:space="preserve">IDE.13 — Les modèles : psvm, sout, fori</w:t>
+        <w:t xml:space="preserve">IDE.13 — Les modèles : psvm, sout, fori</w:t>
       </w:r>
       <w:bookmarkEnd w:id="1"/>
     </w:p>
@@ -7462,7 +7457,7 @@
                 <w:sz w:val="22"/>
                 <w:szCs w:val="22"/>
               </w:rPr>
-              <w:t xml:space="preserve">La variable jamais utilisée, la méthode qui pourrait être static, la condition inutilement compliquée : IntelliJ effectue gratuitement une partie du travail de relecture que le mémento vous demande de faire à la main.</w:t>
+              <w:t xml:space="preserve">La variable jamais utilisée, la méthode qui pourrait être static, la condition inutilement compliquée : IntelliJ effectue gratuitement une partie du travail de relecture que le mémento vous demande de faire à la main.</w:t>
             </w:r>
           </w:p>
           <w:p>
@@ -7697,7 +7692,7 @@
           <w:sz w:val="22"/>
           <w:szCs w:val="22"/>
         </w:rPr>
-        <w:t xml:space="preserve">, c'est dans cette fenêtre Run que vous tapez : cliquez dedans avant de saisir.</w:t>
+        <w:t xml:space="preserve">, c'est dans cette fenêtre Run que vous tapez : cliquez dedans avant de saisir.</w:t>
       </w:r>
     </w:p>
     <w:p>
@@ -7740,7 +7735,7 @@
           <w:sz w:val="22"/>
           <w:szCs w:val="22"/>
         </w:rPr>
-        <w:t xml:space="preserve">Ouvrez la classe de test indiquée en fin d'énoncé. Une double flèche verte apparaît dans la marge à hauteur du nom de la classe : elle lance tous les tests du fichier. Une flèche simple, en face de chaque méthode, n'en lance qu'un. Le raccourci est </w:t>
+        <w:t xml:space="preserve">Ouvrez la classe de test indiquée en fin d'énoncé. Une double flèche verte apparaît dans la marge à hauteur du nom de la classe : elle lance tous les tests du fichier. Une flèche simple, en face de chaque méthode, n'en lance qu'un. Le raccourci est </w:t>
       </w:r>
       <w:r>
         <w:rPr>
@@ -7880,7 +7875,7 @@
           <w:sz w:val="22"/>
           <w:szCs w:val="22"/>
         </w:rPr>
-        <w:t xml:space="preserve">Les messages sont écrits pour vous : ici, « Le champ 'nom' n'existe pas dans la classe Personne » vous dit exactement quoi faire. Se contenter de voir la croix rouge et retourner au code à l'aveugle vous fera perdre bien plus de temps que de lire trois lignes.</w:t>
+        <w:t xml:space="preserve">Les messages sont écrits pour vous : ici, « Le champ 'nom' n'existe pas dans la classe Personne » vous dit exactement quoi faire. Se contenter de voir la croix rouge et retourner au code à l'aveugle vous fera perdre bien plus de temps que de lire trois lignes.</w:t>
       </w:r>
     </w:p>
     <w:p>
@@ -8011,7 +8006,7 @@
                 <w:sz w:val="22"/>
                 <w:szCs w:val="22"/>
               </w:rPr>
-              <w:t xml:space="preserve">La première est prise dans le module exercices, la seconde dans solutions. Les deux modules contiennent les mêmes classes de test, à l'identique : le corrigé subit exactement les tests que vous subissez, il n'en a pas de plus indulgents.</w:t>
+              <w:t xml:space="preserve">La première est prise dans le module exercices, la seconde dans solutions. Les deux modules contiennent les mêmes classes de test, à l'identique : le corrigé subit exactement les tests que vous subissez, il n'en a pas de plus indulgents.</w:t>
             </w:r>
           </w:p>
           <w:p>
@@ -8089,7 +8084,7 @@
           <w:sz w:val="22"/>
           <w:szCs w:val="22"/>
         </w:rPr>
-        <w:t xml:space="preserve">. Pour le remplir, il faut passer par la configuration de lancement : </w:t>
+        <w:t xml:space="preserve">. Pour le remplir, il faut passer par la configuration de lancement : </w:t>
       </w:r>
       <w:r>
         <w:rPr>
@@ -8362,7 +8357,7 @@
           <w:sz w:val="22"/>
           <w:szCs w:val="22"/>
         </w:rPr>
-        <w:t xml:space="preserve">, à gauche : la pile des appels. Sur la capture, </w:t>
+        <w:t xml:space="preserve">, à gauche : la pile des appels. Sur la capture, </w:t>
       </w:r>
       <w:r>
         <w:rPr>
@@ -8420,7 +8415,7 @@
           <w:sz w:val="22"/>
           <w:szCs w:val="22"/>
         </w:rPr>
-        <w:t xml:space="preserve">, à droite : tout ce qui existe à cet instant. Les objets se déplient et montrent leur contenu — ici, </w:t>
+        <w:t xml:space="preserve">, à droite : tout ce qui existe à cet instant. Les objets se déplient et montrent leur contenu — ici, </w:t>
       </w:r>
       <w:r>
         <w:rPr>
@@ -8931,7 +8926,7 @@
                 <w:sz w:val="22"/>
                 <w:szCs w:val="22"/>
               </w:rPr>
-              <w:t xml:space="preserve">Les objets portent un numéro — Partie@827, ArrayList@835. Ce numéro n'a aucune signification en soi et change à chaque exécution : il sert seulement à distinguer deux objets l'un de l'autre. Deux variables qui affichent le même numéro désignent le même objet, et c'est une observation précieuse.</w:t>
+              <w:t xml:space="preserve">Les objets portent un numéro — Partie@827, ArrayList@835. Ce numéro n'a aucune signification en soi et change à chaque exécution : il sert seulement à distinguer deux objets l'un de l'autre. Deux variables qui affichent le même numéro désignent le même objet, et c'est une observation précieuse.</w:t>
             </w:r>
           </w:p>
           <w:p>
@@ -8943,7 +8938,7 @@
                 <w:sz w:val="22"/>
                 <w:szCs w:val="22"/>
               </w:rPr>
-              <w:t xml:space="preserve">Déplier une chaîne de caractères montre ses entrailles — un tableau d'octets, un champ hash. Ignorez-les : c'est la mécanique interne de String, pas quelque chose que vous ayez à comprendre.</w:t>
+              <w:t xml:space="preserve">Déplier une chaîne de caractères montre ses entrailles — un tableau d'octets, un champ hash. Ignorez-les : c'est la mécanique interne de String, pas quelque chose que vous ayez à comprendre.</w:t>
             </w:r>
           </w:p>
         </w:tc>
@@ -9027,7 +9022,7 @@
           <w:sz w:val="22"/>
           <w:szCs w:val="22"/>
         </w:rPr>
-        <w:t xml:space="preserve">. Tapez le nouveau nom et validez : IntelliJ met à jour toutes les utilisations, dans tout le projet, y compris le nom du fichier si c'est une classe.</w:t>
+        <w:t xml:space="preserve">. Tapez le nouveau nom et validez : IntelliJ met à jour toutes les utilisations, dans tout le projet, y compris le nom du fichier si c'est une classe.</w:t>
       </w:r>
     </w:p>
     <w:p>
@@ -9039,7 +9034,7 @@
           <w:sz w:val="22"/>
           <w:szCs w:val="22"/>
         </w:rPr>
-        <w:t xml:space="preserve">Cela vaut pour tout : classes, méthodes, variables, paramètres, packages. Il n'y a donc aucune raison de conserver un mauvais nom par crainte du travail de correction — voir </w:t>
+        <w:t xml:space="preserve">Cela vaut pour tout : classes, méthodes, variables, paramètres, packages. Il n'y a donc aucune raison de conserver un mauvais nom par crainte du travail de correction — voir </w:t>
       </w:r>
       <w:r>
         <w:rPr>
@@ -9355,7 +9350,7 @@
           <w:sz w:val="22"/>
           <w:szCs w:val="22"/>
         </w:rPr>
-        <w:t xml:space="preserve">C'est l'outil du mémento Clean Code : </w:t>
+        <w:t xml:space="preserve">C'est l'outil du mémento Clean Code : </w:t>
       </w:r>
       <w:r>
         <w:rPr>
@@ -9481,7 +9476,7 @@
           <w:sz w:val="22"/>
           <w:szCs w:val="22"/>
         </w:rPr>
-        <w:t xml:space="preserve"> sur n'importe quel nom saute à sa déclaration. Cela fonctionne sur vos classes comme sur celles du JDK : vous pouvez lire le code source de </w:t>
+        <w:t xml:space="preserve"> sur n'importe quel nom saute à sa déclaration. Cela fonctionne sur vos classes comme sur celles du JDK : vous pouvez lire le code source de </w:t>
       </w:r>
       <w:r>
         <w:rPr>
@@ -9509,7 +9504,7 @@
           <w:sz w:val="22"/>
           <w:szCs w:val="22"/>
         </w:rPr>
-        <w:t xml:space="preserve">Pour revenir d'où vous venez : </w:t>
+        <w:t xml:space="preserve">Pour revenir d'où vous venez : </w:t>
       </w:r>
       <w:r>
         <w:rPr>
@@ -9541,7 +9536,7 @@
           <w:sz w:val="22"/>
           <w:szCs w:val="22"/>
         </w:rPr>
-        <w:t xml:space="preserve">. C'est le bouton « page précédente » de l'éditeur, et il mémorise tout un historique.</w:t>
+        <w:t xml:space="preserve">. C'est le bouton « page précédente » de l'éditeur, et il mémorise tout un historique.</w:t>
       </w:r>
     </w:p>
     <w:p>
@@ -9588,7 +9583,7 @@
           <w:sz w:val="22"/>
           <w:szCs w:val="22"/>
         </w:rPr>
-        <w:t xml:space="preserve">. Une barre de recherche s'ouvre et cherche partout à la fois : classes, fichiers, symboles, et jusqu'aux commandes d'IntelliJ.</w:t>
+        <w:t xml:space="preserve">. Une barre de recherche s'ouvre et cherche partout à la fois : classes, fichiers, symboles, et jusqu'aux commandes d'IntelliJ.</w:t>
       </w:r>
     </w:p>
     <w:p>
@@ -11864,7 +11859,7 @@
           <w:sz w:val="22"/>
           <w:szCs w:val="22"/>
         </w:rPr>
-        <w:t xml:space="preserve">Si vous ne devez en retenir que deux : </w:t>
+        <w:t xml:space="preserve">Si vous ne devez en retenir que deux : </w:t>
       </w:r>
       <w:r>
         <w:rPr>
@@ -11994,7 +11989,7 @@
           <w:sz w:val="22"/>
           <w:szCs w:val="22"/>
         </w:rPr>
-        <w:t xml:space="preserve"> affiche le raccourci correspondant chaque fois que vous faites quelque chose à la souris. C'est le moyen le plus efficace d'apprendre les raccourcis : ils arrivent au moment où ils serviraient.</w:t>
+        <w:t xml:space="preserve"> affiche le raccourci correspondant chaque fois que vous faites quelque chose à la souris. C'est le moyen le plus efficace d'apprendre les raccourcis : ils arrivent au moment où ils serviraient.</w:t>
       </w:r>
     </w:p>
     <w:p>
@@ -12048,7 +12043,7 @@
           <w:sz w:val="22"/>
           <w:szCs w:val="22"/>
         </w:rPr>
-        <w:t xml:space="preserve">. Thème clair ou sombre, taille de la police de l'éditeur : réglez-les à votre confort, et augmentez la police si vous devez projeter votre écran.</w:t>
+        <w:t xml:space="preserve">. Thème clair ou sombre, taille de la police de l'éditeur : réglez-les à votre confort, et augmentez la police si vous devez projeter votre écran.</w:t>
       </w:r>
     </w:p>
     <w:p>
@@ -12066,7 +12061,7 @@
           <w:sz w:val="25"/>
           <w:szCs w:val="25"/>
         </w:rPr>
-        <w:t xml:space="preserve">IDE.28 — JavaFX : rien à configurer, ou presque</w:t>
+        <w:t xml:space="preserve">IDE.28 — JavaFX : rien à configurer, ou presque</w:t>
       </w:r>
       <w:bookmarkEnd w:id="1"/>
     </w:p>
@@ -12123,7 +12118,7 @@
           <w:sz w:val="22"/>
           <w:szCs w:val="22"/>
         </w:rPr>
-        <w:t xml:space="preserve"> au même titre que JUnit :</w:t>
+        <w:t xml:space="preserve"> au même titre que JUnit :</w:t>
       </w:r>
     </w:p>
     <w:p>
@@ -12227,7 +12222,7 @@
           <w:sz w:val="22"/>
           <w:szCs w:val="22"/>
         </w:rPr>
-        <w:t xml:space="preserve">Une seule chose peut être ajoutée, et elle est facultative : Scene Builder, l'éditeur visuel de fichiers </w:t>
+        <w:t xml:space="preserve">Une seule chose peut être ajoutée, et elle est facultative : Scene Builder, l'éditeur visuel de fichiers </w:t>
       </w:r>
       <w:r>
         <w:rPr>
@@ -12309,30 +12304,46 @@
           <w:sz w:val="22"/>
           <w:szCs w:val="22"/>
         </w:rPr>
-        <w:t xml:space="preserve">Depuis Maven</w:t>
-      </w:r>
-      <w:r>
-        <w:rPr>
-          <w:sz w:val="22"/>
-          <w:szCs w:val="22"/>
-        </w:rPr>
-        <w:t xml:space="preserve"> : dans la fenêtre Maven, sous Plugins → javafx, double-cliquez sur </w:t>
-      </w:r>
-      <w:r>
-        <w:rPr>
-          <w:rFonts w:ascii="Consolas" w:cs="Consolas" w:eastAsia="Consolas" w:hAnsi="Consolas"/>
-          <w:color w:val="8B2500"/>
-          <w:sz w:val="22"/>
-          <w:szCs w:val="22"/>
-        </w:rPr>
-        <w:t xml:space="preserve">javafx:run</w:t>
-      </w:r>
-      <w:r>
-        <w:rPr>
-          <w:sz w:val="22"/>
-          <w:szCs w:val="22"/>
-        </w:rPr>
-        <w:t xml:space="preserve">. Le greffon construit lui-même la ligne de commande correcte.</w:t>
+        <w:t xml:space="preserve">Depuis IntelliJ</w:t>
+      </w:r>
+      <w:r>
+        <w:rPr>
+          <w:sz w:val="22"/>
+          <w:szCs w:val="22"/>
+        </w:rPr>
+        <w:t xml:space="preserve">, en lançant une classe de démarrage distincte de la classe d'application : le </w:t>
+      </w:r>
+      <w:r>
+        <w:rPr>
+          <w:rFonts w:ascii="Consolas" w:cs="Consolas" w:eastAsia="Consolas" w:hAnsi="Consolas"/>
+          <w:color w:val="8B2500"/>
+          <w:sz w:val="22"/>
+          <w:szCs w:val="22"/>
+        </w:rPr>
+        <w:t xml:space="preserve">Lanceur</w:t>
+      </w:r>
+      <w:r>
+        <w:rPr>
+          <w:sz w:val="22"/>
+          <w:szCs w:val="22"/>
+        </w:rPr>
+        <w:t xml:space="preserve">. C'est le montage que le projet du cours utilise, et il est expliqué le moment venu dans le fascicule </w:t>
+      </w:r>
+      <w:r>
+        <w:rPr>
+          <w:rFonts w:ascii="Consolas" w:cs="Consolas" w:eastAsia="Consolas" w:hAnsi="Consolas"/>
+          <w:color w:val="8B2500"/>
+          <w:sz w:val="22"/>
+          <w:szCs w:val="22"/>
+        </w:rPr>
+        <w:t xml:space="preserve">FX</w:t>
+      </w:r>
+      <w:r>
+        <w:rPr>
+          <w:sz w:val="22"/>
+          <w:szCs w:val="22"/>
+        </w:rPr>
+        <w:t xml:space="preserve">.</w:t>
       </w:r>
     </w:p>
     <w:p>
@@ -12351,144 +12362,14 @@
           <w:sz w:val="22"/>
           <w:szCs w:val="22"/>
         </w:rPr>
-        <w:t xml:space="preserve">Depuis IntelliJ</w:t>
-      </w:r>
-      <w:r>
-        <w:rPr>
-          <w:sz w:val="22"/>
-          <w:szCs w:val="22"/>
-        </w:rPr>
-        <w:t xml:space="preserve">, en lançant une classe de démarrage distincte de la classe d'application. C'est le montage que le projet du cours utilise, et il est expliqué le moment venu dans le fascicule </w:t>
-      </w:r>
-      <w:r>
-        <w:rPr>
-          <w:rFonts w:ascii="Consolas" w:cs="Consolas" w:eastAsia="Consolas" w:hAnsi="Consolas"/>
-          <w:color w:val="8B2500"/>
-          <w:sz w:val="22"/>
-          <w:szCs w:val="22"/>
-        </w:rPr>
-        <w:t xml:space="preserve">FX</w:t>
-      </w:r>
-      <w:r>
-        <w:rPr>
-          <w:sz w:val="22"/>
-          <w:szCs w:val="22"/>
-        </w:rPr>
-        <w:t xml:space="preserve">.</w:t>
-      </w:r>
-    </w:p>
-    <w:p>
-      <w:pPr>
-        <w:spacing w:after="120"/>
-      </w:pPr>
-      <w:r>
-        <w:rPr>
-          <w:sz w:val="22"/>
-          <w:szCs w:val="22"/>
-        </w:rPr>
-        <w:t xml:space="preserve">Si vous obtenez le message </w:t>
-      </w:r>
-      <w:r>
-        <w:rPr>
-          <w:rFonts w:ascii="Consolas" w:cs="Consolas" w:eastAsia="Consolas" w:hAnsi="Consolas"/>
-          <w:color w:val="8B2500"/>
-          <w:sz w:val="22"/>
-          <w:szCs w:val="22"/>
-        </w:rPr>
-        <w:t xml:space="preserve">JavaFX runtime components are missing</w:t>
-      </w:r>
-      <w:r>
-        <w:rPr>
-          <w:sz w:val="22"/>
-          <w:szCs w:val="22"/>
-        </w:rPr>
-        <w:t xml:space="preserve">, c'est exactement ce problème : voir </w:t>
-      </w:r>
-      <w:hyperlink w:history="1" w:anchor="ERR_7">
-        <w:r>
-          <w:rPr>
-            <w:rFonts w:ascii="Consolas" w:cs="Consolas" w:eastAsia="Consolas" w:hAnsi="Consolas"/>
-            <w:color w:val="0563C1"/>
-            <w:sz w:val="22"/>
-            <w:szCs w:val="22"/>
-          </w:rPr>
-          <w:t xml:space="preserve">ERR.7</w:t>
-        </w:r>
-      </w:hyperlink>
-      <w:r>
-        <w:rPr>
-          <w:sz w:val="22"/>
-          <w:szCs w:val="22"/>
-        </w:rPr>
-        <w:t xml:space="preserve">.</w:t>
-      </w:r>
-    </w:p>
-    <w:p>
-      <w:pPr>
-        <w:pStyle w:val="Heading2"/>
-        <w:keepNext/>
-        <w:spacing w:after="120" w:before="300"/>
-      </w:pPr>
-      <w:bookmarkStart w:name="IDE_29" w:id="1"/>
-      <w:r>
-        <w:rPr>
-          <w:b/>
-          <w:bCs/>
-          <w:color w:val="1F4E79"/>
-          <w:sz w:val="25"/>
-          <w:szCs w:val="25"/>
-        </w:rPr>
-        <w:t xml:space="preserve">IDE.29 — Installer Scene Builder</w:t>
-      </w:r>
-      <w:bookmarkEnd w:id="1"/>
-    </w:p>
-    <w:p>
-      <w:pPr>
-        <w:spacing w:after="120"/>
-      </w:pPr>
-      <w:r>
-        <w:rPr>
-          <w:sz w:val="22"/>
-          <w:szCs w:val="22"/>
-        </w:rPr>
-        <w:t xml:space="preserve">Scene Builder est un éditeur visuel de fichiers </w:t>
-      </w:r>
-      <w:r>
-        <w:rPr>
-          <w:rFonts w:ascii="Consolas" w:cs="Consolas" w:eastAsia="Consolas" w:hAnsi="Consolas"/>
-          <w:color w:val="8B2500"/>
-          <w:sz w:val="22"/>
-          <w:szCs w:val="22"/>
-        </w:rPr>
-        <w:t xml:space="preserve">.fxml</w:t>
-      </w:r>
-      <w:r>
-        <w:rPr>
-          <w:sz w:val="22"/>
-          <w:szCs w:val="22"/>
-        </w:rPr>
-        <w:t xml:space="preserve"> : on y compose la fenêtre en déposant les composants à la souris, et il écrit le XML correspondant. Il est gratuit.</w:t>
-      </w:r>
-    </w:p>
-    <w:p>
-      <w:pPr>
-        <w:spacing w:after="120"/>
-      </w:pPr>
-      <w:r>
-        <w:rPr>
-          <w:b/>
-          <w:bCs/>
-          <w:sz w:val="22"/>
-          <w:szCs w:val="22"/>
-        </w:rPr>
-        <w:t xml:space="preserve">Ce n'est pas un greffon d'IntelliJ, mais un logiciel séparé. </w:t>
-      </w:r>
-      <w:r>
-        <w:rPr>
-          <w:sz w:val="22"/>
-          <w:szCs w:val="22"/>
-        </w:rPr>
-        <w:t xml:space="preserve">IntelliJ ne fait que lui passer la main quand vous ouvrez un fichier FXML. Il faut donc l'installer, puis dire à IntelliJ où il se trouve — deux étapes distinctes, et c'est la seconde qu'on oublie.</w:t>
+        <w:t xml:space="preserve">Depuis Maven</w:t>
+      </w:r>
+      <w:r>
+        <w:rPr>
+          <w:sz w:val="22"/>
+          <w:szCs w:val="22"/>
+        </w:rPr>
+        <w:t xml:space="preserve">, par le greffon JavaFX, qui construit lui-même la ligne de commande correcte. C'est la solution de secours quand le lancement normal échoue : la procédure suit.</w:t>
       </w:r>
     </w:p>
     <w:p>
@@ -12505,67 +12386,7 @@
           <w:sz w:val="22"/>
           <w:szCs w:val="22"/>
         </w:rPr>
-        <w:t xml:space="preserve">1. Télécharger</w:t>
-      </w:r>
-    </w:p>
-    <w:p>
-      <w:pPr>
-        <w:spacing w:after="120"/>
-      </w:pPr>
-      <w:r>
-        <w:rPr>
-          <w:sz w:val="22"/>
-          <w:szCs w:val="22"/>
-        </w:rPr>
-        <w:t xml:space="preserve">Sur </w:t>
-      </w:r>
-      <w:r>
-        <w:rPr>
-          <w:rFonts w:ascii="Consolas" w:cs="Consolas" w:eastAsia="Consolas" w:hAnsi="Consolas"/>
-          <w:color w:val="8B2500"/>
-          <w:sz w:val="22"/>
-          <w:szCs w:val="22"/>
-        </w:rPr>
-        <w:t xml:space="preserve">gluonhq.com/products/scene-builder</w:t>
-      </w:r>
-      <w:r>
-        <w:rPr>
-          <w:sz w:val="22"/>
-          <w:szCs w:val="22"/>
-        </w:rPr>
-        <w:t xml:space="preserve">, en prenant la version correspondant à votre système. Sur un Mac Apple Silicon, vérifiez qu'il s'agit bien de la variante </w:t>
-      </w:r>
-      <w:r>
-        <w:rPr>
-          <w:rFonts w:ascii="Consolas" w:cs="Consolas" w:eastAsia="Consolas" w:hAnsi="Consolas"/>
-          <w:color w:val="8B2500"/>
-          <w:sz w:val="22"/>
-          <w:szCs w:val="22"/>
-        </w:rPr>
-        <w:t xml:space="preserve">aarch64</w:t>
-      </w:r>
-      <w:r>
-        <w:rPr>
-          <w:sz w:val="22"/>
-          <w:szCs w:val="22"/>
-        </w:rPr>
-        <w:t xml:space="preserve"> et non </w:t>
-      </w:r>
-      <w:r>
-        <w:rPr>
-          <w:rFonts w:ascii="Consolas" w:cs="Consolas" w:eastAsia="Consolas" w:hAnsi="Consolas"/>
-          <w:color w:val="8B2500"/>
-          <w:sz w:val="22"/>
-          <w:szCs w:val="22"/>
-        </w:rPr>
-        <w:t xml:space="preserve">x64</w:t>
-      </w:r>
-      <w:r>
-        <w:rPr>
-          <w:sz w:val="22"/>
-          <w:szCs w:val="22"/>
-        </w:rPr>
-        <w:t xml:space="preserve">.</w:t>
+        <w:t xml:space="preserve">Lancer par Maven : javafx:run</w:t>
       </w:r>
     </w:p>
     <w:p>
@@ -12579,1131 +12400,200 @@
           <w:sz w:val="22"/>
           <w:szCs w:val="22"/>
         </w:rPr>
-        <w:t xml:space="preserve">Quelle version. </w:t>
-      </w:r>
-      <w:r>
-        <w:rPr>
-          <w:sz w:val="22"/>
-          <w:szCs w:val="22"/>
-        </w:rPr>
-        <w:t xml:space="preserve">Les numéros de Scene Builder suivent ceux de JavaFX. Le cours utilise JavaFX 21 : prenez Scene Builder 21, ou la version disponible la plus proche. Un Scene Builder plus récent que votre JavaFX peut écrire dans le FXML des attributs que votre version ne comprend pas — le fichier s'ouvre alors correctement dans l'éditeur et échoue au lancement.</w:t>
-      </w:r>
-    </w:p>
-    <w:p>
-      <w:pPr>
-        <w:pStyle w:val="Heading3"/>
-        <w:keepNext/>
-        <w:spacing w:after="80" w:before="200"/>
+        <w:t xml:space="preserve">1. Ouvrez la fenêtre Maven. </w:t>
+      </w:r>
+      <w:r>
+        <w:rPr>
+          <w:sz w:val="22"/>
+          <w:szCs w:val="22"/>
+        </w:rPr>
+        <w:t xml:space="preserve">Cliquez sur l'icône </w:t>
+      </w:r>
+      <w:r>
+        <w:rPr>
+          <w:rFonts w:ascii="Consolas" w:cs="Consolas" w:eastAsia="Consolas" w:hAnsi="Consolas"/>
+          <w:color w:val="8B2500"/>
+          <w:sz w:val="22"/>
+          <w:szCs w:val="22"/>
+        </w:rPr>
+        <w:t xml:space="preserve">m</w:t>
+      </w:r>
+      <w:r>
+        <w:rPr>
+          <w:sz w:val="22"/>
+          <w:szCs w:val="22"/>
+        </w:rPr>
+        <w:t xml:space="preserve"> de la barre verticale de droite, ou passez par </w:t>
+      </w:r>
+      <w:r>
+        <w:rPr>
+          <w:rFonts w:ascii="Consolas" w:cs="Consolas" w:eastAsia="Consolas" w:hAnsi="Consolas"/>
+          <w:color w:val="8B2500"/>
+          <w:sz w:val="22"/>
+          <w:szCs w:val="22"/>
+        </w:rPr>
+        <w:t xml:space="preserve">View → Tool Windows → Maven</w:t>
+      </w:r>
+      <w:r>
+        <w:rPr>
+          <w:sz w:val="22"/>
+          <w:szCs w:val="22"/>
+        </w:rPr>
+        <w:t xml:space="preserve">.</w:t>
+      </w:r>
+    </w:p>
+    <w:p>
+      <w:pPr>
+        <w:spacing w:after="120"/>
       </w:pPr>
       <w:r>
         <w:rPr>
           <w:b/>
           <w:bCs/>
-          <w:color w:val="595959"/>
-          <w:sz w:val="22"/>
-          <w:szCs w:val="22"/>
-        </w:rPr>
-        <w:t xml:space="preserve">2. Installer</w:t>
+          <w:sz w:val="22"/>
+          <w:szCs w:val="22"/>
+        </w:rPr>
+        <w:t xml:space="preserve">2. Dépliez le bon module. </w:t>
+      </w:r>
+      <w:r>
+        <w:rPr>
+          <w:sz w:val="22"/>
+          <w:szCs w:val="22"/>
+        </w:rPr>
+        <w:t xml:space="preserve">La fenêtre montre le projet parent, puis ses modules, chacun nommé « Exercices Java IN2 — … » : </w:t>
+      </w:r>
+      <w:r>
+        <w:rPr>
+          <w:i/>
+          <w:iCs/>
+          <w:sz w:val="22"/>
+          <w:szCs w:val="22"/>
+        </w:rPr>
+        <w:t xml:space="preserve">enonces</w:t>
+      </w:r>
+      <w:r>
+        <w:rPr>
+          <w:sz w:val="22"/>
+          <w:szCs w:val="22"/>
+        </w:rPr>
+        <w:t xml:space="preserve"> (vos exercices), </w:t>
+      </w:r>
+      <w:r>
+        <w:rPr>
+          <w:i/>
+          <w:iCs/>
+          <w:sz w:val="22"/>
+          <w:szCs w:val="22"/>
+        </w:rPr>
+        <w:t xml:space="preserve">solutions</w:t>
+      </w:r>
+      <w:r>
+        <w:rPr>
+          <w:sz w:val="22"/>
+          <w:szCs w:val="22"/>
+        </w:rPr>
+        <w:t xml:space="preserve">, </w:t>
+      </w:r>
+      <w:r>
+        <w:rPr>
+          <w:i/>
+          <w:iCs/>
+          <w:sz w:val="22"/>
+          <w:szCs w:val="22"/>
+        </w:rPr>
+        <w:t xml:space="preserve">demos du cours</w:t>
+      </w:r>
+      <w:r>
+        <w:rPr>
+          <w:sz w:val="22"/>
+          <w:szCs w:val="22"/>
+        </w:rPr>
+        <w:t xml:space="preserve"> et </w:t>
+      </w:r>
+      <w:r>
+        <w:rPr>
+          <w:i/>
+          <w:iCs/>
+          <w:sz w:val="22"/>
+          <w:szCs w:val="22"/>
+        </w:rPr>
+        <w:t xml:space="preserve">bac a sable du cours</w:t>
+      </w:r>
+      <w:r>
+        <w:rPr>
+          <w:sz w:val="22"/>
+          <w:szCs w:val="22"/>
+        </w:rPr>
+        <w:t xml:space="preserve">. Dépliez celui qui contient la classe à lancer, en général </w:t>
+      </w:r>
+      <w:r>
+        <w:rPr>
+          <w:i/>
+          <w:iCs/>
+          <w:sz w:val="22"/>
+          <w:szCs w:val="22"/>
+        </w:rPr>
+        <w:t xml:space="preserve">enonces</w:t>
+      </w:r>
+      <w:r>
+        <w:rPr>
+          <w:sz w:val="22"/>
+          <w:szCs w:val="22"/>
+        </w:rPr>
+        <w:t xml:space="preserve">. Pas le nœud du haut, marqué « (parent) » : depuis lui, Maven lancerait la commande dans chaque module, l'un après l'autre.</w:t>
       </w:r>
     </w:p>
     <w:p>
       <w:pPr>
         <w:spacing w:after="120"/>
-      </w:pPr>
-      <w:r>
-        <w:rPr>
-          <w:sz w:val="22"/>
-          <w:szCs w:val="22"/>
-        </w:rPr>
-        <w:t xml:space="preserve">Installation ordinaire : un .dmg à glisser dans Applications sous macOS, un installateur sous Windows. Aucun réglage à faire pendant l'installation.</w:t>
-      </w:r>
-    </w:p>
-    <w:p>
-      <w:pPr>
-        <w:spacing w:after="120"/>
-      </w:pPr>
-      <w:r>
-        <w:rPr>
-          <w:sz w:val="22"/>
-          <w:szCs w:val="22"/>
-        </w:rPr>
-        <w:t xml:space="preserve">Notez le chemin où il atterrit, vous en aurez besoin à l'étape suivante. Par défaut :</w:t>
-      </w:r>
-    </w:p>
-    <w:p>
-      <w:pPr>
-        <w:keepLines/>
-        <w:shd w:fill="F2F2F2" w:val="clear"/>
-        <w:spacing w:after="0" w:before="100"/>
-        <w:ind w:left="220"/>
-      </w:pPr>
-      <w:r>
-        <w:rPr>
-          <w:rFonts w:ascii="Consolas" w:cs="Consolas" w:eastAsia="Consolas" w:hAnsi="Consolas"/>
-          <w:sz w:val="19"/>
-          <w:szCs w:val="19"/>
-        </w:rPr>
-        <w:t xml:space="preserve">macOS     /Applications/SceneBuilder.app</w:t>
-      </w:r>
-    </w:p>
-    <w:p>
-      <w:pPr>
-        <w:keepLines/>
-        <w:shd w:fill="F2F2F2" w:val="clear"/>
-        <w:spacing w:after="160" w:before="0"/>
-        <w:ind w:left="220"/>
-      </w:pPr>
-      <w:r>
-        <w:rPr>
-          <w:rFonts w:ascii="Consolas" w:cs="Consolas" w:eastAsia="Consolas" w:hAnsi="Consolas"/>
-          <w:sz w:val="19"/>
-          <w:szCs w:val="19"/>
-        </w:rPr>
-        <w:t xml:space="preserve">Windows   C:\Users\&lt;vous&gt;\AppData\Local\SceneBuilder\SceneBuilder.exe</w:t>
-      </w:r>
-    </w:p>
-    <w:p>
-      <w:pPr>
-        <w:pStyle w:val="Heading3"/>
-        <w:keepNext/>
-        <w:spacing w:after="80" w:before="200"/>
       </w:pPr>
       <w:r>
         <w:rPr>
           <w:b/>
           <w:bCs/>
-          <w:color w:val="595959"/>
-          <w:sz w:val="22"/>
-          <w:szCs w:val="22"/>
-        </w:rPr>
-        <w:t xml:space="preserve">3. Le déclarer dans IntelliJ</w:t>
-      </w:r>
-    </w:p>
-    <w:p>
-      <w:pPr>
-        <w:spacing w:after="120"/>
-      </w:pPr>
-      <w:r>
-        <w:rPr>
-          <w:rFonts w:ascii="Consolas" w:cs="Consolas" w:eastAsia="Consolas" w:hAnsi="Consolas"/>
-          <w:color w:val="8B2500"/>
-          <w:sz w:val="22"/>
-          <w:szCs w:val="22"/>
-        </w:rPr>
-        <w:t xml:space="preserve">Settings → Languages &amp; Frameworks → JavaFX</w:t>
-      </w:r>
-      <w:r>
-        <w:rPr>
-          <w:sz w:val="22"/>
-          <w:szCs w:val="22"/>
-        </w:rPr>
-        <w:t xml:space="preserve">, champ </w:t>
-      </w:r>
-      <w:r>
-        <w:rPr>
-          <w:rFonts w:ascii="Consolas" w:cs="Consolas" w:eastAsia="Consolas" w:hAnsi="Consolas"/>
-          <w:color w:val="8B2500"/>
-          <w:sz w:val="22"/>
-          <w:szCs w:val="22"/>
-        </w:rPr>
-        <w:t xml:space="preserve">Path to SceneBuilder</w:t>
-      </w:r>
-      <w:r>
-        <w:rPr>
-          <w:sz w:val="22"/>
-          <w:szCs w:val="22"/>
-        </w:rPr>
-        <w:t xml:space="preserve">. Désignez le fichier repéré ci-dessus.</w:t>
-      </w:r>
-    </w:p>
-    <w:p>
-      <w:pPr>
-        <w:spacing w:after="120"/>
-      </w:pPr>
-      <w:r>
-        <w:rPr>
-          <w:sz w:val="22"/>
-          <w:szCs w:val="22"/>
-        </w:rPr>
-        <w:t xml:space="preserve">C'est la seule ligne à renseigner. Tant qu'elle est vide, IntelliJ ouvre les fichiers FXML comme du XML ordinaire, sans onglet d'édition visuelle — et rien n'indique qu'il manque quelque chose.</w:t>
-      </w:r>
-    </w:p>
-    <w:p>
-      <w:pPr>
-        <w:pStyle w:val="Heading3"/>
-        <w:keepNext/>
-        <w:spacing w:after="80" w:before="200"/>
-      </w:pPr>
-      <w:r>
-        <w:rPr>
-          <w:b/>
-          <w:bCs/>
-          <w:color w:val="595959"/>
-          <w:sz w:val="22"/>
-          <w:szCs w:val="22"/>
-        </w:rPr>
-        <w:t xml:space="preserve">4. Vérifier</w:t>
-      </w:r>
-    </w:p>
-    <w:p>
-      <w:pPr>
-        <w:spacing w:after="120"/>
-      </w:pPr>
-      <w:r>
-        <w:rPr>
-          <w:sz w:val="22"/>
-          <w:szCs w:val="22"/>
-        </w:rPr>
-        <w:t xml:space="preserve">Ouvrez n'importe quel fichier </w:t>
-      </w:r>
-      <w:r>
-        <w:rPr>
-          <w:rFonts w:ascii="Consolas" w:cs="Consolas" w:eastAsia="Consolas" w:hAnsi="Consolas"/>
-          <w:color w:val="8B2500"/>
-          <w:sz w:val="22"/>
-          <w:szCs w:val="22"/>
-        </w:rPr>
-        <w:t xml:space="preserve">.fxml</w:t>
-      </w:r>
-      <w:r>
-        <w:rPr>
-          <w:sz w:val="22"/>
-          <w:szCs w:val="22"/>
-        </w:rPr>
-        <w:t xml:space="preserve"> du projet. Deux onglets doivent apparaître en bas de l'éditeur : </w:t>
-      </w:r>
-      <w:r>
-        <w:rPr>
-          <w:rFonts w:ascii="Consolas" w:cs="Consolas" w:eastAsia="Consolas" w:hAnsi="Consolas"/>
-          <w:color w:val="8B2500"/>
-          <w:sz w:val="22"/>
-          <w:szCs w:val="22"/>
-        </w:rPr>
-        <w:t xml:space="preserve">Text</w:t>
-      </w:r>
-      <w:r>
-        <w:rPr>
-          <w:sz w:val="22"/>
-          <w:szCs w:val="22"/>
-        </w:rPr>
-        <w:t xml:space="preserve"> et </w:t>
-      </w:r>
-      <w:r>
-        <w:rPr>
-          <w:rFonts w:ascii="Consolas" w:cs="Consolas" w:eastAsia="Consolas" w:hAnsi="Consolas"/>
-          <w:color w:val="8B2500"/>
-          <w:sz w:val="22"/>
-          <w:szCs w:val="22"/>
-        </w:rPr>
-        <w:t xml:space="preserve">Scene Builder</w:t>
-      </w:r>
-      <w:r>
-        <w:rPr>
-          <w:sz w:val="22"/>
-          <w:szCs w:val="22"/>
-        </w:rPr>
-        <w:t xml:space="preserve">. Le second affiche la fenêtre telle qu'elle sera, avec la palette de composants sur le côté.</w:t>
-      </w:r>
-    </w:p>
-    <w:p>
-      <w:pPr>
-        <w:spacing w:after="120"/>
-      </w:pPr>
-      <w:r>
-        <w:rPr>
-          <w:sz w:val="22"/>
-          <w:szCs w:val="22"/>
-        </w:rPr>
-        <w:t xml:space="preserve">Si l'onglet n'apparaît pas, le chemin est erroné ou pointe vers le dossier plutôt que vers l'exécutable.</w:t>
-      </w:r>
-    </w:p>
-    <w:p>
-      <w:pPr>
-        <w:pStyle w:val="Heading3"/>
-        <w:keepNext/>
-        <w:spacing w:after="80" w:before="200"/>
-      </w:pPr>
-      <w:r>
-        <w:rPr>
-          <w:b/>
-          <w:bCs/>
-          <w:color w:val="595959"/>
-          <w:sz w:val="22"/>
-          <w:szCs w:val="22"/>
-        </w:rPr>
-        <w:t xml:space="preserve">S'en servir, ou pas</w:t>
-      </w:r>
-    </w:p>
-    <w:p>
-      <w:pPr>
-        <w:spacing w:after="120"/>
-      </w:pPr>
-      <w:r>
-        <w:rPr>
-          <w:sz w:val="22"/>
-          <w:szCs w:val="22"/>
-        </w:rPr>
-        <w:t xml:space="preserve">Scene Builder fait gagner du temps sur les fenêtres complexes, où placer les composants à la main devient fastidieux. Il rend aussi visible ce qu'un gestionnaire de placement fait réellement, ce qui aide à comprendre pourquoi une fenêtre se réorganise quand on la redimensionne.</w:t>
-      </w:r>
-    </w:p>
-    <w:p>
-      <w:pPr>
-        <w:spacing w:after="120"/>
-      </w:pPr>
-      <w:r>
-        <w:rPr>
-          <w:b/>
-          <w:bCs/>
-          <w:sz w:val="22"/>
-          <w:szCs w:val="22"/>
-        </w:rPr>
-        <w:t xml:space="preserve">Mais vous pouvez très bien vous en passer, et je vous conseille de commencer sans. </w:t>
-      </w:r>
-      <w:r>
-        <w:rPr>
-          <w:sz w:val="22"/>
-          <w:szCs w:val="22"/>
-        </w:rPr>
-        <w:t xml:space="preserve">Écrire quelques fichiers FXML à la main apprend leur structure, et cette structure est ce que l'examen évalue — pas votre habileté à la souris.</w:t>
-      </w:r>
-    </w:p>
-    <w:tbl>
-      <w:tblPr>
-        <w:tblW w:type="dxa" w:w="9360"/>
-        <w:tblBorders>
-          <w:top w:val="single" w:color="A6A6A6" w:sz="2"/>
-          <w:left w:val="single" w:color="1F4E79" w:sz="12"/>
-          <w:bottom w:val="single" w:color="A6A6A6" w:sz="2"/>
-          <w:right w:val="single" w:color="A6A6A6" w:sz="2"/>
-          <w:insideH w:val="none"/>
-          <w:insideV w:val="none"/>
-        </w:tblBorders>
-      </w:tblPr>
-      <w:tblGrid>
-        <w:gridCol w:w="9360"/>
-      </w:tblGrid>
-      <w:tr>
-        <w:trPr>
-          <w:cantSplit/>
-        </w:trPr>
-        <w:tc>
-          <w:tcPr>
-            <w:tcW w:type="dxa" w:w="9360"/>
-            <w:shd w:fill="F7F9FC" w:val="clear"/>
-            <w:tcMar>
-              <w:top w:type="dxa" w:w="120"/>
-              <w:left w:type="dxa" w:w="160"/>
-              <w:bottom w:type="dxa" w:w="120"/>
-              <w:right w:type="dxa" w:w="160"/>
-            </w:tcMar>
-          </w:tcPr>
-          <w:p>
-            <w:pPr>
-              <w:spacing w:after="80"/>
-            </w:pPr>
-            <w:r>
-              <w:rPr>
-                <w:b/>
-                <w:bCs/>
-                <w:sz w:val="22"/>
-                <w:szCs w:val="22"/>
-              </w:rPr>
-              <w:t xml:space="preserve">Deux attributs à ne jamais perdre de vue</w:t>
-            </w:r>
-          </w:p>
-          <w:p>
-            <w:pPr>
-              <w:spacing w:after="80"/>
-            </w:pPr>
-            <w:r>
-              <w:rPr>
-                <w:sz w:val="22"/>
-                <w:szCs w:val="22"/>
-              </w:rPr>
-              <w:t xml:space="preserve">Un fichier FXML contient un attribut fx:controller sur son élément racine, qui désigne la classe contrôleur, et des attributs fx:id sur les composants que le contrôleur manipule. Ce sont eux qui relient la vue au code.</w:t>
-            </w:r>
-          </w:p>
-          <w:p>
-            <w:pPr>
-              <w:spacing w:after="0"/>
-            </w:pPr>
-            <w:r>
-              <w:rPr>
-                <w:sz w:val="22"/>
-                <w:szCs w:val="22"/>
-              </w:rPr>
-              <w:t xml:space="preserve">Scene Builder les gère, mais ils se règlent dans un panneau discret. Si votre application se lance avec une fenêtre vide, ou lève une exception au démarrage en évoquant un champ null, vérifiez d'abord ces deux attributs dans l'onglet Text.</w:t>
-            </w:r>
-          </w:p>
-        </w:tc>
-      </w:tr>
-    </w:tbl>
-    <w:p>
-      <w:r>
-        <w:br w:type="page"/>
-      </w:r>
-    </w:p>
-    <w:p>
-      <w:pPr>
-        <w:pStyle w:val="Heading1"/>
-        <w:keepNext/>
-        <w:spacing w:after="160" w:before="360"/>
-      </w:pPr>
-      <w:r>
-        <w:rPr>
-          <w:b/>
-          <w:bCs/>
-          <w:color w:val="1F4E79"/>
-          <w:sz w:val="32"/>
-          <w:szCs w:val="32"/>
-        </w:rPr>
-        <w:t xml:space="preserve">Annexe — Erreurs et solutions</w:t>
-      </w:r>
-    </w:p>
-    <w:p>
-      <w:pPr>
-        <w:spacing w:after="120"/>
-      </w:pPr>
-      <w:r>
-        <w:rPr>
-          <w:i/>
-          <w:iCs/>
-          <w:color w:val="595959"/>
-          <w:sz w:val="22"/>
-          <w:szCs w:val="22"/>
-        </w:rPr>
-        <w:t xml:space="preserve">Les messages les plus fréquents, leur cause, et ce qu'il faut faire. Cherchez le message que vous avez à l'écran plutôt que de lire l'annexe en entier.</w:t>
-      </w:r>
-    </w:p>
-    <w:p>
-      <w:pPr>
-        <w:pStyle w:val="Heading2"/>
-        <w:keepNext/>
-        <w:spacing w:after="120" w:before="300"/>
-      </w:pPr>
-      <w:bookmarkStart w:name="ERR_1" w:id="1"/>
-      <w:r>
-        <w:rPr>
-          <w:b/>
-          <w:bCs/>
-          <w:color w:val="1F4E79"/>
-          <w:sz w:val="25"/>
-          <w:szCs w:val="25"/>
-        </w:rPr>
-        <w:t xml:space="preserve">ERR.1 — JDK isn't specified for module</w:t>
-      </w:r>
-      <w:bookmarkEnd w:id="1"/>
-    </w:p>
-    <w:p>
-      <w:pPr>
-        <w:keepLines/>
-        <w:shd w:fill="F2F2F2" w:val="clear"/>
-        <w:spacing w:after="160" w:before="100"/>
-        <w:ind w:left="220"/>
-      </w:pPr>
-      <w:r>
-        <w:rPr>
-          <w:rFonts w:ascii="Consolas" w:cs="Consolas" w:eastAsia="Consolas" w:hAnsi="Consolas"/>
-          <w:sz w:val="19"/>
-          <w:szCs w:val="19"/>
-        </w:rPr>
-        <w:t xml:space="preserve">java: JDK isn't specified for module 'solutions'</w:t>
-      </w:r>
-    </w:p>
-    <w:p>
-      <w:pPr>
-        <w:spacing w:after="120"/>
-      </w:pPr>
-      <w:r>
-        <w:rPr>
-          <w:sz w:val="22"/>
-          <w:szCs w:val="22"/>
-        </w:rPr>
-        <w:t xml:space="preserve">Un module Maven ne définit pas son propre JDK : il hérite de celui du projet. Ce message signifie donc presque toujours qu'aucun JDK n'est déclaré au niveau du projet, et il nomme simplement le premier module qu'IntelliJ a essayé de compiler.</w:t>
-      </w:r>
-    </w:p>
-    <w:p>
-      <w:pPr>
-        <w:spacing w:after="120"/>
-      </w:pPr>
-      <w:r>
-        <w:rPr>
-          <w:rFonts w:ascii="Consolas" w:cs="Consolas" w:eastAsia="Consolas" w:hAnsi="Consolas"/>
-          <w:color w:val="8B2500"/>
-          <w:sz w:val="22"/>
-          <w:szCs w:val="22"/>
-        </w:rPr>
-        <w:t xml:space="preserve">File → Project Structure → Project</w:t>
-      </w:r>
-      <w:r>
-        <w:rPr>
-          <w:sz w:val="22"/>
-          <w:szCs w:val="22"/>
-        </w:rPr>
-        <w:t xml:space="preserve">, champ SDK : choisissez un JDK 21. S'il n'y en a aucun dans la liste, voir </w:t>
-      </w:r>
-      <w:hyperlink w:history="1" w:anchor="IDE_5">
-        <w:r>
-          <w:rPr>
-            <w:rFonts w:ascii="Consolas" w:cs="Consolas" w:eastAsia="Consolas" w:hAnsi="Consolas"/>
-            <w:color w:val="0563C1"/>
-            <w:sz w:val="22"/>
-            <w:szCs w:val="22"/>
-          </w:rPr>
-          <w:t xml:space="preserve">IDE.5</w:t>
-        </w:r>
-      </w:hyperlink>
-      <w:r>
-        <w:rPr>
-          <w:sz w:val="22"/>
-          <w:szCs w:val="22"/>
-        </w:rPr>
-        <w:t xml:space="preserve">.</w:t>
-      </w:r>
-    </w:p>
-    <w:p>
-      <w:pPr>
-        <w:spacing w:after="120"/>
-      </w:pPr>
-      <w:r>
-        <w:rPr>
-          <w:sz w:val="22"/>
-          <w:szCs w:val="22"/>
-        </w:rPr>
-        <w:t xml:space="preserve">Si le SDK du projet est correct et que le message persiste, vérifiez le module lui-même : </w:t>
-      </w:r>
-      <w:r>
-        <w:rPr>
-          <w:rFonts w:ascii="Consolas" w:cs="Consolas" w:eastAsia="Consolas" w:hAnsi="Consolas"/>
-          <w:color w:val="8B2500"/>
-          <w:sz w:val="22"/>
-          <w:szCs w:val="22"/>
-        </w:rPr>
-        <w:t xml:space="preserve">Project Structure → Modules</w:t>
-      </w:r>
-      <w:r>
-        <w:rPr>
-          <w:sz w:val="22"/>
-          <w:szCs w:val="22"/>
-        </w:rPr>
-        <w:t xml:space="preserve">, onglet </w:t>
-      </w:r>
-      <w:r>
-        <w:rPr>
-          <w:rFonts w:ascii="Consolas" w:cs="Consolas" w:eastAsia="Consolas" w:hAnsi="Consolas"/>
-          <w:color w:val="8B2500"/>
-          <w:sz w:val="22"/>
-          <w:szCs w:val="22"/>
-        </w:rPr>
-        <w:t xml:space="preserve">Dependencies</w:t>
-      </w:r>
-      <w:r>
-        <w:rPr>
-          <w:sz w:val="22"/>
-          <w:szCs w:val="22"/>
-        </w:rPr>
-        <w:t xml:space="preserve">, champ </w:t>
-      </w:r>
-      <w:r>
-        <w:rPr>
-          <w:rFonts w:ascii="Consolas" w:cs="Consolas" w:eastAsia="Consolas" w:hAnsi="Consolas"/>
-          <w:color w:val="8B2500"/>
-          <w:sz w:val="22"/>
-          <w:szCs w:val="22"/>
-        </w:rPr>
-        <w:t xml:space="preserve">Module SDK</w:t>
-      </w:r>
-      <w:r>
-        <w:rPr>
-          <w:sz w:val="22"/>
-          <w:szCs w:val="22"/>
-        </w:rPr>
-        <w:t xml:space="preserve">. Il doit indiquer « Project SDK » et non un JDK nommé.</w:t>
-      </w:r>
-    </w:p>
-    <w:p>
-      <w:pPr>
-        <w:spacing w:after="120"/>
-      </w:pPr>
-      <w:r>
-        <w:rPr>
-          <w:sz w:val="22"/>
-          <w:szCs w:val="22"/>
-        </w:rPr>
-        <w:t xml:space="preserve">En dernier recours, fermez le projet, supprimez le dossier </w:t>
-      </w:r>
-      <w:r>
-        <w:rPr>
-          <w:rFonts w:ascii="Consolas" w:cs="Consolas" w:eastAsia="Consolas" w:hAnsi="Consolas"/>
-          <w:color w:val="8B2500"/>
-          <w:sz w:val="22"/>
-          <w:szCs w:val="22"/>
-        </w:rPr>
-        <w:t xml:space="preserve">.idea</w:t>
-      </w:r>
-      <w:r>
-        <w:rPr>
-          <w:sz w:val="22"/>
-          <w:szCs w:val="22"/>
-        </w:rPr>
-        <w:t xml:space="preserve"> et les fichiers </w:t>
-      </w:r>
-      <w:r>
-        <w:rPr>
-          <w:rFonts w:ascii="Consolas" w:cs="Consolas" w:eastAsia="Consolas" w:hAnsi="Consolas"/>
-          <w:color w:val="8B2500"/>
-          <w:sz w:val="22"/>
-          <w:szCs w:val="22"/>
-        </w:rPr>
-        <w:t xml:space="preserve">.iml</w:t>
-      </w:r>
-      <w:r>
-        <w:rPr>
-          <w:sz w:val="22"/>
-          <w:szCs w:val="22"/>
-        </w:rPr>
-        <w:t xml:space="preserve">, puis rouvrez par le </w:t>
-      </w:r>
-      <w:r>
-        <w:rPr>
-          <w:rFonts w:ascii="Consolas" w:cs="Consolas" w:eastAsia="Consolas" w:hAnsi="Consolas"/>
-          <w:color w:val="8B2500"/>
-          <w:sz w:val="22"/>
-          <w:szCs w:val="22"/>
-        </w:rPr>
-        <w:t xml:space="preserve">pom.xml</w:t>
-      </w:r>
-      <w:r>
-        <w:rPr>
-          <w:sz w:val="22"/>
-          <w:szCs w:val="22"/>
-        </w:rPr>
-        <w:t xml:space="preserve">. Vous ne perdez rien : ce dossier ne contient que des préférences d'affichage.</w:t>
-      </w:r>
-    </w:p>
-    <w:p>
-      <w:pPr>
-        <w:pStyle w:val="Heading2"/>
-        <w:keepNext/>
-        <w:spacing w:after="120" w:before="300"/>
-      </w:pPr>
-      <w:bookmarkStart w:name="ERR_2" w:id="1"/>
-      <w:r>
-        <w:rPr>
-          <w:b/>
-          <w:bCs/>
-          <w:color w:val="1F4E79"/>
-          <w:sz w:val="25"/>
-          <w:szCs w:val="25"/>
-        </w:rPr>
-        <w:t xml:space="preserve">ERR.2 — Cannot resolve symbol</w:t>
-      </w:r>
-      <w:bookmarkEnd w:id="1"/>
-    </w:p>
-    <w:p>
-      <w:pPr>
-        <w:keepLines/>
-        <w:shd w:fill="F2F2F2" w:val="clear"/>
-        <w:spacing w:after="0" w:before="100"/>
-        <w:ind w:left="220"/>
-      </w:pPr>
-      <w:r>
-        <w:rPr>
-          <w:rFonts w:ascii="Consolas" w:cs="Consolas" w:eastAsia="Consolas" w:hAnsi="Consolas"/>
-          <w:sz w:val="19"/>
-          <w:szCs w:val="19"/>
-        </w:rPr>
-        <w:t xml:space="preserve">java: cannot find symbol</w:t>
-      </w:r>
-    </w:p>
-    <w:p>
-      <w:pPr>
-        <w:keepLines/>
-        <w:shd w:fill="F2F2F2" w:val="clear"/>
-        <w:spacing w:after="0" w:before="0"/>
-        <w:ind w:left="220"/>
-      </w:pPr>
-      <w:r>
-        <w:rPr>
-          <w:rFonts w:ascii="Consolas" w:cs="Consolas" w:eastAsia="Consolas" w:hAnsi="Consolas"/>
-          <w:sz w:val="19"/>
-          <w:szCs w:val="19"/>
-        </w:rPr>
-        <w:t xml:space="preserve">  symbol:   class Test</w:t>
-      </w:r>
-    </w:p>
-    <w:p>
-      <w:pPr>
-        <w:keepLines/>
-        <w:shd w:fill="F2F2F2" w:val="clear"/>
-        <w:spacing w:after="160" w:before="0"/>
-        <w:ind w:left="220"/>
-      </w:pPr>
-      <w:r>
-        <w:rPr>
-          <w:rFonts w:ascii="Consolas" w:cs="Consolas" w:eastAsia="Consolas" w:hAnsi="Consolas"/>
-          <w:sz w:val="19"/>
-          <w:szCs w:val="19"/>
-        </w:rPr>
-        <w:t xml:space="preserve">  location: package org.junit.jupiter.api</w:t>
-      </w:r>
-    </w:p>
-    <w:p>
-      <w:pPr>
-        <w:spacing w:after="120"/>
-      </w:pPr>
-      <w:r>
-        <w:rPr>
-          <w:sz w:val="22"/>
-          <w:szCs w:val="22"/>
-        </w:rPr>
-        <w:t xml:space="preserve">Une classe venant d'une bibliothèque est introuvable. Le plus souvent, IntelliJ n'a pas encore chargé ce que déclare le pom.xml — après un premier chargement interrompu, ou après avoir déplié une nouvelle archive dans le projet.</w:t>
-      </w:r>
-    </w:p>
-    <w:p>
-      <w:pPr>
-        <w:spacing w:after="120"/>
-      </w:pPr>
-      <w:r>
-        <w:rPr>
-          <w:sz w:val="22"/>
-          <w:szCs w:val="22"/>
-        </w:rPr>
-        <w:t xml:space="preserve">Ouvrez la fenêtre Maven et cliquez sur le bouton de rechargement. Voir </w:t>
-      </w:r>
-      <w:hyperlink w:history="1" w:anchor="IDE_9">
-        <w:r>
-          <w:rPr>
-            <w:rFonts w:ascii="Consolas" w:cs="Consolas" w:eastAsia="Consolas" w:hAnsi="Consolas"/>
-            <w:color w:val="0563C1"/>
-            <w:sz w:val="22"/>
-            <w:szCs w:val="22"/>
-          </w:rPr>
-          <w:t xml:space="preserve">IDE.9</w:t>
-        </w:r>
-      </w:hyperlink>
-      <w:r>
-        <w:rPr>
-          <w:sz w:val="22"/>
-          <w:szCs w:val="22"/>
-        </w:rPr>
-        <w:t xml:space="preserve">. Si le téléchargement échoue, vérifiez votre connexion : Maven va chercher les bibliothèques sur Internet à la première utilisation.</w:t>
-      </w:r>
-    </w:p>
-    <w:p>
-      <w:pPr>
-        <w:pStyle w:val="Heading2"/>
-        <w:keepNext/>
-        <w:spacing w:after="120" w:before="300"/>
-      </w:pPr>
-      <w:bookmarkStart w:name="ERR_3" w:id="1"/>
-      <w:r>
-        <w:rPr>
-          <w:b/>
-          <w:bCs/>
-          <w:color w:val="1F4E79"/>
-          <w:sz w:val="25"/>
-          <w:szCs w:val="25"/>
-        </w:rPr>
-        <w:t xml:space="preserve">ERR.3 — Tout est rouge sans raison</w:t>
-      </w:r>
-      <w:bookmarkEnd w:id="1"/>
-    </w:p>
-    <w:p>
-      <w:pPr>
-        <w:spacing w:after="120"/>
-      </w:pPr>
-      <w:r>
-        <w:rPr>
-          <w:sz w:val="22"/>
-          <w:szCs w:val="22"/>
-        </w:rPr>
-        <w:t xml:space="preserve">Des dizaines de classes soulignées en rouge alors que le code n'a pas changé, souvent après une mise à jour d'IntelliJ ou l'ajout de fichiers dans le projet. Les index de résolution sont désynchronisés.</w:t>
-      </w:r>
-    </w:p>
-    <w:p>
-      <w:pPr>
-        <w:spacing w:after="120"/>
-      </w:pPr>
-      <w:r>
-        <w:rPr>
-          <w:rFonts w:ascii="Consolas" w:cs="Consolas" w:eastAsia="Consolas" w:hAnsi="Consolas"/>
-          <w:color w:val="8B2500"/>
-          <w:sz w:val="22"/>
-          <w:szCs w:val="22"/>
-        </w:rPr>
-        <w:t xml:space="preserve">File → Invalidate Caches… → Invalidate and Restart</w:t>
-      </w:r>
-      <w:r>
-        <w:rPr>
-          <w:sz w:val="22"/>
-          <w:szCs w:val="22"/>
-        </w:rPr>
-        <w:t xml:space="preserve">. IntelliJ reconstruit ses index au redémarrage, ce qui prend une minute. Rien n'est perdu : ni votre code, ni vos réglages.</w:t>
-      </w:r>
-    </w:p>
-    <w:p>
-      <w:pPr>
-        <w:pStyle w:val="Heading2"/>
-        <w:keepNext/>
-        <w:spacing w:after="120" w:before="300"/>
-      </w:pPr>
-      <w:bookmarkStart w:name="ERR_4" w:id="1"/>
-      <w:r>
-        <w:rPr>
-          <w:b/>
-          <w:bCs/>
-          <w:color w:val="1F4E79"/>
-          <w:sz w:val="25"/>
-          <w:szCs w:val="25"/>
-        </w:rPr>
-        <w:t xml:space="preserve">ERR.4 — Pas de flèche verte sur une classe de test</w:t>
-      </w:r>
-      <w:bookmarkEnd w:id="1"/>
-    </w:p>
-    <w:p>
-      <w:pPr>
-        <w:spacing w:after="120"/>
-      </w:pPr>
-      <w:r>
-        <w:rPr>
-          <w:sz w:val="22"/>
-          <w:szCs w:val="22"/>
-        </w:rPr>
-        <w:t xml:space="preserve">Trois causes possibles, dans l'ordre de fréquence.</w:t>
-      </w:r>
-    </w:p>
-    <w:p>
-      <w:pPr>
-        <w:pStyle w:val="ListParagraph"/>
-        <w:numPr>
-          <w:ilvl w:val="0"/>
-          <w:numId w:val="2"/>
-        </w:numPr>
-        <w:spacing w:after="60"/>
-      </w:pPr>
-      <w:r>
-        <w:rPr>
-          <w:sz w:val="22"/>
-          <w:szCs w:val="22"/>
-        </w:rPr>
-        <w:t xml:space="preserve">Le fichier n'est pas sous </w:t>
-      </w:r>
-      <w:r>
-        <w:rPr>
-          <w:rFonts w:ascii="Consolas" w:cs="Consolas" w:eastAsia="Consolas" w:hAnsi="Consolas"/>
-          <w:color w:val="8B2500"/>
-          <w:sz w:val="22"/>
-          <w:szCs w:val="22"/>
-        </w:rPr>
-        <w:t xml:space="preserve">src/test/java</w:t>
-      </w:r>
-      <w:r>
-        <w:rPr>
-          <w:sz w:val="22"/>
-          <w:szCs w:val="22"/>
-        </w:rPr>
-        <w:t xml:space="preserve"> mais sous </w:t>
-      </w:r>
-      <w:r>
-        <w:rPr>
-          <w:rFonts w:ascii="Consolas" w:cs="Consolas" w:eastAsia="Consolas" w:hAnsi="Consolas"/>
-          <w:color w:val="8B2500"/>
-          <w:sz w:val="22"/>
-          <w:szCs w:val="22"/>
-        </w:rPr>
-        <w:t xml:space="preserve">src/main/java</w:t>
-      </w:r>
-      <w:r>
-        <w:rPr>
-          <w:sz w:val="22"/>
-          <w:szCs w:val="22"/>
-        </w:rPr>
-        <w:t xml:space="preserve">. Déplacez-le avec </w:t>
-      </w:r>
-      <w:r>
-        <w:rPr>
-          <w:rFonts w:ascii="Consolas" w:cs="Consolas" w:eastAsia="Consolas" w:hAnsi="Consolas"/>
-          <w:color w:val="8B2500"/>
-          <w:sz w:val="22"/>
-          <w:szCs w:val="22"/>
-        </w:rPr>
-        <w:t xml:space="preserve">F6</w:t>
-      </w:r>
-      <w:r>
-        <w:rPr>
-          <w:sz w:val="22"/>
-          <w:szCs w:val="22"/>
-        </w:rPr>
-        <w:t xml:space="preserve">.</w:t>
-      </w:r>
-    </w:p>
-    <w:p>
-      <w:pPr>
-        <w:pStyle w:val="ListParagraph"/>
-        <w:numPr>
-          <w:ilvl w:val="0"/>
-          <w:numId w:val="2"/>
-        </w:numPr>
-        <w:spacing w:after="60"/>
-      </w:pPr>
-      <w:r>
-        <w:rPr>
-          <w:sz w:val="22"/>
-          <w:szCs w:val="22"/>
-        </w:rPr>
-        <w:t xml:space="preserve">La déclaration de </w:t>
-      </w:r>
-      <w:r>
-        <w:rPr>
-          <w:rFonts w:ascii="Consolas" w:cs="Consolas" w:eastAsia="Consolas" w:hAnsi="Consolas"/>
-          <w:color w:val="8B2500"/>
-          <w:sz w:val="22"/>
-          <w:szCs w:val="22"/>
-        </w:rPr>
-        <w:t xml:space="preserve">package</w:t>
-      </w:r>
-      <w:r>
-        <w:rPr>
-          <w:sz w:val="22"/>
-          <w:szCs w:val="22"/>
-        </w:rPr>
-        <w:t xml:space="preserve"> ne correspond pas à l'emplacement du fichier dans l'arborescence. Les deux doivent coïncider exactement.</w:t>
-      </w:r>
-    </w:p>
-    <w:p>
-      <w:pPr>
-        <w:pStyle w:val="ListParagraph"/>
-        <w:numPr>
-          <w:ilvl w:val="0"/>
-          <w:numId w:val="2"/>
-        </w:numPr>
-        <w:spacing w:after="60"/>
-      </w:pPr>
-      <w:r>
-        <w:rPr>
-          <w:sz w:val="22"/>
-          <w:szCs w:val="22"/>
-        </w:rPr>
-        <w:t xml:space="preserve">JUnit n'est pas chargé : voir </w:t>
-      </w:r>
-      <w:hyperlink w:history="1" w:anchor="ERR_2">
-        <w:r>
-          <w:rPr>
-            <w:rFonts w:ascii="Consolas" w:cs="Consolas" w:eastAsia="Consolas" w:hAnsi="Consolas"/>
-            <w:color w:val="0563C1"/>
-            <w:sz w:val="22"/>
-            <w:szCs w:val="22"/>
-          </w:rPr>
-          <w:t xml:space="preserve">ERR.2</w:t>
-        </w:r>
-      </w:hyperlink>
-      <w:r>
-        <w:rPr>
-          <w:sz w:val="22"/>
-          <w:szCs w:val="22"/>
-        </w:rPr>
-        <w:t xml:space="preserve">.</w:t>
-      </w:r>
-    </w:p>
-    <w:p>
-      <w:pPr>
-        <w:pStyle w:val="Heading2"/>
-        <w:keepNext/>
-        <w:spacing w:after="120" w:before="300"/>
-      </w:pPr>
-      <w:bookmarkStart w:name="ERR_5" w:id="1"/>
-      <w:r>
-        <w:rPr>
-          <w:b/>
-          <w:bCs/>
-          <w:color w:val="1F4E79"/>
-          <w:sz w:val="25"/>
-          <w:szCs w:val="25"/>
-        </w:rPr>
-        <w:t xml:space="preserve">ERR.5 — Deux classes du même nom</w:t>
-      </w:r>
-      <w:bookmarkEnd w:id="1"/>
-    </w:p>
-    <w:p>
-      <w:pPr>
-        <w:spacing w:after="120"/>
-      </w:pPr>
-      <w:r>
-        <w:rPr>
-          <w:sz w:val="22"/>
-          <w:szCs w:val="22"/>
-        </w:rPr>
-        <w:t xml:space="preserve">Des erreurs incompréhensibles après une réorganisation : une méthode existe pourtant, un import semble correct mais ne l'est pas. Presque toujours, une classe a été copiée-collée dans un nouveau package sans être supprimée de l'ancien. Vous en modifiez une, le programme utilise l'autre.</w:t>
-      </w:r>
-    </w:p>
-    <w:p>
-      <w:pPr>
-        <w:spacing w:after="120"/>
-      </w:pPr>
-      <w:r>
-        <w:rPr>
-          <w:sz w:val="22"/>
-          <w:szCs w:val="22"/>
-        </w:rPr>
-        <w:t xml:space="preserve">Cherchez le nom de la classe avec </w:t>
-      </w:r>
-      <w:r>
-        <w:rPr>
-          <w:rFonts w:ascii="Consolas" w:cs="Consolas" w:eastAsia="Consolas" w:hAnsi="Consolas"/>
-          <w:color w:val="8B2500"/>
-          <w:sz w:val="22"/>
-          <w:szCs w:val="22"/>
-        </w:rPr>
-        <w:t xml:space="preserve">Maj Maj</w:t>
-      </w:r>
-      <w:r>
-        <w:rPr>
-          <w:sz w:val="22"/>
-          <w:szCs w:val="22"/>
-        </w:rPr>
-        <w:t xml:space="preserve"> : si deux résultats apparaissent dans deux packages différents, vous tenez le coupable. Supprimez celle qui est à la mauvaise place, et à l'avenir déplacez avec </w:t>
-      </w:r>
-      <w:r>
-        <w:rPr>
-          <w:rFonts w:ascii="Consolas" w:cs="Consolas" w:eastAsia="Consolas" w:hAnsi="Consolas"/>
-          <w:color w:val="8B2500"/>
-          <w:sz w:val="22"/>
-          <w:szCs w:val="22"/>
-        </w:rPr>
-        <w:t xml:space="preserve">F6</w:t>
-      </w:r>
-      <w:r>
-        <w:rPr>
-          <w:sz w:val="22"/>
-          <w:szCs w:val="22"/>
-        </w:rPr>
-        <w:t xml:space="preserve"> au lieu de copier — voir </w:t>
-      </w:r>
-      <w:hyperlink w:history="1" w:anchor="IDE_21">
-        <w:r>
-          <w:rPr>
-            <w:rFonts w:ascii="Consolas" w:cs="Consolas" w:eastAsia="Consolas" w:hAnsi="Consolas"/>
-            <w:color w:val="0563C1"/>
-            <w:sz w:val="22"/>
-            <w:szCs w:val="22"/>
-          </w:rPr>
-          <w:t xml:space="preserve">IDE.21</w:t>
-        </w:r>
-      </w:hyperlink>
-      <w:r>
-        <w:rPr>
-          <w:sz w:val="22"/>
-          <w:szCs w:val="22"/>
-        </w:rPr>
-        <w:t xml:space="preserve">.</w:t>
-      </w:r>
-    </w:p>
-    <w:p>
-      <w:pPr>
-        <w:pStyle w:val="Heading2"/>
-        <w:keepNext/>
-        <w:spacing w:after="120" w:before="300"/>
-      </w:pPr>
-      <w:bookmarkStart w:name="ERR_6" w:id="1"/>
-      <w:r>
-        <w:rPr>
-          <w:b/>
-          <w:bCs/>
-          <w:color w:val="1F4E79"/>
-          <w:sz w:val="25"/>
-          <w:szCs w:val="25"/>
-        </w:rPr>
-        <w:t xml:space="preserve">ERR.6 — Lancer malgré une erreur de compilation</w:t>
-      </w:r>
-      <w:bookmarkEnd w:id="1"/>
-    </w:p>
-    <w:p>
-      <w:pPr>
-        <w:spacing w:after="120"/>
-      </w:pPr>
-      <w:r>
-        <w:rPr>
-          <w:sz w:val="22"/>
-          <w:szCs w:val="22"/>
-        </w:rPr>
-        <w:t xml:space="preserve">Par défaut, IntelliJ compile tout le module avant de lancer quoi que ce soit. Une erreur dans une classe empêche donc de lancer une autre classe, même sans rapport avec elle.</w:t>
-      </w:r>
-    </w:p>
-    <w:p>
-      <w:pPr>
-        <w:spacing w:after="120"/>
-      </w:pPr>
-      <w:r>
-        <w:rPr>
-          <w:sz w:val="22"/>
-          <w:szCs w:val="22"/>
-        </w:rPr>
-        <w:t xml:space="preserve">Il est possible de contourner ce comportement : </w:t>
-      </w:r>
-      <w:r>
-        <w:rPr>
-          <w:rFonts w:ascii="Consolas" w:cs="Consolas" w:eastAsia="Consolas" w:hAnsi="Consolas"/>
-          <w:color w:val="8B2500"/>
-          <w:sz w:val="22"/>
-          <w:szCs w:val="22"/>
-        </w:rPr>
-        <w:t xml:space="preserve">Settings → Build, Execution, Deployment → Compiler → Java Compiler</w:t>
-      </w:r>
-      <w:r>
-        <w:rPr>
-          <w:sz w:val="22"/>
-          <w:szCs w:val="22"/>
-        </w:rPr>
-        <w:t xml:space="preserve">, basculez </w:t>
-      </w:r>
-      <w:r>
-        <w:rPr>
-          <w:rFonts w:ascii="Consolas" w:cs="Consolas" w:eastAsia="Consolas" w:hAnsi="Consolas"/>
-          <w:color w:val="8B2500"/>
-          <w:sz w:val="22"/>
-          <w:szCs w:val="22"/>
-        </w:rPr>
-        <w:t xml:space="preserve">Use compiler</w:t>
-      </w:r>
-      <w:r>
-        <w:rPr>
-          <w:sz w:val="22"/>
-          <w:szCs w:val="22"/>
-        </w:rPr>
-        <w:t xml:space="preserve"> sur </w:t>
-      </w:r>
-      <w:r>
-        <w:rPr>
-          <w:rFonts w:ascii="Consolas" w:cs="Consolas" w:eastAsia="Consolas" w:hAnsi="Consolas"/>
-          <w:color w:val="8B2500"/>
-          <w:sz w:val="22"/>
-          <w:szCs w:val="22"/>
-        </w:rPr>
-        <w:t xml:space="preserve">Eclipse</w:t>
-      </w:r>
-      <w:r>
-        <w:rPr>
-          <w:sz w:val="22"/>
-          <w:szCs w:val="22"/>
-        </w:rPr>
-        <w:t xml:space="preserve">, puis cochez </w:t>
-      </w:r>
-      <w:r>
-        <w:rPr>
-          <w:rFonts w:ascii="Consolas" w:cs="Consolas" w:eastAsia="Consolas" w:hAnsi="Consolas"/>
-          <w:color w:val="8B2500"/>
-          <w:sz w:val="22"/>
-          <w:szCs w:val="22"/>
-        </w:rPr>
-        <w:t xml:space="preserve">Proceed on errors</w:t>
-      </w:r>
-      <w:r>
-        <w:rPr>
-          <w:sz w:val="22"/>
-          <w:szCs w:val="22"/>
-        </w:rPr>
-        <w:t xml:space="preserve">. L'option n'apparaît qu'après avoir changé de compilateur.</w:t>
+          <w:sz w:val="22"/>
+          <w:szCs w:val="22"/>
+        </w:rPr>
+        <w:t xml:space="preserve">3. Lancez. </w:t>
+      </w:r>
+      <w:r>
+        <w:rPr>
+          <w:sz w:val="22"/>
+          <w:szCs w:val="22"/>
+        </w:rPr>
+        <w:t xml:space="preserve">Sous le module, dépliez </w:t>
+      </w:r>
+      <w:r>
+        <w:rPr>
+          <w:rFonts w:ascii="Consolas" w:cs="Consolas" w:eastAsia="Consolas" w:hAnsi="Consolas"/>
+          <w:color w:val="8B2500"/>
+          <w:sz w:val="22"/>
+          <w:szCs w:val="22"/>
+        </w:rPr>
+        <w:t xml:space="preserve">Plugins → javafx</w:t>
+      </w:r>
+      <w:r>
+        <w:rPr>
+          <w:sz w:val="22"/>
+          <w:szCs w:val="22"/>
+        </w:rPr>
+        <w:t xml:space="preserve">, puis double-cliquez sur </w:t>
+      </w:r>
+      <w:r>
+        <w:rPr>
+          <w:rFonts w:ascii="Consolas" w:cs="Consolas" w:eastAsia="Consolas" w:hAnsi="Consolas"/>
+          <w:color w:val="8B2500"/>
+          <w:sz w:val="22"/>
+          <w:szCs w:val="22"/>
+        </w:rPr>
+        <w:t xml:space="preserve">javafx:run</w:t>
+      </w:r>
+      <w:r>
+        <w:rPr>
+          <w:sz w:val="22"/>
+          <w:szCs w:val="22"/>
+        </w:rPr>
+        <w:t xml:space="preserve">. La console Maven s'ouvre en bas, puis la fenêtre de l'application apparaît ; la fermer termine l'exécution. La première fois, Maven télécharge le greffon : il faut une connexion internet, et quelques secondes de patience.</w:t>
       </w:r>
     </w:p>
     <w:p>
@@ -13715,7 +12605,7 @@
       <w:r>
         <w:drawing>
           <wp:inline distT="0" distB="0" distL="0" distR="0">
-            <wp:extent cx="4943475" cy="3810000"/>
+            <wp:extent cx="3238500" cy="3743325"/>
             <wp:effectExtent t="0" r="0" b="0" l="0"/>
             <wp:docPr id="1" name="" descr="" title=""/>
             <wp:cNvGraphicFramePr>
@@ -13740,6 +12630,1844 @@
                   <pic:spPr bwMode="auto">
                     <a:xfrm>
                       <a:off x="0" y="0"/>
+                      <a:ext cx="3238500" cy="3743325"/>
+                    </a:xfrm>
+                    <a:prstGeom prst="rect">
+                      <a:avLst/>
+                    </a:prstGeom>
+                  </pic:spPr>
+                </pic:pic>
+              </a:graphicData>
+            </a:graphic>
+          </wp:inline>
+        </w:drawing>
+      </w:r>
+    </w:p>
+    <w:p>
+      <w:pPr>
+        <w:spacing w:after="200"/>
+        <w:jc w:val="center"/>
+      </w:pPr>
+      <w:r>
+        <w:rPr>
+          <w:i/>
+          <w:iCs/>
+          <w:color w:val="595959"/>
+          <w:sz w:val="18"/>
+          <w:szCs w:val="18"/>
+        </w:rPr>
+        <w:t xml:space="preserve">La fenêtre Maven : le greffon javafx, sous Plugins, dans le module à lancer.</w:t>
+      </w:r>
+    </w:p>
+    <w:p>
+      <w:pPr>
+        <w:spacing w:after="120"/>
+      </w:pPr>
+      <w:r>
+        <w:rPr>
+          <w:b/>
+          <w:bCs/>
+          <w:sz w:val="22"/>
+          <w:szCs w:val="22"/>
+        </w:rPr>
+        <w:t xml:space="preserve">Quelle classe est lancée ? </w:t>
+      </w:r>
+      <w:r>
+        <w:rPr>
+          <w:sz w:val="22"/>
+          <w:szCs w:val="22"/>
+        </w:rPr>
+        <w:t xml:space="preserve">Celle que désigne la propriété </w:t>
+      </w:r>
+      <w:r>
+        <w:rPr>
+          <w:rFonts w:ascii="Consolas" w:cs="Consolas" w:eastAsia="Consolas" w:hAnsi="Consolas"/>
+          <w:color w:val="8B2500"/>
+          <w:sz w:val="22"/>
+          <w:szCs w:val="22"/>
+        </w:rPr>
+        <w:t xml:space="preserve">javafx.mainClass</w:t>
+      </w:r>
+      <w:r>
+        <w:rPr>
+          <w:sz w:val="22"/>
+          <w:szCs w:val="22"/>
+        </w:rPr>
+        <w:t xml:space="preserve"> dans le </w:t>
+      </w:r>
+      <w:r>
+        <w:rPr>
+          <w:rFonts w:ascii="Consolas" w:cs="Consolas" w:eastAsia="Consolas" w:hAnsi="Consolas"/>
+          <w:color w:val="8B2500"/>
+          <w:sz w:val="22"/>
+          <w:szCs w:val="22"/>
+        </w:rPr>
+        <w:t xml:space="preserve">pom.xml</w:t>
+      </w:r>
+      <w:r>
+        <w:rPr>
+          <w:sz w:val="22"/>
+          <w:szCs w:val="22"/>
+        </w:rPr>
+        <w:t xml:space="preserve"> du module : pour les énoncés et les solutions, le premier exercice JavaFX, </w:t>
+      </w:r>
+      <w:r>
+        <w:rPr>
+          <w:rFonts w:ascii="Consolas" w:cs="Consolas" w:eastAsia="Consolas" w:hAnsi="Consolas"/>
+          <w:color w:val="8B2500"/>
+          <w:sz w:val="22"/>
+          <w:szCs w:val="22"/>
+        </w:rPr>
+        <w:t xml:space="preserve">be.ephec.java.fx.e01.CompteurParticipants</w:t>
+      </w:r>
+      <w:r>
+        <w:rPr>
+          <w:sz w:val="22"/>
+          <w:szCs w:val="22"/>
+        </w:rPr>
+        <w:t xml:space="preserve">. Le greffon accepte directement la classe d'application : inutile de passer par le Lanceur.</w:t>
+      </w:r>
+    </w:p>
+    <w:p>
+      <w:pPr>
+        <w:spacing w:after="120"/>
+      </w:pPr>
+      <w:r>
+        <w:rPr>
+          <w:b/>
+          <w:bCs/>
+          <w:sz w:val="22"/>
+          <w:szCs w:val="22"/>
+        </w:rPr>
+        <w:t xml:space="preserve">Lancer un autre exercice</w:t>
+      </w:r>
+      <w:r>
+        <w:rPr>
+          <w:sz w:val="22"/>
+          <w:szCs w:val="22"/>
+        </w:rPr>
+        <w:t xml:space="preserve">, sans toucher au </w:t>
+      </w:r>
+      <w:r>
+        <w:rPr>
+          <w:rFonts w:ascii="Consolas" w:cs="Consolas" w:eastAsia="Consolas" w:hAnsi="Consolas"/>
+          <w:color w:val="8B2500"/>
+          <w:sz w:val="22"/>
+          <w:szCs w:val="22"/>
+        </w:rPr>
+        <w:t xml:space="preserve">pom.xml</w:t>
+      </w:r>
+      <w:r>
+        <w:rPr>
+          <w:sz w:val="22"/>
+          <w:szCs w:val="22"/>
+        </w:rPr>
+        <w:t xml:space="preserve"> : faites un clic droit sur </w:t>
+      </w:r>
+      <w:r>
+        <w:rPr>
+          <w:rFonts w:ascii="Consolas" w:cs="Consolas" w:eastAsia="Consolas" w:hAnsi="Consolas"/>
+          <w:color w:val="8B2500"/>
+          <w:sz w:val="22"/>
+          <w:szCs w:val="22"/>
+        </w:rPr>
+        <w:t xml:space="preserve">javafx:run</w:t>
+      </w:r>
+      <w:r>
+        <w:rPr>
+          <w:sz w:val="22"/>
+          <w:szCs w:val="22"/>
+        </w:rPr>
+        <w:t xml:space="preserve"> et choisissez </w:t>
+      </w:r>
+      <w:r>
+        <w:rPr>
+          <w:rFonts w:ascii="Consolas" w:cs="Consolas" w:eastAsia="Consolas" w:hAnsi="Consolas"/>
+          <w:color w:val="8B2500"/>
+          <w:sz w:val="22"/>
+          <w:szCs w:val="22"/>
+        </w:rPr>
+        <w:t xml:space="preserve">Modify Run Configuration…</w:t>
+      </w:r>
+      <w:r>
+        <w:rPr>
+          <w:sz w:val="22"/>
+          <w:szCs w:val="22"/>
+        </w:rPr>
+        <w:t xml:space="preserve">.</w:t>
+      </w:r>
+    </w:p>
+    <w:p>
+      <w:pPr>
+        <w:keepNext/>
+        <w:spacing w:after="40" w:before="140"/>
+        <w:jc w:val="center"/>
+      </w:pPr>
+      <w:r>
+        <w:drawing>
+          <wp:inline distT="0" distB="0" distL="0" distR="0">
+            <wp:extent cx="2876550" cy="2543175"/>
+            <wp:effectExtent t="0" r="0" b="0" l="0"/>
+            <wp:docPr id="1" name="" descr="" title=""/>
+            <wp:cNvGraphicFramePr>
+              <a:graphicFrameLocks xmlns:a="http://schemas.openxmlformats.org/drawingml/2006/main" noChangeAspect="1"/>
+            </wp:cNvGraphicFramePr>
+            <a:graphic xmlns:a="http://schemas.openxmlformats.org/drawingml/2006/main">
+              <a:graphicData uri="http://schemas.openxmlformats.org/drawingml/2006/picture">
+                <pic:pic xmlns:pic="http://schemas.openxmlformats.org/drawingml/2006/picture">
+                  <pic:nvPicPr>
+                    <pic:cNvPr id="0" name="" descr=""/>
+                    <pic:cNvPicPr>
+                      <a:picLocks noChangeAspect="1" noChangeArrowheads="1"/>
+                    </pic:cNvPicPr>
+                  </pic:nvPicPr>
+                  <pic:blipFill>
+                    <a:blip r:embed="rId26" cstate="none"/>
+                    <a:srcRect/>
+                    <a:stretch>
+                      <a:fillRect/>
+                    </a:stretch>
+                  </pic:blipFill>
+                  <pic:spPr bwMode="auto">
+                    <a:xfrm>
+                      <a:off x="0" y="0"/>
+                      <a:ext cx="2876550" cy="2543175"/>
+                    </a:xfrm>
+                    <a:prstGeom prst="rect">
+                      <a:avLst/>
+                    </a:prstGeom>
+                  </pic:spPr>
+                </pic:pic>
+              </a:graphicData>
+            </a:graphic>
+          </wp:inline>
+        </w:drawing>
+      </w:r>
+    </w:p>
+    <w:p>
+      <w:pPr>
+        <w:spacing w:after="200"/>
+        <w:jc w:val="center"/>
+      </w:pPr>
+      <w:r>
+        <w:rPr>
+          <w:i/>
+          <w:iCs/>
+          <w:color w:val="595959"/>
+          <w:sz w:val="18"/>
+          <w:szCs w:val="18"/>
+        </w:rPr>
+        <w:t xml:space="preserve">Le menu contextuel de javafx:run.</w:t>
+      </w:r>
+    </w:p>
+    <w:p>
+      <w:pPr>
+        <w:spacing w:after="120"/>
+      </w:pPr>
+      <w:r>
+        <w:rPr>
+          <w:sz w:val="22"/>
+          <w:szCs w:val="22"/>
+        </w:rPr>
+        <w:t xml:space="preserve">Dans la fenêtre qui s'ouvre, trois réglages :</w:t>
+      </w:r>
+    </w:p>
+    <w:p>
+      <w:pPr>
+        <w:pStyle w:val="ListParagraph"/>
+        <w:numPr>
+          <w:ilvl w:val="0"/>
+          <w:numId w:val="2"/>
+        </w:numPr>
+        <w:spacing w:after="60"/>
+      </w:pPr>
+      <w:r>
+        <w:rPr>
+          <w:b/>
+          <w:bCs/>
+          <w:sz w:val="22"/>
+          <w:szCs w:val="22"/>
+        </w:rPr>
+        <w:t xml:space="preserve">Name</w:t>
+      </w:r>
+      <w:r>
+        <w:rPr>
+          <w:sz w:val="22"/>
+          <w:szCs w:val="22"/>
+        </w:rPr>
+        <w:t xml:space="preserve"> : un nom parlant, « FX.2 » par exemple.</w:t>
+      </w:r>
+    </w:p>
+    <w:p>
+      <w:pPr>
+        <w:pStyle w:val="ListParagraph"/>
+        <w:numPr>
+          <w:ilvl w:val="0"/>
+          <w:numId w:val="2"/>
+        </w:numPr>
+        <w:spacing w:after="60"/>
+      </w:pPr>
+      <w:r>
+        <w:rPr>
+          <w:b/>
+          <w:bCs/>
+          <w:sz w:val="22"/>
+          <w:szCs w:val="22"/>
+        </w:rPr>
+        <w:t xml:space="preserve">Run</w:t>
+      </w:r>
+      <w:r>
+        <w:rPr>
+          <w:sz w:val="22"/>
+          <w:szCs w:val="22"/>
+        </w:rPr>
+        <w:t xml:space="preserve"> : la commande. Gardez ce qu'IntelliJ a écrit, et ajoutez la classe à lancer après </w:t>
+      </w:r>
+      <w:r>
+        <w:rPr>
+          <w:rFonts w:ascii="Consolas" w:cs="Consolas" w:eastAsia="Consolas" w:hAnsi="Consolas"/>
+          <w:color w:val="8B2500"/>
+          <w:sz w:val="22"/>
+          <w:szCs w:val="22"/>
+        </w:rPr>
+        <w:t xml:space="preserve">javafx:run</w:t>
+      </w:r>
+      <w:r>
+        <w:rPr>
+          <w:sz w:val="22"/>
+          <w:szCs w:val="22"/>
+        </w:rPr>
+        <w:t xml:space="preserve"> :</w:t>
+      </w:r>
+    </w:p>
+    <w:p>
+      <w:pPr>
+        <w:keepLines/>
+        <w:shd w:fill="F2F2F2" w:val="clear"/>
+        <w:spacing w:after="160" w:before="100"/>
+        <w:ind w:left="220"/>
+      </w:pPr>
+      <w:r>
+        <w:rPr>
+          <w:rFonts w:ascii="Consolas" w:cs="Consolas" w:eastAsia="Consolas" w:hAnsi="Consolas"/>
+          <w:sz w:val="19"/>
+          <w:szCs w:val="19"/>
+        </w:rPr>
+        <w:t xml:space="preserve">javafx:run -Djavafx.mainClass=be.ephec.java.fx.e02.CompteurParticipants -f pom.xml</w:t>
+      </w:r>
+    </w:p>
+    <w:p>
+      <w:pPr>
+        <w:pStyle w:val="ListParagraph"/>
+        <w:numPr>
+          <w:ilvl w:val="0"/>
+          <w:numId w:val="2"/>
+        </w:numPr>
+        <w:spacing w:after="60"/>
+      </w:pPr>
+      <w:r>
+        <w:rPr>
+          <w:b/>
+          <w:bCs/>
+          <w:sz w:val="22"/>
+          <w:szCs w:val="22"/>
+        </w:rPr>
+        <w:t xml:space="preserve">Working directory</w:t>
+      </w:r>
+      <w:r>
+        <w:rPr>
+          <w:sz w:val="22"/>
+          <w:szCs w:val="22"/>
+        </w:rPr>
+        <w:t xml:space="preserve"> : le dossier dont Maven lit le </w:t>
+      </w:r>
+      <w:r>
+        <w:rPr>
+          <w:rFonts w:ascii="Consolas" w:cs="Consolas" w:eastAsia="Consolas" w:hAnsi="Consolas"/>
+          <w:color w:val="8B2500"/>
+          <w:sz w:val="22"/>
+          <w:szCs w:val="22"/>
+        </w:rPr>
+        <w:t xml:space="preserve">pom.xml</w:t>
+      </w:r>
+      <w:r>
+        <w:rPr>
+          <w:sz w:val="22"/>
+          <w:szCs w:val="22"/>
+        </w:rPr>
+        <w:t xml:space="preserve">. Vérifiez qu'il désigne bien le module, par exemple le dossier </w:t>
+      </w:r>
+      <w:r>
+        <w:rPr>
+          <w:rFonts w:ascii="Consolas" w:cs="Consolas" w:eastAsia="Consolas" w:hAnsi="Consolas"/>
+          <w:color w:val="8B2500"/>
+          <w:sz w:val="22"/>
+          <w:szCs w:val="22"/>
+        </w:rPr>
+        <w:t xml:space="preserve">exercices</w:t>
+      </w:r>
+      <w:r>
+        <w:rPr>
+          <w:sz w:val="22"/>
+          <w:szCs w:val="22"/>
+        </w:rPr>
+        <w:t xml:space="preserve">. S'il indique la racine du projet, choisissez le dossier du module avec l'icône de dossier : sinon, Maven partirait du </w:t>
+      </w:r>
+      <w:r>
+        <w:rPr>
+          <w:rFonts w:ascii="Consolas" w:cs="Consolas" w:eastAsia="Consolas" w:hAnsi="Consolas"/>
+          <w:color w:val="8B2500"/>
+          <w:sz w:val="22"/>
+          <w:szCs w:val="22"/>
+        </w:rPr>
+        <w:t xml:space="preserve">pom.xml</w:t>
+      </w:r>
+      <w:r>
+        <w:rPr>
+          <w:sz w:val="22"/>
+          <w:szCs w:val="22"/>
+        </w:rPr>
+        <w:t xml:space="preserve"> parent et lancerait la commande dans chaque module.</w:t>
+      </w:r>
+    </w:p>
+    <w:p>
+      <w:pPr>
+        <w:keepNext/>
+        <w:spacing w:after="40" w:before="140"/>
+        <w:jc w:val="center"/>
+      </w:pPr>
+      <w:r>
+        <w:drawing>
+          <wp:inline distT="0" distB="0" distL="0" distR="0">
+            <wp:extent cx="3600450" cy="3028950"/>
+            <wp:effectExtent t="0" r="0" b="0" l="0"/>
+            <wp:docPr id="1" name="" descr="" title=""/>
+            <wp:cNvGraphicFramePr>
+              <a:graphicFrameLocks xmlns:a="http://schemas.openxmlformats.org/drawingml/2006/main" noChangeAspect="1"/>
+            </wp:cNvGraphicFramePr>
+            <a:graphic xmlns:a="http://schemas.openxmlformats.org/drawingml/2006/main">
+              <a:graphicData uri="http://schemas.openxmlformats.org/drawingml/2006/picture">
+                <pic:pic xmlns:pic="http://schemas.openxmlformats.org/drawingml/2006/picture">
+                  <pic:nvPicPr>
+                    <pic:cNvPr id="0" name="" descr=""/>
+                    <pic:cNvPicPr>
+                      <a:picLocks noChangeAspect="1" noChangeArrowheads="1"/>
+                    </pic:cNvPicPr>
+                  </pic:nvPicPr>
+                  <pic:blipFill>
+                    <a:blip r:embed="rId27" cstate="none"/>
+                    <a:srcRect/>
+                    <a:stretch>
+                      <a:fillRect/>
+                    </a:stretch>
+                  </pic:blipFill>
+                  <pic:spPr bwMode="auto">
+                    <a:xfrm>
+                      <a:off x="0" y="0"/>
+                      <a:ext cx="3600450" cy="3028950"/>
+                    </a:xfrm>
+                    <a:prstGeom prst="rect">
+                      <a:avLst/>
+                    </a:prstGeom>
+                  </pic:spPr>
+                </pic:pic>
+              </a:graphicData>
+            </a:graphic>
+          </wp:inline>
+        </w:drawing>
+      </w:r>
+    </w:p>
+    <w:p>
+      <w:pPr>
+        <w:spacing w:after="200"/>
+        <w:jc w:val="center"/>
+      </w:pPr>
+      <w:r>
+        <w:rPr>
+          <w:i/>
+          <w:iCs/>
+          <w:color w:val="595959"/>
+          <w:sz w:val="18"/>
+          <w:szCs w:val="18"/>
+        </w:rPr>
+        <w:t xml:space="preserve">La configuration d'exécution : son nom, la commande Maven, le dossier de travail.</w:t>
+      </w:r>
+    </w:p>
+    <w:p>
+      <w:pPr>
+        <w:spacing w:after="120"/>
+      </w:pPr>
+      <w:r>
+        <w:rPr>
+          <w:sz w:val="22"/>
+          <w:szCs w:val="22"/>
+        </w:rPr>
+        <w:t xml:space="preserve">Validez par OK. La configuration apparaît ensuite dans la liste déroulante en haut à droite d'IntelliJ, et la flèche verte la relance.</w:t>
+      </w:r>
+    </w:p>
+    <w:p>
+      <w:pPr>
+        <w:spacing w:after="120"/>
+      </w:pPr>
+      <w:r>
+        <w:rPr>
+          <w:sz w:val="22"/>
+          <w:szCs w:val="22"/>
+        </w:rPr>
+        <w:t xml:space="preserve">Si vous obtenez le message </w:t>
+      </w:r>
+      <w:r>
+        <w:rPr>
+          <w:rFonts w:ascii="Consolas" w:cs="Consolas" w:eastAsia="Consolas" w:hAnsi="Consolas"/>
+          <w:color w:val="8B2500"/>
+          <w:sz w:val="22"/>
+          <w:szCs w:val="22"/>
+        </w:rPr>
+        <w:t xml:space="preserve">JavaFX runtime components are missing</w:t>
+      </w:r>
+      <w:r>
+        <w:rPr>
+          <w:sz w:val="22"/>
+          <w:szCs w:val="22"/>
+        </w:rPr>
+        <w:t xml:space="preserve">, c'est exactement ce problème : voir </w:t>
+      </w:r>
+      <w:hyperlink w:history="1" w:anchor="ERR_7">
+        <w:r>
+          <w:rPr>
+            <w:rFonts w:ascii="Consolas" w:cs="Consolas" w:eastAsia="Consolas" w:hAnsi="Consolas"/>
+            <w:color w:val="0563C1"/>
+            <w:sz w:val="22"/>
+            <w:szCs w:val="22"/>
+          </w:rPr>
+          <w:t xml:space="preserve">ERR.7</w:t>
+        </w:r>
+      </w:hyperlink>
+      <w:r>
+        <w:rPr>
+          <w:sz w:val="22"/>
+          <w:szCs w:val="22"/>
+        </w:rPr>
+        <w:t xml:space="preserve">.</w:t>
+      </w:r>
+    </w:p>
+    <w:p>
+      <w:pPr>
+        <w:pStyle w:val="Heading2"/>
+        <w:keepNext/>
+        <w:spacing w:after="120" w:before="300"/>
+      </w:pPr>
+      <w:bookmarkStart w:name="IDE_29" w:id="1"/>
+      <w:r>
+        <w:rPr>
+          <w:b/>
+          <w:bCs/>
+          <w:color w:val="1F4E79"/>
+          <w:sz w:val="25"/>
+          <w:szCs w:val="25"/>
+        </w:rPr>
+        <w:t xml:space="preserve">IDE.29 — Installer Scene Builder</w:t>
+      </w:r>
+      <w:bookmarkEnd w:id="1"/>
+    </w:p>
+    <w:p>
+      <w:pPr>
+        <w:spacing w:after="120"/>
+      </w:pPr>
+      <w:r>
+        <w:rPr>
+          <w:sz w:val="22"/>
+          <w:szCs w:val="22"/>
+        </w:rPr>
+        <w:t xml:space="preserve">Scene Builder est un éditeur visuel de fichiers </w:t>
+      </w:r>
+      <w:r>
+        <w:rPr>
+          <w:rFonts w:ascii="Consolas" w:cs="Consolas" w:eastAsia="Consolas" w:hAnsi="Consolas"/>
+          <w:color w:val="8B2500"/>
+          <w:sz w:val="22"/>
+          <w:szCs w:val="22"/>
+        </w:rPr>
+        <w:t xml:space="preserve">.fxml</w:t>
+      </w:r>
+      <w:r>
+        <w:rPr>
+          <w:sz w:val="22"/>
+          <w:szCs w:val="22"/>
+        </w:rPr>
+        <w:t xml:space="preserve"> : on y compose la fenêtre en déposant les composants à la souris, et il écrit le XML correspondant. Il est gratuit.</w:t>
+      </w:r>
+    </w:p>
+    <w:p>
+      <w:pPr>
+        <w:spacing w:after="120"/>
+      </w:pPr>
+      <w:r>
+        <w:rPr>
+          <w:b/>
+          <w:bCs/>
+          <w:sz w:val="22"/>
+          <w:szCs w:val="22"/>
+        </w:rPr>
+        <w:t xml:space="preserve">Ce n'est pas un greffon d'IntelliJ, mais un logiciel séparé. </w:t>
+      </w:r>
+      <w:r>
+        <w:rPr>
+          <w:sz w:val="22"/>
+          <w:szCs w:val="22"/>
+        </w:rPr>
+        <w:t xml:space="preserve">IntelliJ ne fait que lui passer la main quand vous ouvrez un fichier FXML. Il faut donc l'installer, puis dire à IntelliJ où il se trouve — deux étapes distinctes, et c'est la seconde qu'on oublie.</w:t>
+      </w:r>
+    </w:p>
+    <w:p>
+      <w:pPr>
+        <w:pStyle w:val="Heading3"/>
+        <w:keepNext/>
+        <w:spacing w:after="80" w:before="200"/>
+      </w:pPr>
+      <w:r>
+        <w:rPr>
+          <w:b/>
+          <w:bCs/>
+          <w:color w:val="595959"/>
+          <w:sz w:val="22"/>
+          <w:szCs w:val="22"/>
+        </w:rPr>
+        <w:t xml:space="preserve">1. Télécharger</w:t>
+      </w:r>
+    </w:p>
+    <w:p>
+      <w:pPr>
+        <w:spacing w:after="120"/>
+      </w:pPr>
+      <w:r>
+        <w:rPr>
+          <w:sz w:val="22"/>
+          <w:szCs w:val="22"/>
+        </w:rPr>
+        <w:t xml:space="preserve">Sur </w:t>
+      </w:r>
+      <w:r>
+        <w:rPr>
+          <w:rFonts w:ascii="Consolas" w:cs="Consolas" w:eastAsia="Consolas" w:hAnsi="Consolas"/>
+          <w:color w:val="8B2500"/>
+          <w:sz w:val="22"/>
+          <w:szCs w:val="22"/>
+        </w:rPr>
+        <w:t xml:space="preserve">gluonhq.com/products/scene-builder</w:t>
+      </w:r>
+      <w:r>
+        <w:rPr>
+          <w:sz w:val="22"/>
+          <w:szCs w:val="22"/>
+        </w:rPr>
+        <w:t xml:space="preserve">, en prenant la version correspondant à votre système. Sur un Mac Apple Silicon, vérifiez qu'il s'agit bien de la variante </w:t>
+      </w:r>
+      <w:r>
+        <w:rPr>
+          <w:rFonts w:ascii="Consolas" w:cs="Consolas" w:eastAsia="Consolas" w:hAnsi="Consolas"/>
+          <w:color w:val="8B2500"/>
+          <w:sz w:val="22"/>
+          <w:szCs w:val="22"/>
+        </w:rPr>
+        <w:t xml:space="preserve">aarch64</w:t>
+      </w:r>
+      <w:r>
+        <w:rPr>
+          <w:sz w:val="22"/>
+          <w:szCs w:val="22"/>
+        </w:rPr>
+        <w:t xml:space="preserve"> et non </w:t>
+      </w:r>
+      <w:r>
+        <w:rPr>
+          <w:rFonts w:ascii="Consolas" w:cs="Consolas" w:eastAsia="Consolas" w:hAnsi="Consolas"/>
+          <w:color w:val="8B2500"/>
+          <w:sz w:val="22"/>
+          <w:szCs w:val="22"/>
+        </w:rPr>
+        <w:t xml:space="preserve">x64</w:t>
+      </w:r>
+      <w:r>
+        <w:rPr>
+          <w:sz w:val="22"/>
+          <w:szCs w:val="22"/>
+        </w:rPr>
+        <w:t xml:space="preserve">.</w:t>
+      </w:r>
+    </w:p>
+    <w:p>
+      <w:pPr>
+        <w:spacing w:after="120"/>
+      </w:pPr>
+      <w:r>
+        <w:rPr>
+          <w:b/>
+          <w:bCs/>
+          <w:sz w:val="22"/>
+          <w:szCs w:val="22"/>
+        </w:rPr>
+        <w:t xml:space="preserve">Quelle version. </w:t>
+      </w:r>
+      <w:r>
+        <w:rPr>
+          <w:sz w:val="22"/>
+          <w:szCs w:val="22"/>
+        </w:rPr>
+        <w:t xml:space="preserve">Les numéros de Scene Builder suivent ceux de JavaFX. Le cours utilise JavaFX 21 : prenez Scene Builder 21, ou la version disponible la plus proche. Un Scene Builder plus récent que votre JavaFX peut écrire dans le FXML des attributs que votre version ne comprend pas — le fichier s'ouvre alors correctement dans l'éditeur et échoue au lancement.</w:t>
+      </w:r>
+    </w:p>
+    <w:p>
+      <w:pPr>
+        <w:pStyle w:val="Heading3"/>
+        <w:keepNext/>
+        <w:spacing w:after="80" w:before="200"/>
+      </w:pPr>
+      <w:r>
+        <w:rPr>
+          <w:b/>
+          <w:bCs/>
+          <w:color w:val="595959"/>
+          <w:sz w:val="22"/>
+          <w:szCs w:val="22"/>
+        </w:rPr>
+        <w:t xml:space="preserve">2. Installer</w:t>
+      </w:r>
+    </w:p>
+    <w:p>
+      <w:pPr>
+        <w:spacing w:after="120"/>
+      </w:pPr>
+      <w:r>
+        <w:rPr>
+          <w:sz w:val="22"/>
+          <w:szCs w:val="22"/>
+        </w:rPr>
+        <w:t xml:space="preserve">Installation ordinaire : un .dmg à glisser dans Applications sous macOS, un installateur sous Windows. Aucun réglage à faire pendant l'installation.</w:t>
+      </w:r>
+    </w:p>
+    <w:p>
+      <w:pPr>
+        <w:spacing w:after="120"/>
+      </w:pPr>
+      <w:r>
+        <w:rPr>
+          <w:sz w:val="22"/>
+          <w:szCs w:val="22"/>
+        </w:rPr>
+        <w:t xml:space="preserve">Notez le chemin où il atterrit, vous en aurez besoin à l'étape suivante. Par défaut :</w:t>
+      </w:r>
+    </w:p>
+    <w:p>
+      <w:pPr>
+        <w:keepLines/>
+        <w:shd w:fill="F2F2F2" w:val="clear"/>
+        <w:spacing w:after="0" w:before="100"/>
+        <w:ind w:left="220"/>
+      </w:pPr>
+      <w:r>
+        <w:rPr>
+          <w:rFonts w:ascii="Consolas" w:cs="Consolas" w:eastAsia="Consolas" w:hAnsi="Consolas"/>
+          <w:sz w:val="19"/>
+          <w:szCs w:val="19"/>
+        </w:rPr>
+        <w:t xml:space="preserve">macOS     /Applications/SceneBuilder.app</w:t>
+      </w:r>
+    </w:p>
+    <w:p>
+      <w:pPr>
+        <w:keepLines/>
+        <w:shd w:fill="F2F2F2" w:val="clear"/>
+        <w:spacing w:after="160" w:before="0"/>
+        <w:ind w:left="220"/>
+      </w:pPr>
+      <w:r>
+        <w:rPr>
+          <w:rFonts w:ascii="Consolas" w:cs="Consolas" w:eastAsia="Consolas" w:hAnsi="Consolas"/>
+          <w:sz w:val="19"/>
+          <w:szCs w:val="19"/>
+        </w:rPr>
+        <w:t xml:space="preserve">Windows   C:\Users\&lt;vous&gt;\AppData\Local\SceneBuilder\SceneBuilder.exe</w:t>
+      </w:r>
+    </w:p>
+    <w:p>
+      <w:pPr>
+        <w:pStyle w:val="Heading3"/>
+        <w:keepNext/>
+        <w:spacing w:after="80" w:before="200"/>
+      </w:pPr>
+      <w:r>
+        <w:rPr>
+          <w:b/>
+          <w:bCs/>
+          <w:color w:val="595959"/>
+          <w:sz w:val="22"/>
+          <w:szCs w:val="22"/>
+        </w:rPr>
+        <w:t xml:space="preserve">3. Le déclarer dans IntelliJ</w:t>
+      </w:r>
+    </w:p>
+    <w:p>
+      <w:pPr>
+        <w:spacing w:after="120"/>
+      </w:pPr>
+      <w:r>
+        <w:rPr>
+          <w:rFonts w:ascii="Consolas" w:cs="Consolas" w:eastAsia="Consolas" w:hAnsi="Consolas"/>
+          <w:color w:val="8B2500"/>
+          <w:sz w:val="22"/>
+          <w:szCs w:val="22"/>
+        </w:rPr>
+        <w:t xml:space="preserve">Settings → Languages &amp; Frameworks → JavaFX</w:t>
+      </w:r>
+      <w:r>
+        <w:rPr>
+          <w:sz w:val="22"/>
+          <w:szCs w:val="22"/>
+        </w:rPr>
+        <w:t xml:space="preserve">, champ </w:t>
+      </w:r>
+      <w:r>
+        <w:rPr>
+          <w:rFonts w:ascii="Consolas" w:cs="Consolas" w:eastAsia="Consolas" w:hAnsi="Consolas"/>
+          <w:color w:val="8B2500"/>
+          <w:sz w:val="22"/>
+          <w:szCs w:val="22"/>
+        </w:rPr>
+        <w:t xml:space="preserve">Path to SceneBuilder</w:t>
+      </w:r>
+      <w:r>
+        <w:rPr>
+          <w:sz w:val="22"/>
+          <w:szCs w:val="22"/>
+        </w:rPr>
+        <w:t xml:space="preserve">. Désignez le fichier repéré ci-dessus.</w:t>
+      </w:r>
+    </w:p>
+    <w:p>
+      <w:pPr>
+        <w:spacing w:after="120"/>
+      </w:pPr>
+      <w:r>
+        <w:rPr>
+          <w:sz w:val="22"/>
+          <w:szCs w:val="22"/>
+        </w:rPr>
+        <w:t xml:space="preserve">C'est la seule ligne à renseigner. Tant qu'elle est vide, IntelliJ ouvre les fichiers FXML comme du XML ordinaire, sans onglet d'édition visuelle — et rien n'indique qu'il manque quelque chose.</w:t>
+      </w:r>
+    </w:p>
+    <w:p>
+      <w:pPr>
+        <w:pStyle w:val="Heading3"/>
+        <w:keepNext/>
+        <w:spacing w:after="80" w:before="200"/>
+      </w:pPr>
+      <w:r>
+        <w:rPr>
+          <w:b/>
+          <w:bCs/>
+          <w:color w:val="595959"/>
+          <w:sz w:val="22"/>
+          <w:szCs w:val="22"/>
+        </w:rPr>
+        <w:t xml:space="preserve">4. Vérifier</w:t>
+      </w:r>
+    </w:p>
+    <w:p>
+      <w:pPr>
+        <w:spacing w:after="120"/>
+      </w:pPr>
+      <w:r>
+        <w:rPr>
+          <w:sz w:val="22"/>
+          <w:szCs w:val="22"/>
+        </w:rPr>
+        <w:t xml:space="preserve">Ouvrez n'importe quel fichier </w:t>
+      </w:r>
+      <w:r>
+        <w:rPr>
+          <w:rFonts w:ascii="Consolas" w:cs="Consolas" w:eastAsia="Consolas" w:hAnsi="Consolas"/>
+          <w:color w:val="8B2500"/>
+          <w:sz w:val="22"/>
+          <w:szCs w:val="22"/>
+        </w:rPr>
+        <w:t xml:space="preserve">.fxml</w:t>
+      </w:r>
+      <w:r>
+        <w:rPr>
+          <w:sz w:val="22"/>
+          <w:szCs w:val="22"/>
+        </w:rPr>
+        <w:t xml:space="preserve"> du projet. Deux onglets doivent apparaître en bas de l'éditeur : </w:t>
+      </w:r>
+      <w:r>
+        <w:rPr>
+          <w:rFonts w:ascii="Consolas" w:cs="Consolas" w:eastAsia="Consolas" w:hAnsi="Consolas"/>
+          <w:color w:val="8B2500"/>
+          <w:sz w:val="22"/>
+          <w:szCs w:val="22"/>
+        </w:rPr>
+        <w:t xml:space="preserve">Text</w:t>
+      </w:r>
+      <w:r>
+        <w:rPr>
+          <w:sz w:val="22"/>
+          <w:szCs w:val="22"/>
+        </w:rPr>
+        <w:t xml:space="preserve"> et </w:t>
+      </w:r>
+      <w:r>
+        <w:rPr>
+          <w:rFonts w:ascii="Consolas" w:cs="Consolas" w:eastAsia="Consolas" w:hAnsi="Consolas"/>
+          <w:color w:val="8B2500"/>
+          <w:sz w:val="22"/>
+          <w:szCs w:val="22"/>
+        </w:rPr>
+        <w:t xml:space="preserve">Scene Builder</w:t>
+      </w:r>
+      <w:r>
+        <w:rPr>
+          <w:sz w:val="22"/>
+          <w:szCs w:val="22"/>
+        </w:rPr>
+        <w:t xml:space="preserve">. Le second affiche la fenêtre telle qu'elle sera, avec la palette de composants sur le côté.</w:t>
+      </w:r>
+    </w:p>
+    <w:p>
+      <w:pPr>
+        <w:spacing w:after="120"/>
+      </w:pPr>
+      <w:r>
+        <w:rPr>
+          <w:sz w:val="22"/>
+          <w:szCs w:val="22"/>
+        </w:rPr>
+        <w:t xml:space="preserve">Si l'onglet n'apparaît pas, le chemin est erroné ou pointe vers le dossier plutôt que vers l'exécutable.</w:t>
+      </w:r>
+    </w:p>
+    <w:p>
+      <w:pPr>
+        <w:pStyle w:val="Heading3"/>
+        <w:keepNext/>
+        <w:spacing w:after="80" w:before="200"/>
+      </w:pPr>
+      <w:r>
+        <w:rPr>
+          <w:b/>
+          <w:bCs/>
+          <w:color w:val="595959"/>
+          <w:sz w:val="22"/>
+          <w:szCs w:val="22"/>
+        </w:rPr>
+        <w:t xml:space="preserve">S'en servir, ou pas</w:t>
+      </w:r>
+    </w:p>
+    <w:p>
+      <w:pPr>
+        <w:spacing w:after="120"/>
+      </w:pPr>
+      <w:r>
+        <w:rPr>
+          <w:sz w:val="22"/>
+          <w:szCs w:val="22"/>
+        </w:rPr>
+        <w:t xml:space="preserve">Scene Builder fait gagner du temps sur les fenêtres complexes, où placer les composants à la main devient fastidieux. Il rend aussi visible ce qu'un gestionnaire de placement fait réellement, ce qui aide à comprendre pourquoi une fenêtre se réorganise quand on la redimensionne.</w:t>
+      </w:r>
+    </w:p>
+    <w:p>
+      <w:pPr>
+        <w:spacing w:after="120"/>
+      </w:pPr>
+      <w:r>
+        <w:rPr>
+          <w:b/>
+          <w:bCs/>
+          <w:sz w:val="22"/>
+          <w:szCs w:val="22"/>
+        </w:rPr>
+        <w:t xml:space="preserve">Mais vous pouvez très bien vous en passer, et je vous conseille de commencer sans. </w:t>
+      </w:r>
+      <w:r>
+        <w:rPr>
+          <w:sz w:val="22"/>
+          <w:szCs w:val="22"/>
+        </w:rPr>
+        <w:t xml:space="preserve">Écrire quelques fichiers FXML à la main apprend leur structure, et cette structure est ce que l'examen évalue — pas votre habileté à la souris.</w:t>
+      </w:r>
+    </w:p>
+    <w:tbl>
+      <w:tblPr>
+        <w:tblW w:type="dxa" w:w="9360"/>
+        <w:tblBorders>
+          <w:top w:val="single" w:color="A6A6A6" w:sz="2"/>
+          <w:left w:val="single" w:color="1F4E79" w:sz="12"/>
+          <w:bottom w:val="single" w:color="A6A6A6" w:sz="2"/>
+          <w:right w:val="single" w:color="A6A6A6" w:sz="2"/>
+          <w:insideH w:val="none"/>
+          <w:insideV w:val="none"/>
+        </w:tblBorders>
+      </w:tblPr>
+      <w:tblGrid>
+        <w:gridCol w:w="9360"/>
+      </w:tblGrid>
+      <w:tr>
+        <w:trPr>
+          <w:cantSplit/>
+        </w:trPr>
+        <w:tc>
+          <w:tcPr>
+            <w:tcW w:type="dxa" w:w="9360"/>
+            <w:shd w:fill="F7F9FC" w:val="clear"/>
+            <w:tcMar>
+              <w:top w:type="dxa" w:w="120"/>
+              <w:left w:type="dxa" w:w="160"/>
+              <w:bottom w:type="dxa" w:w="120"/>
+              <w:right w:type="dxa" w:w="160"/>
+            </w:tcMar>
+          </w:tcPr>
+          <w:p>
+            <w:pPr>
+              <w:spacing w:after="80"/>
+            </w:pPr>
+            <w:r>
+              <w:rPr>
+                <w:b/>
+                <w:bCs/>
+                <w:sz w:val="22"/>
+                <w:szCs w:val="22"/>
+              </w:rPr>
+              <w:t xml:space="preserve">Deux attributs à ne jamais perdre de vue</w:t>
+            </w:r>
+          </w:p>
+          <w:p>
+            <w:pPr>
+              <w:spacing w:after="80"/>
+            </w:pPr>
+            <w:r>
+              <w:rPr>
+                <w:sz w:val="22"/>
+                <w:szCs w:val="22"/>
+              </w:rPr>
+              <w:t xml:space="preserve">Un fichier FXML contient un attribut fx:controller sur son élément racine, qui désigne la classe contrôleur, et des attributs fx:id sur les composants que le contrôleur manipule. Ce sont eux qui relient la vue au code.</w:t>
+            </w:r>
+          </w:p>
+          <w:p>
+            <w:pPr>
+              <w:spacing w:after="0"/>
+            </w:pPr>
+            <w:r>
+              <w:rPr>
+                <w:sz w:val="22"/>
+                <w:szCs w:val="22"/>
+              </w:rPr>
+              <w:t xml:space="preserve">Scene Builder les gère, mais ils se règlent dans un panneau discret. Si votre application se lance avec une fenêtre vide, ou lève une exception au démarrage en évoquant un champ null, vérifiez d'abord ces deux attributs dans l'onglet Text.</w:t>
+            </w:r>
+          </w:p>
+        </w:tc>
+      </w:tr>
+    </w:tbl>
+    <w:p>
+      <w:r>
+        <w:br w:type="page"/>
+      </w:r>
+    </w:p>
+    <w:p>
+      <w:pPr>
+        <w:pStyle w:val="Heading1"/>
+        <w:keepNext/>
+        <w:spacing w:after="160" w:before="360"/>
+      </w:pPr>
+      <w:r>
+        <w:rPr>
+          <w:b/>
+          <w:bCs/>
+          <w:color w:val="1F4E79"/>
+          <w:sz w:val="32"/>
+          <w:szCs w:val="32"/>
+        </w:rPr>
+        <w:t xml:space="preserve">Annexe — Erreurs et solutions</w:t>
+      </w:r>
+    </w:p>
+    <w:p>
+      <w:pPr>
+        <w:spacing w:after="120"/>
+      </w:pPr>
+      <w:r>
+        <w:rPr>
+          <w:i/>
+          <w:iCs/>
+          <w:color w:val="595959"/>
+          <w:sz w:val="22"/>
+          <w:szCs w:val="22"/>
+        </w:rPr>
+        <w:t xml:space="preserve">Les messages les plus fréquents, leur cause, et ce qu'il faut faire. Cherchez le message que vous avez à l'écran plutôt que de lire l'annexe en entier.</w:t>
+      </w:r>
+    </w:p>
+    <w:p>
+      <w:pPr>
+        <w:pStyle w:val="Heading2"/>
+        <w:keepNext/>
+        <w:spacing w:after="120" w:before="300"/>
+      </w:pPr>
+      <w:bookmarkStart w:name="ERR_1" w:id="1"/>
+      <w:r>
+        <w:rPr>
+          <w:b/>
+          <w:bCs/>
+          <w:color w:val="1F4E79"/>
+          <w:sz w:val="25"/>
+          <w:szCs w:val="25"/>
+        </w:rPr>
+        <w:t xml:space="preserve">ERR.1 — JDK isn't specified for module</w:t>
+      </w:r>
+      <w:bookmarkEnd w:id="1"/>
+    </w:p>
+    <w:p>
+      <w:pPr>
+        <w:keepLines/>
+        <w:shd w:fill="F2F2F2" w:val="clear"/>
+        <w:spacing w:after="160" w:before="100"/>
+        <w:ind w:left="220"/>
+      </w:pPr>
+      <w:r>
+        <w:rPr>
+          <w:rFonts w:ascii="Consolas" w:cs="Consolas" w:eastAsia="Consolas" w:hAnsi="Consolas"/>
+          <w:sz w:val="19"/>
+          <w:szCs w:val="19"/>
+        </w:rPr>
+        <w:t xml:space="preserve">java: JDK isn't specified for module 'solutions'</w:t>
+      </w:r>
+    </w:p>
+    <w:p>
+      <w:pPr>
+        <w:spacing w:after="120"/>
+      </w:pPr>
+      <w:r>
+        <w:rPr>
+          <w:sz w:val="22"/>
+          <w:szCs w:val="22"/>
+        </w:rPr>
+        <w:t xml:space="preserve">Un module Maven ne définit pas son propre JDK : il hérite de celui du projet. Ce message signifie donc presque toujours qu'aucun JDK n'est déclaré au niveau du projet, et il nomme simplement le premier module qu'IntelliJ a essayé de compiler.</w:t>
+      </w:r>
+    </w:p>
+    <w:p>
+      <w:pPr>
+        <w:spacing w:after="120"/>
+      </w:pPr>
+      <w:r>
+        <w:rPr>
+          <w:rFonts w:ascii="Consolas" w:cs="Consolas" w:eastAsia="Consolas" w:hAnsi="Consolas"/>
+          <w:color w:val="8B2500"/>
+          <w:sz w:val="22"/>
+          <w:szCs w:val="22"/>
+        </w:rPr>
+        <w:t xml:space="preserve">File → Project Structure → Project</w:t>
+      </w:r>
+      <w:r>
+        <w:rPr>
+          <w:sz w:val="22"/>
+          <w:szCs w:val="22"/>
+        </w:rPr>
+        <w:t xml:space="preserve">, champ SDK : choisissez un JDK 21. S'il n'y en a aucun dans la liste, voir </w:t>
+      </w:r>
+      <w:hyperlink w:history="1" w:anchor="IDE_5">
+        <w:r>
+          <w:rPr>
+            <w:rFonts w:ascii="Consolas" w:cs="Consolas" w:eastAsia="Consolas" w:hAnsi="Consolas"/>
+            <w:color w:val="0563C1"/>
+            <w:sz w:val="22"/>
+            <w:szCs w:val="22"/>
+          </w:rPr>
+          <w:t xml:space="preserve">IDE.5</w:t>
+        </w:r>
+      </w:hyperlink>
+      <w:r>
+        <w:rPr>
+          <w:sz w:val="22"/>
+          <w:szCs w:val="22"/>
+        </w:rPr>
+        <w:t xml:space="preserve">.</w:t>
+      </w:r>
+    </w:p>
+    <w:p>
+      <w:pPr>
+        <w:spacing w:after="120"/>
+      </w:pPr>
+      <w:r>
+        <w:rPr>
+          <w:sz w:val="22"/>
+          <w:szCs w:val="22"/>
+        </w:rPr>
+        <w:t xml:space="preserve">Si le SDK du projet est correct et que le message persiste, vérifiez le module lui-même : </w:t>
+      </w:r>
+      <w:r>
+        <w:rPr>
+          <w:rFonts w:ascii="Consolas" w:cs="Consolas" w:eastAsia="Consolas" w:hAnsi="Consolas"/>
+          <w:color w:val="8B2500"/>
+          <w:sz w:val="22"/>
+          <w:szCs w:val="22"/>
+        </w:rPr>
+        <w:t xml:space="preserve">Project Structure → Modules</w:t>
+      </w:r>
+      <w:r>
+        <w:rPr>
+          <w:sz w:val="22"/>
+          <w:szCs w:val="22"/>
+        </w:rPr>
+        <w:t xml:space="preserve">, onglet </w:t>
+      </w:r>
+      <w:r>
+        <w:rPr>
+          <w:rFonts w:ascii="Consolas" w:cs="Consolas" w:eastAsia="Consolas" w:hAnsi="Consolas"/>
+          <w:color w:val="8B2500"/>
+          <w:sz w:val="22"/>
+          <w:szCs w:val="22"/>
+        </w:rPr>
+        <w:t xml:space="preserve">Dependencies</w:t>
+      </w:r>
+      <w:r>
+        <w:rPr>
+          <w:sz w:val="22"/>
+          <w:szCs w:val="22"/>
+        </w:rPr>
+        <w:t xml:space="preserve">, champ </w:t>
+      </w:r>
+      <w:r>
+        <w:rPr>
+          <w:rFonts w:ascii="Consolas" w:cs="Consolas" w:eastAsia="Consolas" w:hAnsi="Consolas"/>
+          <w:color w:val="8B2500"/>
+          <w:sz w:val="22"/>
+          <w:szCs w:val="22"/>
+        </w:rPr>
+        <w:t xml:space="preserve">Module SDK</w:t>
+      </w:r>
+      <w:r>
+        <w:rPr>
+          <w:sz w:val="22"/>
+          <w:szCs w:val="22"/>
+        </w:rPr>
+        <w:t xml:space="preserve">. Il doit indiquer « Project SDK » et non un JDK nommé.</w:t>
+      </w:r>
+    </w:p>
+    <w:p>
+      <w:pPr>
+        <w:spacing w:after="120"/>
+      </w:pPr>
+      <w:r>
+        <w:rPr>
+          <w:sz w:val="22"/>
+          <w:szCs w:val="22"/>
+        </w:rPr>
+        <w:t xml:space="preserve">En dernier recours, fermez le projet, supprimez le dossier </w:t>
+      </w:r>
+      <w:r>
+        <w:rPr>
+          <w:rFonts w:ascii="Consolas" w:cs="Consolas" w:eastAsia="Consolas" w:hAnsi="Consolas"/>
+          <w:color w:val="8B2500"/>
+          <w:sz w:val="22"/>
+          <w:szCs w:val="22"/>
+        </w:rPr>
+        <w:t xml:space="preserve">.idea</w:t>
+      </w:r>
+      <w:r>
+        <w:rPr>
+          <w:sz w:val="22"/>
+          <w:szCs w:val="22"/>
+        </w:rPr>
+        <w:t xml:space="preserve"> et les fichiers </w:t>
+      </w:r>
+      <w:r>
+        <w:rPr>
+          <w:rFonts w:ascii="Consolas" w:cs="Consolas" w:eastAsia="Consolas" w:hAnsi="Consolas"/>
+          <w:color w:val="8B2500"/>
+          <w:sz w:val="22"/>
+          <w:szCs w:val="22"/>
+        </w:rPr>
+        <w:t xml:space="preserve">.iml</w:t>
+      </w:r>
+      <w:r>
+        <w:rPr>
+          <w:sz w:val="22"/>
+          <w:szCs w:val="22"/>
+        </w:rPr>
+        <w:t xml:space="preserve">, puis rouvrez par le </w:t>
+      </w:r>
+      <w:r>
+        <w:rPr>
+          <w:rFonts w:ascii="Consolas" w:cs="Consolas" w:eastAsia="Consolas" w:hAnsi="Consolas"/>
+          <w:color w:val="8B2500"/>
+          <w:sz w:val="22"/>
+          <w:szCs w:val="22"/>
+        </w:rPr>
+        <w:t xml:space="preserve">pom.xml</w:t>
+      </w:r>
+      <w:r>
+        <w:rPr>
+          <w:sz w:val="22"/>
+          <w:szCs w:val="22"/>
+        </w:rPr>
+        <w:t xml:space="preserve">. Vous ne perdez rien : ce dossier ne contient que des préférences d'affichage.</w:t>
+      </w:r>
+    </w:p>
+    <w:p>
+      <w:pPr>
+        <w:pStyle w:val="Heading2"/>
+        <w:keepNext/>
+        <w:spacing w:after="120" w:before="300"/>
+      </w:pPr>
+      <w:bookmarkStart w:name="ERR_2" w:id="1"/>
+      <w:r>
+        <w:rPr>
+          <w:b/>
+          <w:bCs/>
+          <w:color w:val="1F4E79"/>
+          <w:sz w:val="25"/>
+          <w:szCs w:val="25"/>
+        </w:rPr>
+        <w:t xml:space="preserve">ERR.2 — Cannot resolve symbol</w:t>
+      </w:r>
+      <w:bookmarkEnd w:id="1"/>
+    </w:p>
+    <w:p>
+      <w:pPr>
+        <w:keepLines/>
+        <w:shd w:fill="F2F2F2" w:val="clear"/>
+        <w:spacing w:after="0" w:before="100"/>
+        <w:ind w:left="220"/>
+      </w:pPr>
+      <w:r>
+        <w:rPr>
+          <w:rFonts w:ascii="Consolas" w:cs="Consolas" w:eastAsia="Consolas" w:hAnsi="Consolas"/>
+          <w:sz w:val="19"/>
+          <w:szCs w:val="19"/>
+        </w:rPr>
+        <w:t xml:space="preserve">java: cannot find symbol</w:t>
+      </w:r>
+    </w:p>
+    <w:p>
+      <w:pPr>
+        <w:keepLines/>
+        <w:shd w:fill="F2F2F2" w:val="clear"/>
+        <w:spacing w:after="0" w:before="0"/>
+        <w:ind w:left="220"/>
+      </w:pPr>
+      <w:r>
+        <w:rPr>
+          <w:rFonts w:ascii="Consolas" w:cs="Consolas" w:eastAsia="Consolas" w:hAnsi="Consolas"/>
+          <w:sz w:val="19"/>
+          <w:szCs w:val="19"/>
+        </w:rPr>
+        <w:t xml:space="preserve">  symbol:   class Test</w:t>
+      </w:r>
+    </w:p>
+    <w:p>
+      <w:pPr>
+        <w:keepLines/>
+        <w:shd w:fill="F2F2F2" w:val="clear"/>
+        <w:spacing w:after="160" w:before="0"/>
+        <w:ind w:left="220"/>
+      </w:pPr>
+      <w:r>
+        <w:rPr>
+          <w:rFonts w:ascii="Consolas" w:cs="Consolas" w:eastAsia="Consolas" w:hAnsi="Consolas"/>
+          <w:sz w:val="19"/>
+          <w:szCs w:val="19"/>
+        </w:rPr>
+        <w:t xml:space="preserve">  location: package org.junit.jupiter.api</w:t>
+      </w:r>
+    </w:p>
+    <w:p>
+      <w:pPr>
+        <w:spacing w:after="120"/>
+      </w:pPr>
+      <w:r>
+        <w:rPr>
+          <w:sz w:val="22"/>
+          <w:szCs w:val="22"/>
+        </w:rPr>
+        <w:t xml:space="preserve">Une classe venant d'une bibliothèque est introuvable. Le plus souvent, IntelliJ n'a pas encore chargé ce que déclare le pom.xml — après un premier chargement interrompu, ou après avoir déplié une nouvelle archive dans le projet.</w:t>
+      </w:r>
+    </w:p>
+    <w:p>
+      <w:pPr>
+        <w:spacing w:after="120"/>
+      </w:pPr>
+      <w:r>
+        <w:rPr>
+          <w:sz w:val="22"/>
+          <w:szCs w:val="22"/>
+        </w:rPr>
+        <w:t xml:space="preserve">Ouvrez la fenêtre Maven et cliquez sur le bouton de rechargement. Voir </w:t>
+      </w:r>
+      <w:hyperlink w:history="1" w:anchor="IDE_9">
+        <w:r>
+          <w:rPr>
+            <w:rFonts w:ascii="Consolas" w:cs="Consolas" w:eastAsia="Consolas" w:hAnsi="Consolas"/>
+            <w:color w:val="0563C1"/>
+            <w:sz w:val="22"/>
+            <w:szCs w:val="22"/>
+          </w:rPr>
+          <w:t xml:space="preserve">IDE.9</w:t>
+        </w:r>
+      </w:hyperlink>
+      <w:r>
+        <w:rPr>
+          <w:sz w:val="22"/>
+          <w:szCs w:val="22"/>
+        </w:rPr>
+        <w:t xml:space="preserve">. Si le téléchargement échoue, vérifiez votre connexion : Maven va chercher les bibliothèques sur Internet à la première utilisation.</w:t>
+      </w:r>
+    </w:p>
+    <w:p>
+      <w:pPr>
+        <w:pStyle w:val="Heading2"/>
+        <w:keepNext/>
+        <w:spacing w:after="120" w:before="300"/>
+      </w:pPr>
+      <w:bookmarkStart w:name="ERR_3" w:id="1"/>
+      <w:r>
+        <w:rPr>
+          <w:b/>
+          <w:bCs/>
+          <w:color w:val="1F4E79"/>
+          <w:sz w:val="25"/>
+          <w:szCs w:val="25"/>
+        </w:rPr>
+        <w:t xml:space="preserve">ERR.3 — Tout est rouge sans raison</w:t>
+      </w:r>
+      <w:bookmarkEnd w:id="1"/>
+    </w:p>
+    <w:p>
+      <w:pPr>
+        <w:spacing w:after="120"/>
+      </w:pPr>
+      <w:r>
+        <w:rPr>
+          <w:sz w:val="22"/>
+          <w:szCs w:val="22"/>
+        </w:rPr>
+        <w:t xml:space="preserve">Des dizaines de classes soulignées en rouge alors que le code n'a pas changé, souvent après une mise à jour d'IntelliJ ou l'ajout de fichiers dans le projet. Les index de résolution sont désynchronisés.</w:t>
+      </w:r>
+    </w:p>
+    <w:p>
+      <w:pPr>
+        <w:spacing w:after="120"/>
+      </w:pPr>
+      <w:r>
+        <w:rPr>
+          <w:rFonts w:ascii="Consolas" w:cs="Consolas" w:eastAsia="Consolas" w:hAnsi="Consolas"/>
+          <w:color w:val="8B2500"/>
+          <w:sz w:val="22"/>
+          <w:szCs w:val="22"/>
+        </w:rPr>
+        <w:t xml:space="preserve">File → Invalidate Caches… → Invalidate and Restart</w:t>
+      </w:r>
+      <w:r>
+        <w:rPr>
+          <w:sz w:val="22"/>
+          <w:szCs w:val="22"/>
+        </w:rPr>
+        <w:t xml:space="preserve">. IntelliJ reconstruit ses index au redémarrage, ce qui prend une minute. Rien n'est perdu : ni votre code, ni vos réglages.</w:t>
+      </w:r>
+    </w:p>
+    <w:p>
+      <w:pPr>
+        <w:pStyle w:val="Heading2"/>
+        <w:keepNext/>
+        <w:spacing w:after="120" w:before="300"/>
+      </w:pPr>
+      <w:bookmarkStart w:name="ERR_4" w:id="1"/>
+      <w:r>
+        <w:rPr>
+          <w:b/>
+          <w:bCs/>
+          <w:color w:val="1F4E79"/>
+          <w:sz w:val="25"/>
+          <w:szCs w:val="25"/>
+        </w:rPr>
+        <w:t xml:space="preserve">ERR.4 — Pas de flèche verte sur une classe de test</w:t>
+      </w:r>
+      <w:bookmarkEnd w:id="1"/>
+    </w:p>
+    <w:p>
+      <w:pPr>
+        <w:spacing w:after="120"/>
+      </w:pPr>
+      <w:r>
+        <w:rPr>
+          <w:sz w:val="22"/>
+          <w:szCs w:val="22"/>
+        </w:rPr>
+        <w:t xml:space="preserve">Trois causes possibles, dans l'ordre de fréquence.</w:t>
+      </w:r>
+    </w:p>
+    <w:p>
+      <w:pPr>
+        <w:pStyle w:val="ListParagraph"/>
+        <w:numPr>
+          <w:ilvl w:val="0"/>
+          <w:numId w:val="2"/>
+        </w:numPr>
+        <w:spacing w:after="60"/>
+      </w:pPr>
+      <w:r>
+        <w:rPr>
+          <w:sz w:val="22"/>
+          <w:szCs w:val="22"/>
+        </w:rPr>
+        <w:t xml:space="preserve">Le fichier n'est pas sous </w:t>
+      </w:r>
+      <w:r>
+        <w:rPr>
+          <w:rFonts w:ascii="Consolas" w:cs="Consolas" w:eastAsia="Consolas" w:hAnsi="Consolas"/>
+          <w:color w:val="8B2500"/>
+          <w:sz w:val="22"/>
+          <w:szCs w:val="22"/>
+        </w:rPr>
+        <w:t xml:space="preserve">src/test/java</w:t>
+      </w:r>
+      <w:r>
+        <w:rPr>
+          <w:sz w:val="22"/>
+          <w:szCs w:val="22"/>
+        </w:rPr>
+        <w:t xml:space="preserve"> mais sous </w:t>
+      </w:r>
+      <w:r>
+        <w:rPr>
+          <w:rFonts w:ascii="Consolas" w:cs="Consolas" w:eastAsia="Consolas" w:hAnsi="Consolas"/>
+          <w:color w:val="8B2500"/>
+          <w:sz w:val="22"/>
+          <w:szCs w:val="22"/>
+        </w:rPr>
+        <w:t xml:space="preserve">src/main/java</w:t>
+      </w:r>
+      <w:r>
+        <w:rPr>
+          <w:sz w:val="22"/>
+          <w:szCs w:val="22"/>
+        </w:rPr>
+        <w:t xml:space="preserve">. Déplacez-le avec </w:t>
+      </w:r>
+      <w:r>
+        <w:rPr>
+          <w:rFonts w:ascii="Consolas" w:cs="Consolas" w:eastAsia="Consolas" w:hAnsi="Consolas"/>
+          <w:color w:val="8B2500"/>
+          <w:sz w:val="22"/>
+          <w:szCs w:val="22"/>
+        </w:rPr>
+        <w:t xml:space="preserve">F6</w:t>
+      </w:r>
+      <w:r>
+        <w:rPr>
+          <w:sz w:val="22"/>
+          <w:szCs w:val="22"/>
+        </w:rPr>
+        <w:t xml:space="preserve">.</w:t>
+      </w:r>
+    </w:p>
+    <w:p>
+      <w:pPr>
+        <w:pStyle w:val="ListParagraph"/>
+        <w:numPr>
+          <w:ilvl w:val="0"/>
+          <w:numId w:val="2"/>
+        </w:numPr>
+        <w:spacing w:after="60"/>
+      </w:pPr>
+      <w:r>
+        <w:rPr>
+          <w:sz w:val="22"/>
+          <w:szCs w:val="22"/>
+        </w:rPr>
+        <w:t xml:space="preserve">La déclaration de </w:t>
+      </w:r>
+      <w:r>
+        <w:rPr>
+          <w:rFonts w:ascii="Consolas" w:cs="Consolas" w:eastAsia="Consolas" w:hAnsi="Consolas"/>
+          <w:color w:val="8B2500"/>
+          <w:sz w:val="22"/>
+          <w:szCs w:val="22"/>
+        </w:rPr>
+        <w:t xml:space="preserve">package</w:t>
+      </w:r>
+      <w:r>
+        <w:rPr>
+          <w:sz w:val="22"/>
+          <w:szCs w:val="22"/>
+        </w:rPr>
+        <w:t xml:space="preserve"> ne correspond pas à l'emplacement du fichier dans l'arborescence. Les deux doivent coïncider exactement.</w:t>
+      </w:r>
+    </w:p>
+    <w:p>
+      <w:pPr>
+        <w:pStyle w:val="ListParagraph"/>
+        <w:numPr>
+          <w:ilvl w:val="0"/>
+          <w:numId w:val="2"/>
+        </w:numPr>
+        <w:spacing w:after="60"/>
+      </w:pPr>
+      <w:r>
+        <w:rPr>
+          <w:sz w:val="22"/>
+          <w:szCs w:val="22"/>
+        </w:rPr>
+        <w:t xml:space="preserve">JUnit n'est pas chargé : voir </w:t>
+      </w:r>
+      <w:hyperlink w:history="1" w:anchor="ERR_2">
+        <w:r>
+          <w:rPr>
+            <w:rFonts w:ascii="Consolas" w:cs="Consolas" w:eastAsia="Consolas" w:hAnsi="Consolas"/>
+            <w:color w:val="0563C1"/>
+            <w:sz w:val="22"/>
+            <w:szCs w:val="22"/>
+          </w:rPr>
+          <w:t xml:space="preserve">ERR.2</w:t>
+        </w:r>
+      </w:hyperlink>
+      <w:r>
+        <w:rPr>
+          <w:sz w:val="22"/>
+          <w:szCs w:val="22"/>
+        </w:rPr>
+        <w:t xml:space="preserve">.</w:t>
+      </w:r>
+    </w:p>
+    <w:p>
+      <w:pPr>
+        <w:pStyle w:val="Heading2"/>
+        <w:keepNext/>
+        <w:spacing w:after="120" w:before="300"/>
+      </w:pPr>
+      <w:bookmarkStart w:name="ERR_5" w:id="1"/>
+      <w:r>
+        <w:rPr>
+          <w:b/>
+          <w:bCs/>
+          <w:color w:val="1F4E79"/>
+          <w:sz w:val="25"/>
+          <w:szCs w:val="25"/>
+        </w:rPr>
+        <w:t xml:space="preserve">ERR.5 — Deux classes du même nom</w:t>
+      </w:r>
+      <w:bookmarkEnd w:id="1"/>
+    </w:p>
+    <w:p>
+      <w:pPr>
+        <w:spacing w:after="120"/>
+      </w:pPr>
+      <w:r>
+        <w:rPr>
+          <w:sz w:val="22"/>
+          <w:szCs w:val="22"/>
+        </w:rPr>
+        <w:t xml:space="preserve">Des erreurs incompréhensibles après une réorganisation : une méthode existe pourtant, un import semble correct mais ne l'est pas. Presque toujours, une classe a été copiée-collée dans un nouveau package sans être supprimée de l'ancien. Vous en modifiez une, le programme utilise l'autre.</w:t>
+      </w:r>
+    </w:p>
+    <w:p>
+      <w:pPr>
+        <w:spacing w:after="120"/>
+      </w:pPr>
+      <w:r>
+        <w:rPr>
+          <w:sz w:val="22"/>
+          <w:szCs w:val="22"/>
+        </w:rPr>
+        <w:t xml:space="preserve">Cherchez le nom de la classe avec </w:t>
+      </w:r>
+      <w:r>
+        <w:rPr>
+          <w:rFonts w:ascii="Consolas" w:cs="Consolas" w:eastAsia="Consolas" w:hAnsi="Consolas"/>
+          <w:color w:val="8B2500"/>
+          <w:sz w:val="22"/>
+          <w:szCs w:val="22"/>
+        </w:rPr>
+        <w:t xml:space="preserve">Maj Maj</w:t>
+      </w:r>
+      <w:r>
+        <w:rPr>
+          <w:sz w:val="22"/>
+          <w:szCs w:val="22"/>
+        </w:rPr>
+        <w:t xml:space="preserve"> : si deux résultats apparaissent dans deux packages différents, vous tenez le coupable. Supprimez celle qui est à la mauvaise place, et à l'avenir déplacez avec </w:t>
+      </w:r>
+      <w:r>
+        <w:rPr>
+          <w:rFonts w:ascii="Consolas" w:cs="Consolas" w:eastAsia="Consolas" w:hAnsi="Consolas"/>
+          <w:color w:val="8B2500"/>
+          <w:sz w:val="22"/>
+          <w:szCs w:val="22"/>
+        </w:rPr>
+        <w:t xml:space="preserve">F6</w:t>
+      </w:r>
+      <w:r>
+        <w:rPr>
+          <w:sz w:val="22"/>
+          <w:szCs w:val="22"/>
+        </w:rPr>
+        <w:t xml:space="preserve"> au lieu de copier — voir </w:t>
+      </w:r>
+      <w:hyperlink w:history="1" w:anchor="IDE_21">
+        <w:r>
+          <w:rPr>
+            <w:rFonts w:ascii="Consolas" w:cs="Consolas" w:eastAsia="Consolas" w:hAnsi="Consolas"/>
+            <w:color w:val="0563C1"/>
+            <w:sz w:val="22"/>
+            <w:szCs w:val="22"/>
+          </w:rPr>
+          <w:t xml:space="preserve">IDE.21</w:t>
+        </w:r>
+      </w:hyperlink>
+      <w:r>
+        <w:rPr>
+          <w:sz w:val="22"/>
+          <w:szCs w:val="22"/>
+        </w:rPr>
+        <w:t xml:space="preserve">.</w:t>
+      </w:r>
+    </w:p>
+    <w:p>
+      <w:pPr>
+        <w:pStyle w:val="Heading2"/>
+        <w:keepNext/>
+        <w:spacing w:after="120" w:before="300"/>
+      </w:pPr>
+      <w:bookmarkStart w:name="ERR_6" w:id="1"/>
+      <w:r>
+        <w:rPr>
+          <w:b/>
+          <w:bCs/>
+          <w:color w:val="1F4E79"/>
+          <w:sz w:val="25"/>
+          <w:szCs w:val="25"/>
+        </w:rPr>
+        <w:t xml:space="preserve">ERR.6 — Lancer malgré une erreur de compilation</w:t>
+      </w:r>
+      <w:bookmarkEnd w:id="1"/>
+    </w:p>
+    <w:p>
+      <w:pPr>
+        <w:spacing w:after="120"/>
+      </w:pPr>
+      <w:r>
+        <w:rPr>
+          <w:sz w:val="22"/>
+          <w:szCs w:val="22"/>
+        </w:rPr>
+        <w:t xml:space="preserve">Par défaut, IntelliJ compile tout le module avant de lancer quoi que ce soit. Une erreur dans une classe empêche donc de lancer une autre classe, même sans rapport avec elle.</w:t>
+      </w:r>
+    </w:p>
+    <w:p>
+      <w:pPr>
+        <w:spacing w:after="120"/>
+      </w:pPr>
+      <w:r>
+        <w:rPr>
+          <w:sz w:val="22"/>
+          <w:szCs w:val="22"/>
+        </w:rPr>
+        <w:t xml:space="preserve">Il est possible de contourner ce comportement : </w:t>
+      </w:r>
+      <w:r>
+        <w:rPr>
+          <w:rFonts w:ascii="Consolas" w:cs="Consolas" w:eastAsia="Consolas" w:hAnsi="Consolas"/>
+          <w:color w:val="8B2500"/>
+          <w:sz w:val="22"/>
+          <w:szCs w:val="22"/>
+        </w:rPr>
+        <w:t xml:space="preserve">Settings → Build, Execution, Deployment → Compiler → Java Compiler</w:t>
+      </w:r>
+      <w:r>
+        <w:rPr>
+          <w:sz w:val="22"/>
+          <w:szCs w:val="22"/>
+        </w:rPr>
+        <w:t xml:space="preserve">, basculez </w:t>
+      </w:r>
+      <w:r>
+        <w:rPr>
+          <w:rFonts w:ascii="Consolas" w:cs="Consolas" w:eastAsia="Consolas" w:hAnsi="Consolas"/>
+          <w:color w:val="8B2500"/>
+          <w:sz w:val="22"/>
+          <w:szCs w:val="22"/>
+        </w:rPr>
+        <w:t xml:space="preserve">Use compiler</w:t>
+      </w:r>
+      <w:r>
+        <w:rPr>
+          <w:sz w:val="22"/>
+          <w:szCs w:val="22"/>
+        </w:rPr>
+        <w:t xml:space="preserve"> sur </w:t>
+      </w:r>
+      <w:r>
+        <w:rPr>
+          <w:rFonts w:ascii="Consolas" w:cs="Consolas" w:eastAsia="Consolas" w:hAnsi="Consolas"/>
+          <w:color w:val="8B2500"/>
+          <w:sz w:val="22"/>
+          <w:szCs w:val="22"/>
+        </w:rPr>
+        <w:t xml:space="preserve">Eclipse</w:t>
+      </w:r>
+      <w:r>
+        <w:rPr>
+          <w:sz w:val="22"/>
+          <w:szCs w:val="22"/>
+        </w:rPr>
+        <w:t xml:space="preserve">, puis cochez </w:t>
+      </w:r>
+      <w:r>
+        <w:rPr>
+          <w:rFonts w:ascii="Consolas" w:cs="Consolas" w:eastAsia="Consolas" w:hAnsi="Consolas"/>
+          <w:color w:val="8B2500"/>
+          <w:sz w:val="22"/>
+          <w:szCs w:val="22"/>
+        </w:rPr>
+        <w:t xml:space="preserve">Proceed on errors</w:t>
+      </w:r>
+      <w:r>
+        <w:rPr>
+          <w:sz w:val="22"/>
+          <w:szCs w:val="22"/>
+        </w:rPr>
+        <w:t xml:space="preserve">. L'option n'apparaît qu'après avoir changé de compilateur.</w:t>
+      </w:r>
+    </w:p>
+    <w:p>
+      <w:pPr>
+        <w:keepNext/>
+        <w:spacing w:after="40" w:before="140"/>
+        <w:jc w:val="center"/>
+      </w:pPr>
+      <w:r>
+        <w:drawing>
+          <wp:inline distT="0" distB="0" distL="0" distR="0">
+            <wp:extent cx="4943475" cy="3810000"/>
+            <wp:effectExtent t="0" r="0" b="0" l="0"/>
+            <wp:docPr id="1" name="" descr="" title=""/>
+            <wp:cNvGraphicFramePr>
+              <a:graphicFrameLocks xmlns:a="http://schemas.openxmlformats.org/drawingml/2006/main" noChangeAspect="1"/>
+            </wp:cNvGraphicFramePr>
+            <a:graphic xmlns:a="http://schemas.openxmlformats.org/drawingml/2006/main">
+              <a:graphicData uri="http://schemas.openxmlformats.org/drawingml/2006/picture">
+                <pic:pic xmlns:pic="http://schemas.openxmlformats.org/drawingml/2006/picture">
+                  <pic:nvPicPr>
+                    <pic:cNvPr id="0" name="" descr=""/>
+                    <pic:cNvPicPr>
+                      <a:picLocks noChangeAspect="1" noChangeArrowheads="1"/>
+                    </pic:cNvPicPr>
+                  </pic:nvPicPr>
+                  <pic:blipFill>
+                    <a:blip r:embed="rId28" cstate="none"/>
+                    <a:srcRect/>
+                    <a:stretch>
+                      <a:fillRect/>
+                    </a:stretch>
+                  </pic:blipFill>
+                  <pic:spPr bwMode="auto">
+                    <a:xfrm>
+                      <a:off x="0" y="0"/>
                       <a:ext cx="4943475" cy="3810000"/>
                     </a:xfrm>
                     <a:prstGeom prst="rect">
@@ -13822,7 +14550,7 @@
                 <w:sz w:val="22"/>
                 <w:szCs w:val="22"/>
               </w:rPr>
-              <w:t xml:space="preserve">Le compilateur Eclipse embarqué dans IntelliJ 2024.3 ne gère Java que jusqu'à la version 18. Ce cours utilise Java 21 : dès que vous basculez dessus, plus rien ne compile, et vous obtenez le message décrit en ERR.8.</w:t>
+              <w:t xml:space="preserve">Le compilateur Eclipse embarqué dans IntelliJ 2024.3 ne gère Java que jusqu'à la version 18. Ce cours utilise Java 21 : dès que vous basculez dessus, plus rien ne compile, et vous obtenez le message décrit en ERR.8.</w:t>
             </w:r>
           </w:p>
           <w:p>
@@ -13834,7 +14562,7 @@
                 <w:sz w:val="22"/>
                 <w:szCs w:val="22"/>
               </w:rPr>
-              <w:t xml:space="preserve">L'option est donc inutilisable ici, et c'est aussi bien : changer de compilateur pour contourner une erreur de compilation est un pis-aller. Le bon réflexe reste de lire le message et de corriger.</w:t>
+              <w:t xml:space="preserve">L'option est donc inutilisable ici, et c'est aussi bien : changer de compilateur pour contourner une erreur de compilation est un pis-aller. Le bon réflexe reste de lire le message et de corriger.</w:t>
             </w:r>
           </w:p>
           <w:p>
@@ -13846,7 +14574,7 @@
                 <w:sz w:val="22"/>
                 <w:szCs w:val="22"/>
               </w:rPr>
-              <w:t xml:space="preserve">Dans le projet du cours, le problème que l'option prétend résoudre ne se pose de toute façon pas : les squelettes fournis compilent toujours, puisqu'ils lèvent une exception au lieu d'être vides.</w:t>
+              <w:t xml:space="preserve">Dans le projet du cours, le problème que l'option prétend résoudre ne se pose de toute façon pas : les squelettes fournis compilent toujours, puisqu'ils lèvent une exception au lieu d'être vides.</w:t>
             </w:r>
           </w:p>
         </w:tc>
@@ -14004,7 +14732,7 @@
           <w:sz w:val="25"/>
           <w:szCs w:val="25"/>
         </w:rPr>
-        <w:t xml:space="preserve">ERR.8 — source level should be in ... : 21</w:t>
+        <w:t xml:space="preserve">ERR.8 — source level should be in ... : 21</w:t>
       </w:r>
       <w:bookmarkEnd w:id="1"/>
     </w:p>
@@ -14079,7 +14807,7 @@
           <w:sz w:val="22"/>
           <w:szCs w:val="22"/>
         </w:rPr>
-        <w:t xml:space="preserve">La cause est presque toujours la même : </w:t>
+        <w:t xml:space="preserve">La cause est presque toujours la même : </w:t>
       </w:r>
       <w:r>
         <w:rPr>
@@ -14150,7 +14878,7 @@
           <w:sz w:val="22"/>
           <w:szCs w:val="22"/>
         </w:rPr>
-        <w:t xml:space="preserve"> : remettez-le sur </w:t>
+        <w:t xml:space="preserve"> : remettez-le sur </w:t>
       </w:r>
       <w:r>
         <w:rPr>
@@ -14234,7 +14962,7 @@
                 <w:sz w:val="22"/>
                 <w:szCs w:val="22"/>
               </w:rPr>
-              <w:t xml:space="preserve">La liste des versions acceptées est signée : elle s'arrête à 18, ce qui ne correspond à aucun JDK que vous auriez installé. C'est le genre de détail qui permet d'identifier l'outil fautif sans chercher plus loin.</w:t>
+              <w:t xml:space="preserve">La liste des versions acceptées est signée : elle s'arrête à 18, ce qui ne correspond à aucun JDK que vous auriez installé. C'est le genre de détail qui permet d'identifier l'outil fautif sans chercher plus loin.</w:t>
             </w:r>
           </w:p>
           <w:p>
@@ -14246,7 +14974,7 @@
                 <w:sz w:val="22"/>
                 <w:szCs w:val="22"/>
               </w:rPr>
-              <w:t xml:space="preserve">À l'inverse, javac dirait quelque chose comme « release version 21 not supported », en nommant la version qu'il connaît.</w:t>
+              <w:t xml:space="preserve">À l'inverse, javac dirait quelque chose comme « release version 21 not supported », en nommant la version qu'il connaît.</w:t>
             </w:r>
           </w:p>
         </w:tc>
@@ -14517,7 +15245,7 @@
           <w:sz w:val="22"/>
           <w:szCs w:val="22"/>
         </w:rPr>
-        <w:t xml:space="preserve"> — puis recopiez le seul fichier concerné. Vous perdez ce que vous aviez écrit dans ce fichier-là, rien d'autre : </w:t>
+        <w:t xml:space="preserve"> — puis recopiez le seul fichier concerné. Vous perdez ce que vous aviez écrit dans ce fichier-là, rien d'autre : </w:t>
       </w:r>
       <w:r>
         <w:rPr>
@@ -14698,7 +15426,7 @@
                 <w:sz w:val="22"/>
                 <w:szCs w:val="22"/>
               </w:rPr>
-              <w:t xml:space="preserve">Ne cherchez surtout pas à obtenir le même effet en changeant de compilateur : voir ERR.6, qui explique pourquoi cela ne marche pas dans ce projet.</w:t>
+              <w:t xml:space="preserve">Ne cherchez surtout pas à obtenir le même effet en changeant de compilateur : voir ERR.6, qui explique pourquoi cela ne marche pas dans ce projet.</w:t>
             </w:r>
           </w:p>
         </w:tc>
@@ -14758,7 +15486,7 @@
           <w:sz w:val="22"/>
           <w:szCs w:val="22"/>
         </w:rPr>
-        <w:t xml:space="preserve"> au lieu d'être vides : un squelette compile dès le premier instant, avant même que vous n'ayez écrit quoi que ce soit.</w:t>
+        <w:t xml:space="preserve"> au lieu d'être vides : un squelette compile dès le premier instant, avant même que vous n'ayez écrit quoi que ce soit.</w:t>
       </w:r>
     </w:p>
     <w:p>
@@ -14876,7 +15604,7 @@
           <w:sz w:val="22"/>
           <w:szCs w:val="22"/>
         </w:rPr>
-        <w:t xml:space="preserve">IntelliJ le sait, et il l'annonce parfois lui-même dans une bulle au démarrage :</w:t>
+        <w:t xml:space="preserve">IntelliJ le sait, et il l'annonce parfois lui-même dans une bulle au démarrage :</w:t>
       </w:r>
     </w:p>
     <w:p>
@@ -14951,7 +15679,7 @@
           <w:sz w:val="22"/>
           <w:szCs w:val="22"/>
         </w:rPr>
-        <w:t xml:space="preserve">Forcez la relecture : </w:t>
+        <w:t xml:space="preserve">Forcez la relecture : </w:t>
       </w:r>
       <w:r>
         <w:rPr>
@@ -15159,10 +15887,9 @@
       </w:r>
     </w:p>
     <w:sectPr>
-      <w:footerReference w:type="default" r:id="rId27"/>
       <w:pgSz w:w="11906" w:h="16838" w:orient="portrait"/>
       <w:pgMar w:top="1440" w:right="1440" w:bottom="1440" w:left="1440" w:header="708" w:footer="708" w:gutter="0"/>
-      <w:pgNumType w:start="1"/>
+      <w:pgNumType/>
       <w:docGrid w:linePitch="360"/>
     </w:sectPr>
   </w:body>
@@ -15208,67 +15935,6 @@
     </w:p>
   </w:endnote>
 </w:endnotes>
-</file>
-
-<file path=word/footer1.xml><?xml version="1.0" encoding="utf-8"?>
-<w:ftr xmlns:w="http://schemas.openxmlformats.org/wordprocessingml/2006/main">
-  <w:p>
-    <w:pPr>
-      <w:jc w:val="center"/>
-      <w:rPr>
-        <w:sz w:val="18"/>
-        <w:szCs w:val="18"/>
-        <w:color w:val="595959"/>
-      </w:rPr>
-    </w:pPr>
-    <w:r>
-      <w:rPr>
-        <w:sz w:val="18"/>
-        <w:szCs w:val="18"/>
-        <w:color w:val="595959"/>
-      </w:rPr>
-      <w:t xml:space="preserve">Guide_IntelliJ </w:t>
-    </w:r>
-    <w:r>
-      <w:fldChar w:fldCharType="begin"/>
-    </w:r>
-    <w:r>
-      <w:instrText xml:space="preserve"> PAGE </w:instrText>
-    </w:r>
-    <w:r>
-      <w:fldChar w:fldCharType="separate"/>
-    </w:r>
-    <w:r>
-      <w:t>1</w:t>
-    </w:r>
-    <w:r>
-      <w:fldChar w:fldCharType="end"/>
-    </w:r>
-    <w:r>
-      <w:rPr>
-        <w:sz w:val="18"/>
-        <w:szCs w:val="18"/>
-        <w:color w:val="595959"/>
-      </w:rPr>
-      <w:t xml:space="preserve"> / </w:t>
-    </w:r>
-    <w:r>
-      <w:fldChar w:fldCharType="begin"/>
-    </w:r>
-    <w:r>
-      <w:instrText xml:space="preserve"> SECTIONPAGES </w:instrText>
-    </w:r>
-    <w:r>
-      <w:fldChar w:fldCharType="separate"/>
-    </w:r>
-    <w:r>
-      <w:t>29</w:t>
-    </w:r>
-    <w:r>
-      <w:fldChar w:fldCharType="end"/>
-    </w:r>
-  </w:p>
-</w:ftr>
 </file>
 
 <file path=word/footnotes.xml><?xml version="1.0" encoding="utf-8"?>

</xml_diff>

<commit_message>
Correction finale de FIC_enonces.docxs
</commit_message>
<xml_diff>
--- a/documents/Guide_IntelliJ.docx
+++ b/documents/Guide_IntelliJ.docx
@@ -199,10 +199,11 @@
       <w:hyperlink w:history="1" w:anchor="IDE_17">
         <w:r>
           <w:rPr>
-            <w:rFonts w:ascii="Consolas" w:cs="Consolas" w:eastAsia="Consolas" w:hAnsi="Consolas"/>
+            <w:rFonts w:ascii="Consolas" w:hAnsi="Consolas" w:cs="Consolas"/>
             <w:color w:val="0563C1"/>
-            <w:sz w:val="22"/>
-            <w:szCs w:val="22"/>
+            <w:sz w:val="18"/>
+            <w:szCs w:val="18"/>
+            <w:u w:val="single"/>
           </w:rPr>
           <w:t xml:space="preserve">IDE.17</w:t>
         </w:r>
@@ -485,7 +486,7 @@
             <w:hyperlink w:history="1" w:anchor="IDE_1">
               <w:r>
                 <w:rPr>
-                  <w:rFonts w:ascii="Consolas" w:cs="Consolas" w:eastAsia="Consolas" w:hAnsi="Consolas"/>
+                  <w:rFonts w:ascii="Consolas" w:hAnsi="Consolas" w:cs="Consolas"/>
                   <w:color w:val="0563C1"/>
                   <w:sz w:val="18"/>
                   <w:szCs w:val="18"/>
@@ -540,7 +541,7 @@
             <w:hyperlink w:history="1" w:anchor="IDE_2">
               <w:r>
                 <w:rPr>
-                  <w:rFonts w:ascii="Consolas" w:cs="Consolas" w:eastAsia="Consolas" w:hAnsi="Consolas"/>
+                  <w:rFonts w:ascii="Consolas" w:hAnsi="Consolas" w:cs="Consolas"/>
                   <w:color w:val="0563C1"/>
                   <w:sz w:val="18"/>
                   <w:szCs w:val="18"/>
@@ -595,7 +596,7 @@
             <w:hyperlink w:history="1" w:anchor="IDE_3">
               <w:r>
                 <w:rPr>
-                  <w:rFonts w:ascii="Consolas" w:cs="Consolas" w:eastAsia="Consolas" w:hAnsi="Consolas"/>
+                  <w:rFonts w:ascii="Consolas" w:hAnsi="Consolas" w:cs="Consolas"/>
                   <w:color w:val="0563C1"/>
                   <w:sz w:val="18"/>
                   <w:szCs w:val="18"/>
@@ -711,7 +712,7 @@
             <w:hyperlink w:history="1" w:anchor="IDE_4">
               <w:r>
                 <w:rPr>
-                  <w:rFonts w:ascii="Consolas" w:cs="Consolas" w:eastAsia="Consolas" w:hAnsi="Consolas"/>
+                  <w:rFonts w:ascii="Consolas" w:hAnsi="Consolas" w:cs="Consolas"/>
                   <w:color w:val="0563C1"/>
                   <w:sz w:val="18"/>
                   <w:szCs w:val="18"/>
@@ -766,7 +767,7 @@
             <w:hyperlink w:history="1" w:anchor="IDE_5">
               <w:r>
                 <w:rPr>
-                  <w:rFonts w:ascii="Consolas" w:cs="Consolas" w:eastAsia="Consolas" w:hAnsi="Consolas"/>
+                  <w:rFonts w:ascii="Consolas" w:hAnsi="Consolas" w:cs="Consolas"/>
                   <w:color w:val="0563C1"/>
                   <w:sz w:val="18"/>
                   <w:szCs w:val="18"/>
@@ -821,7 +822,7 @@
             <w:hyperlink w:history="1" w:anchor="IDE_6">
               <w:r>
                 <w:rPr>
-                  <w:rFonts w:ascii="Consolas" w:cs="Consolas" w:eastAsia="Consolas" w:hAnsi="Consolas"/>
+                  <w:rFonts w:ascii="Consolas" w:hAnsi="Consolas" w:cs="Consolas"/>
                   <w:color w:val="0563C1"/>
                   <w:sz w:val="18"/>
                   <w:szCs w:val="18"/>
@@ -937,7 +938,7 @@
             <w:hyperlink w:history="1" w:anchor="IDE_7">
               <w:r>
                 <w:rPr>
-                  <w:rFonts w:ascii="Consolas" w:cs="Consolas" w:eastAsia="Consolas" w:hAnsi="Consolas"/>
+                  <w:rFonts w:ascii="Consolas" w:hAnsi="Consolas" w:cs="Consolas"/>
                   <w:color w:val="0563C1"/>
                   <w:sz w:val="18"/>
                   <w:szCs w:val="18"/>
@@ -992,7 +993,7 @@
             <w:hyperlink w:history="1" w:anchor="IDE_8">
               <w:r>
                 <w:rPr>
-                  <w:rFonts w:ascii="Consolas" w:cs="Consolas" w:eastAsia="Consolas" w:hAnsi="Consolas"/>
+                  <w:rFonts w:ascii="Consolas" w:hAnsi="Consolas" w:cs="Consolas"/>
                   <w:color w:val="0563C1"/>
                   <w:sz w:val="18"/>
                   <w:szCs w:val="18"/>
@@ -1047,7 +1048,7 @@
             <w:hyperlink w:history="1" w:anchor="IDE_9">
               <w:r>
                 <w:rPr>
-                  <w:rFonts w:ascii="Consolas" w:cs="Consolas" w:eastAsia="Consolas" w:hAnsi="Consolas"/>
+                  <w:rFonts w:ascii="Consolas" w:hAnsi="Consolas" w:cs="Consolas"/>
                   <w:color w:val="0563C1"/>
                   <w:sz w:val="18"/>
                   <w:szCs w:val="18"/>
@@ -1102,7 +1103,7 @@
             <w:hyperlink w:history="1" w:anchor="IDE_10">
               <w:r>
                 <w:rPr>
-                  <w:rFonts w:ascii="Consolas" w:cs="Consolas" w:eastAsia="Consolas" w:hAnsi="Consolas"/>
+                  <w:rFonts w:ascii="Consolas" w:hAnsi="Consolas" w:cs="Consolas"/>
                   <w:color w:val="0563C1"/>
                   <w:sz w:val="18"/>
                   <w:szCs w:val="18"/>
@@ -1218,7 +1219,7 @@
             <w:hyperlink w:history="1" w:anchor="IDE_11">
               <w:r>
                 <w:rPr>
-                  <w:rFonts w:ascii="Consolas" w:cs="Consolas" w:eastAsia="Consolas" w:hAnsi="Consolas"/>
+                  <w:rFonts w:ascii="Consolas" w:hAnsi="Consolas" w:cs="Consolas"/>
                   <w:color w:val="0563C1"/>
                   <w:sz w:val="18"/>
                   <w:szCs w:val="18"/>
@@ -1273,7 +1274,7 @@
             <w:hyperlink w:history="1" w:anchor="IDE_12">
               <w:r>
                 <w:rPr>
-                  <w:rFonts w:ascii="Consolas" w:cs="Consolas" w:eastAsia="Consolas" w:hAnsi="Consolas"/>
+                  <w:rFonts w:ascii="Consolas" w:hAnsi="Consolas" w:cs="Consolas"/>
                   <w:color w:val="0563C1"/>
                   <w:sz w:val="18"/>
                   <w:szCs w:val="18"/>
@@ -1328,7 +1329,7 @@
             <w:hyperlink w:history="1" w:anchor="IDE_13">
               <w:r>
                 <w:rPr>
-                  <w:rFonts w:ascii="Consolas" w:cs="Consolas" w:eastAsia="Consolas" w:hAnsi="Consolas"/>
+                  <w:rFonts w:ascii="Consolas" w:hAnsi="Consolas" w:cs="Consolas"/>
                   <w:color w:val="0563C1"/>
                   <w:sz w:val="18"/>
                   <w:szCs w:val="18"/>
@@ -1383,7 +1384,7 @@
             <w:hyperlink w:history="1" w:anchor="IDE_14">
               <w:r>
                 <w:rPr>
-                  <w:rFonts w:ascii="Consolas" w:cs="Consolas" w:eastAsia="Consolas" w:hAnsi="Consolas"/>
+                  <w:rFonts w:ascii="Consolas" w:hAnsi="Consolas" w:cs="Consolas"/>
                   <w:color w:val="0563C1"/>
                   <w:sz w:val="18"/>
                   <w:szCs w:val="18"/>
@@ -1438,7 +1439,7 @@
             <w:hyperlink w:history="1" w:anchor="IDE_15">
               <w:r>
                 <w:rPr>
-                  <w:rFonts w:ascii="Consolas" w:cs="Consolas" w:eastAsia="Consolas" w:hAnsi="Consolas"/>
+                  <w:rFonts w:ascii="Consolas" w:hAnsi="Consolas" w:cs="Consolas"/>
                   <w:color w:val="0563C1"/>
                   <w:sz w:val="18"/>
                   <w:szCs w:val="18"/>
@@ -1554,7 +1555,7 @@
             <w:hyperlink w:history="1" w:anchor="IDE_16">
               <w:r>
                 <w:rPr>
-                  <w:rFonts w:ascii="Consolas" w:cs="Consolas" w:eastAsia="Consolas" w:hAnsi="Consolas"/>
+                  <w:rFonts w:ascii="Consolas" w:hAnsi="Consolas" w:cs="Consolas"/>
                   <w:color w:val="0563C1"/>
                   <w:sz w:val="18"/>
                   <w:szCs w:val="18"/>
@@ -1609,7 +1610,7 @@
             <w:hyperlink w:history="1" w:anchor="IDE_17">
               <w:r>
                 <w:rPr>
-                  <w:rFonts w:ascii="Consolas" w:cs="Consolas" w:eastAsia="Consolas" w:hAnsi="Consolas"/>
+                  <w:rFonts w:ascii="Consolas" w:hAnsi="Consolas" w:cs="Consolas"/>
                   <w:color w:val="0563C1"/>
                   <w:sz w:val="18"/>
                   <w:szCs w:val="18"/>
@@ -1664,7 +1665,7 @@
             <w:hyperlink w:history="1" w:anchor="IDE_18">
               <w:r>
                 <w:rPr>
-                  <w:rFonts w:ascii="Consolas" w:cs="Consolas" w:eastAsia="Consolas" w:hAnsi="Consolas"/>
+                  <w:rFonts w:ascii="Consolas" w:hAnsi="Consolas" w:cs="Consolas"/>
                   <w:color w:val="0563C1"/>
                   <w:sz w:val="18"/>
                   <w:szCs w:val="18"/>
@@ -1719,7 +1720,7 @@
             <w:hyperlink w:history="1" w:anchor="IDE_19">
               <w:r>
                 <w:rPr>
-                  <w:rFonts w:ascii="Consolas" w:cs="Consolas" w:eastAsia="Consolas" w:hAnsi="Consolas"/>
+                  <w:rFonts w:ascii="Consolas" w:hAnsi="Consolas" w:cs="Consolas"/>
                   <w:color w:val="0563C1"/>
                   <w:sz w:val="18"/>
                   <w:szCs w:val="18"/>
@@ -1835,7 +1836,7 @@
             <w:hyperlink w:history="1" w:anchor="IDE_20">
               <w:r>
                 <w:rPr>
-                  <w:rFonts w:ascii="Consolas" w:cs="Consolas" w:eastAsia="Consolas" w:hAnsi="Consolas"/>
+                  <w:rFonts w:ascii="Consolas" w:hAnsi="Consolas" w:cs="Consolas"/>
                   <w:color w:val="0563C1"/>
                   <w:sz w:val="18"/>
                   <w:szCs w:val="18"/>
@@ -1890,7 +1891,7 @@
             <w:hyperlink w:history="1" w:anchor="IDE_21">
               <w:r>
                 <w:rPr>
-                  <w:rFonts w:ascii="Consolas" w:cs="Consolas" w:eastAsia="Consolas" w:hAnsi="Consolas"/>
+                  <w:rFonts w:ascii="Consolas" w:hAnsi="Consolas" w:cs="Consolas"/>
                   <w:color w:val="0563C1"/>
                   <w:sz w:val="18"/>
                   <w:szCs w:val="18"/>
@@ -1945,7 +1946,7 @@
             <w:hyperlink w:history="1" w:anchor="IDE_22">
               <w:r>
                 <w:rPr>
-                  <w:rFonts w:ascii="Consolas" w:cs="Consolas" w:eastAsia="Consolas" w:hAnsi="Consolas"/>
+                  <w:rFonts w:ascii="Consolas" w:hAnsi="Consolas" w:cs="Consolas"/>
                   <w:color w:val="0563C1"/>
                   <w:sz w:val="18"/>
                   <w:szCs w:val="18"/>
@@ -2061,7 +2062,7 @@
             <w:hyperlink w:history="1" w:anchor="IDE_23">
               <w:r>
                 <w:rPr>
-                  <w:rFonts w:ascii="Consolas" w:cs="Consolas" w:eastAsia="Consolas" w:hAnsi="Consolas"/>
+                  <w:rFonts w:ascii="Consolas" w:hAnsi="Consolas" w:cs="Consolas"/>
                   <w:color w:val="0563C1"/>
                   <w:sz w:val="18"/>
                   <w:szCs w:val="18"/>
@@ -2116,7 +2117,7 @@
             <w:hyperlink w:history="1" w:anchor="IDE_24">
               <w:r>
                 <w:rPr>
-                  <w:rFonts w:ascii="Consolas" w:cs="Consolas" w:eastAsia="Consolas" w:hAnsi="Consolas"/>
+                  <w:rFonts w:ascii="Consolas" w:hAnsi="Consolas" w:cs="Consolas"/>
                   <w:color w:val="0563C1"/>
                   <w:sz w:val="18"/>
                   <w:szCs w:val="18"/>
@@ -2171,7 +2172,7 @@
             <w:hyperlink w:history="1" w:anchor="IDE_25">
               <w:r>
                 <w:rPr>
-                  <w:rFonts w:ascii="Consolas" w:cs="Consolas" w:eastAsia="Consolas" w:hAnsi="Consolas"/>
+                  <w:rFonts w:ascii="Consolas" w:hAnsi="Consolas" w:cs="Consolas"/>
                   <w:color w:val="0563C1"/>
                   <w:sz w:val="18"/>
                   <w:szCs w:val="18"/>
@@ -2287,7 +2288,7 @@
             <w:hyperlink w:history="1" w:anchor="IDE_26">
               <w:r>
                 <w:rPr>
-                  <w:rFonts w:ascii="Consolas" w:cs="Consolas" w:eastAsia="Consolas" w:hAnsi="Consolas"/>
+                  <w:rFonts w:ascii="Consolas" w:hAnsi="Consolas" w:cs="Consolas"/>
                   <w:color w:val="0563C1"/>
                   <w:sz w:val="18"/>
                   <w:szCs w:val="18"/>
@@ -2342,7 +2343,7 @@
             <w:hyperlink w:history="1" w:anchor="IDE_27">
               <w:r>
                 <w:rPr>
-                  <w:rFonts w:ascii="Consolas" w:cs="Consolas" w:eastAsia="Consolas" w:hAnsi="Consolas"/>
+                  <w:rFonts w:ascii="Consolas" w:hAnsi="Consolas" w:cs="Consolas"/>
                   <w:color w:val="0563C1"/>
                   <w:sz w:val="18"/>
                   <w:szCs w:val="18"/>
@@ -2397,7 +2398,7 @@
             <w:hyperlink w:history="1" w:anchor="IDE_28">
               <w:r>
                 <w:rPr>
-                  <w:rFonts w:ascii="Consolas" w:cs="Consolas" w:eastAsia="Consolas" w:hAnsi="Consolas"/>
+                  <w:rFonts w:ascii="Consolas" w:hAnsi="Consolas" w:cs="Consolas"/>
                   <w:color w:val="0563C1"/>
                   <w:sz w:val="18"/>
                   <w:szCs w:val="18"/>
@@ -2452,7 +2453,7 @@
             <w:hyperlink w:history="1" w:anchor="IDE_29">
               <w:r>
                 <w:rPr>
-                  <w:rFonts w:ascii="Consolas" w:cs="Consolas" w:eastAsia="Consolas" w:hAnsi="Consolas"/>
+                  <w:rFonts w:ascii="Consolas" w:hAnsi="Consolas" w:cs="Consolas"/>
                   <w:color w:val="0563C1"/>
                   <w:sz w:val="18"/>
                   <w:szCs w:val="18"/>
@@ -2568,7 +2569,7 @@
             <w:hyperlink w:history="1" w:anchor="ERR_1">
               <w:r>
                 <w:rPr>
-                  <w:rFonts w:ascii="Consolas" w:cs="Consolas" w:eastAsia="Consolas" w:hAnsi="Consolas"/>
+                  <w:rFonts w:ascii="Consolas" w:hAnsi="Consolas" w:cs="Consolas"/>
                   <w:color w:val="0563C1"/>
                   <w:sz w:val="18"/>
                   <w:szCs w:val="18"/>
@@ -2623,7 +2624,7 @@
             <w:hyperlink w:history="1" w:anchor="ERR_2">
               <w:r>
                 <w:rPr>
-                  <w:rFonts w:ascii="Consolas" w:cs="Consolas" w:eastAsia="Consolas" w:hAnsi="Consolas"/>
+                  <w:rFonts w:ascii="Consolas" w:hAnsi="Consolas" w:cs="Consolas"/>
                   <w:color w:val="0563C1"/>
                   <w:sz w:val="18"/>
                   <w:szCs w:val="18"/>
@@ -2678,7 +2679,7 @@
             <w:hyperlink w:history="1" w:anchor="ERR_3">
               <w:r>
                 <w:rPr>
-                  <w:rFonts w:ascii="Consolas" w:cs="Consolas" w:eastAsia="Consolas" w:hAnsi="Consolas"/>
+                  <w:rFonts w:ascii="Consolas" w:hAnsi="Consolas" w:cs="Consolas"/>
                   <w:color w:val="0563C1"/>
                   <w:sz w:val="18"/>
                   <w:szCs w:val="18"/>
@@ -2733,7 +2734,7 @@
             <w:hyperlink w:history="1" w:anchor="ERR_4">
               <w:r>
                 <w:rPr>
-                  <w:rFonts w:ascii="Consolas" w:cs="Consolas" w:eastAsia="Consolas" w:hAnsi="Consolas"/>
+                  <w:rFonts w:ascii="Consolas" w:hAnsi="Consolas" w:cs="Consolas"/>
                   <w:color w:val="0563C1"/>
                   <w:sz w:val="18"/>
                   <w:szCs w:val="18"/>
@@ -2788,7 +2789,7 @@
             <w:hyperlink w:history="1" w:anchor="ERR_5">
               <w:r>
                 <w:rPr>
-                  <w:rFonts w:ascii="Consolas" w:cs="Consolas" w:eastAsia="Consolas" w:hAnsi="Consolas"/>
+                  <w:rFonts w:ascii="Consolas" w:hAnsi="Consolas" w:cs="Consolas"/>
                   <w:color w:val="0563C1"/>
                   <w:sz w:val="18"/>
                   <w:szCs w:val="18"/>
@@ -2843,7 +2844,7 @@
             <w:hyperlink w:history="1" w:anchor="ERR_6">
               <w:r>
                 <w:rPr>
-                  <w:rFonts w:ascii="Consolas" w:cs="Consolas" w:eastAsia="Consolas" w:hAnsi="Consolas"/>
+                  <w:rFonts w:ascii="Consolas" w:hAnsi="Consolas" w:cs="Consolas"/>
                   <w:color w:val="0563C1"/>
                   <w:sz w:val="18"/>
                   <w:szCs w:val="18"/>
@@ -2898,7 +2899,7 @@
             <w:hyperlink w:history="1" w:anchor="ERR_7">
               <w:r>
                 <w:rPr>
-                  <w:rFonts w:ascii="Consolas" w:cs="Consolas" w:eastAsia="Consolas" w:hAnsi="Consolas"/>
+                  <w:rFonts w:ascii="Consolas" w:hAnsi="Consolas" w:cs="Consolas"/>
                   <w:color w:val="0563C1"/>
                   <w:sz w:val="18"/>
                   <w:szCs w:val="18"/>
@@ -2953,7 +2954,7 @@
             <w:hyperlink w:history="1" w:anchor="ERR_8">
               <w:r>
                 <w:rPr>
-                  <w:rFonts w:ascii="Consolas" w:cs="Consolas" w:eastAsia="Consolas" w:hAnsi="Consolas"/>
+                  <w:rFonts w:ascii="Consolas" w:hAnsi="Consolas" w:cs="Consolas"/>
                   <w:color w:val="0563C1"/>
                   <w:sz w:val="18"/>
                   <w:szCs w:val="18"/>
@@ -3008,7 +3009,7 @@
             <w:hyperlink w:history="1" w:anchor="ERR_9">
               <w:r>
                 <w:rPr>
-                  <w:rFonts w:ascii="Consolas" w:cs="Consolas" w:eastAsia="Consolas" w:hAnsi="Consolas"/>
+                  <w:rFonts w:ascii="Consolas" w:hAnsi="Consolas" w:cs="Consolas"/>
                   <w:color w:val="0563C1"/>
                   <w:sz w:val="18"/>
                   <w:szCs w:val="18"/>
@@ -3063,7 +3064,7 @@
             <w:hyperlink w:history="1" w:anchor="ERR_10">
               <w:r>
                 <w:rPr>
-                  <w:rFonts w:ascii="Consolas" w:cs="Consolas" w:eastAsia="Consolas" w:hAnsi="Consolas"/>
+                  <w:rFonts w:ascii="Consolas" w:hAnsi="Consolas" w:cs="Consolas"/>
                   <w:color w:val="0563C1"/>
                   <w:sz w:val="18"/>
                   <w:szCs w:val="18"/>
@@ -3402,10 +3403,11 @@
       <w:hyperlink w:history="1" w:anchor="IDE_5">
         <w:r>
           <w:rPr>
-            <w:rFonts w:ascii="Consolas" w:cs="Consolas" w:eastAsia="Consolas" w:hAnsi="Consolas"/>
+            <w:rFonts w:ascii="Consolas" w:hAnsi="Consolas" w:cs="Consolas"/>
             <w:color w:val="0563C1"/>
-            <w:sz w:val="22"/>
-            <w:szCs w:val="22"/>
+            <w:sz w:val="18"/>
+            <w:szCs w:val="18"/>
+            <w:u w:val="single"/>
           </w:rPr>
           <w:t xml:space="preserve">IDE.5</w:t>
         </w:r>
@@ -3858,10 +3860,11 @@
       <w:hyperlink w:history="1" w:anchor="ERR_1">
         <w:r>
           <w:rPr>
-            <w:rFonts w:ascii="Consolas" w:cs="Consolas" w:eastAsia="Consolas" w:hAnsi="Consolas"/>
+            <w:rFonts w:ascii="Consolas" w:hAnsi="Consolas" w:cs="Consolas"/>
             <w:color w:val="0563C1"/>
-            <w:sz w:val="22"/>
-            <w:szCs w:val="22"/>
+            <w:sz w:val="18"/>
+            <w:szCs w:val="18"/>
+            <w:u w:val="single"/>
           </w:rPr>
           <w:t xml:space="preserve">ERR.1</w:t>
         </w:r>
@@ -4262,10 +4265,11 @@
       <w:hyperlink w:history="1" w:anchor="ERR_1">
         <w:r>
           <w:rPr>
-            <w:rFonts w:ascii="Consolas" w:cs="Consolas" w:eastAsia="Consolas" w:hAnsi="Consolas"/>
+            <w:rFonts w:ascii="Consolas" w:hAnsi="Consolas" w:cs="Consolas"/>
             <w:color w:val="0563C1"/>
-            <w:sz w:val="22"/>
-            <w:szCs w:val="22"/>
+            <w:sz w:val="18"/>
+            <w:szCs w:val="18"/>
+            <w:u w:val="single"/>
           </w:rPr>
           <w:t xml:space="preserve">ERR.1</w:t>
         </w:r>
@@ -5166,10 +5170,11 @@
       <w:hyperlink w:history="1" w:anchor="ERR_2">
         <w:r>
           <w:rPr>
-            <w:rFonts w:ascii="Consolas" w:cs="Consolas" w:eastAsia="Consolas" w:hAnsi="Consolas"/>
+            <w:rFonts w:ascii="Consolas" w:hAnsi="Consolas" w:cs="Consolas"/>
             <w:color w:val="0563C1"/>
-            <w:sz w:val="22"/>
-            <w:szCs w:val="22"/>
+            <w:sz w:val="18"/>
+            <w:szCs w:val="18"/>
+            <w:u w:val="single"/>
           </w:rPr>
           <w:t xml:space="preserve">ERR.2</w:t>
         </w:r>
@@ -6694,6 +6699,7 @@
                 <w:color w:val="E97132" w:themeColor="accent2"/>
                 <w:sz w:val="18"/>
                 <w:szCs w:val="18"/>
+                <w:u w:val="none"/>
               </w:rPr>
               <w:t xml:space="preserve">CC-OBJ.2</w:t>
             </w:r>
@@ -12590,10 +12596,11 @@
       <w:hyperlink w:history="1" w:anchor="IDE_29">
         <w:r>
           <w:rPr>
-            <w:rFonts w:ascii="Consolas" w:cs="Consolas" w:eastAsia="Consolas" w:hAnsi="Consolas"/>
+            <w:rFonts w:ascii="Consolas" w:hAnsi="Consolas" w:cs="Consolas"/>
             <w:color w:val="0563C1"/>
-            <w:sz w:val="22"/>
-            <w:szCs w:val="22"/>
+            <w:sz w:val="18"/>
+            <w:szCs w:val="18"/>
+            <w:u w:val="single"/>
           </w:rPr>
           <w:t xml:space="preserve">IDE.29</w:t>
         </w:r>
@@ -13483,10 +13490,11 @@
       <w:hyperlink w:history="1" w:anchor="ERR_7">
         <w:r>
           <w:rPr>
-            <w:rFonts w:ascii="Consolas" w:cs="Consolas" w:eastAsia="Consolas" w:hAnsi="Consolas"/>
+            <w:rFonts w:ascii="Consolas" w:hAnsi="Consolas" w:cs="Consolas"/>
             <w:color w:val="0563C1"/>
-            <w:sz w:val="22"/>
-            <w:szCs w:val="22"/>
+            <w:sz w:val="18"/>
+            <w:szCs w:val="18"/>
+            <w:u w:val="single"/>
           </w:rPr>
           <w:t xml:space="preserve">ERR.7</w:t>
         </w:r>
@@ -14140,10 +14148,11 @@
       <w:hyperlink w:history="1" w:anchor="IDE_5">
         <w:r>
           <w:rPr>
-            <w:rFonts w:ascii="Consolas" w:cs="Consolas" w:eastAsia="Consolas" w:hAnsi="Consolas"/>
+            <w:rFonts w:ascii="Consolas" w:hAnsi="Consolas" w:cs="Consolas"/>
             <w:color w:val="0563C1"/>
-            <w:sz w:val="22"/>
-            <w:szCs w:val="22"/>
+            <w:sz w:val="18"/>
+            <w:szCs w:val="18"/>
+            <w:u w:val="single"/>
           </w:rPr>
           <w:t xml:space="preserve">IDE.5</w:t>
         </w:r>
@@ -14388,10 +14397,11 @@
       <w:hyperlink w:history="1" w:anchor="IDE_9">
         <w:r>
           <w:rPr>
-            <w:rFonts w:ascii="Consolas" w:cs="Consolas" w:eastAsia="Consolas" w:hAnsi="Consolas"/>
+            <w:rFonts w:ascii="Consolas" w:hAnsi="Consolas" w:cs="Consolas"/>
             <w:color w:val="0563C1"/>
-            <w:sz w:val="22"/>
-            <w:szCs w:val="22"/>
+            <w:sz w:val="18"/>
+            <w:szCs w:val="18"/>
+            <w:u w:val="single"/>
           </w:rPr>
           <w:t xml:space="preserve">IDE.9</w:t>
         </w:r>
@@ -14604,10 +14614,11 @@
       <w:hyperlink w:history="1" w:anchor="ERR_2">
         <w:r>
           <w:rPr>
-            <w:rFonts w:ascii="Consolas" w:cs="Consolas" w:eastAsia="Consolas" w:hAnsi="Consolas"/>
+            <w:rFonts w:ascii="Consolas" w:hAnsi="Consolas" w:cs="Consolas"/>
             <w:color w:val="0563C1"/>
-            <w:sz w:val="22"/>
-            <w:szCs w:val="22"/>
+            <w:sz w:val="18"/>
+            <w:szCs w:val="18"/>
+            <w:u w:val="single"/>
           </w:rPr>
           <w:t xml:space="preserve">ERR.2</w:t>
         </w:r>
@@ -14713,10 +14724,11 @@
       <w:hyperlink w:history="1" w:anchor="IDE_21">
         <w:r>
           <w:rPr>
-            <w:rFonts w:ascii="Consolas" w:cs="Consolas" w:eastAsia="Consolas" w:hAnsi="Consolas"/>
+            <w:rFonts w:ascii="Consolas" w:hAnsi="Consolas" w:cs="Consolas"/>
             <w:color w:val="0563C1"/>
-            <w:sz w:val="22"/>
-            <w:szCs w:val="22"/>
+            <w:sz w:val="18"/>
+            <w:szCs w:val="18"/>
+            <w:u w:val="single"/>
           </w:rPr>
           <w:t xml:space="preserve">IDE.21</w:t>
         </w:r>
@@ -15077,10 +15089,11 @@
       <w:hyperlink w:history="1" w:anchor="IDE_28">
         <w:r>
           <w:rPr>
-            <w:rFonts w:ascii="Consolas" w:cs="Consolas" w:eastAsia="Consolas" w:hAnsi="Consolas"/>
+            <w:rFonts w:ascii="Consolas" w:hAnsi="Consolas" w:cs="Consolas"/>
             <w:color w:val="0563C1"/>
-            <w:sz w:val="22"/>
-            <w:szCs w:val="22"/>
+            <w:sz w:val="18"/>
+            <w:szCs w:val="18"/>
+            <w:u w:val="single"/>
           </w:rPr>
           <w:t xml:space="preserve">IDE.28</w:t>
         </w:r>
@@ -15225,10 +15238,11 @@
       <w:hyperlink w:history="1" w:anchor="ERR_6">
         <w:r>
           <w:rPr>
-            <w:rFonts w:ascii="Consolas" w:cs="Consolas" w:eastAsia="Consolas" w:hAnsi="Consolas"/>
+            <w:rFonts w:ascii="Consolas" w:hAnsi="Consolas" w:cs="Consolas"/>
             <w:color w:val="0563C1"/>
-            <w:sz w:val="22"/>
-            <w:szCs w:val="22"/>
+            <w:sz w:val="18"/>
+            <w:szCs w:val="18"/>
+            <w:u w:val="single"/>
           </w:rPr>
           <w:t xml:space="preserve">ERR.6</w:t>
         </w:r>

</xml_diff>